<commit_message>
data types notes updated
</commit_message>
<xml_diff>
--- a/notes.docx
+++ b/notes.docx
@@ -984,7 +984,6 @@
           <w:b/>
           <w:bCs/>
         </w:rPr>
-        <w:lastRenderedPageBreak/>
         <w:t>Default Value:</w:t>
       </w:r>
       <w:r>
@@ -1115,6 +1114,7 @@
         </w:numPr>
       </w:pPr>
       <w:r>
+        <w:lastRenderedPageBreak/>
         <w:t xml:space="preserve">Agar </w:t>
       </w:r>
       <w:proofErr w:type="spellStart"/>
@@ -1727,7 +1727,6 @@
     </w:p>
     <w:p>
       <w:r>
-        <w:lastRenderedPageBreak/>
         <w:t>print("World")</w:t>
       </w:r>
     </w:p>
@@ -1887,6 +1886,7 @@
           <w:b/>
           <w:bCs/>
         </w:rPr>
+        <w:lastRenderedPageBreak/>
         <w:t>sep</w:t>
       </w:r>
       <w:proofErr w:type="spellEnd"/>
@@ -2017,9 +2017,2804 @@
       </w:r>
     </w:p>
     <w:p/>
+    <w:p/>
+    <w:p>
+      <w:r>
+        <w:t xml:space="preserve">Bhai, yeh video </w:t>
+      </w:r>
+      <w:proofErr w:type="spellStart"/>
+      <w:r>
+        <w:rPr>
+          <w:b/>
+          <w:bCs/>
+        </w:rPr>
+        <w:t>CampusX</w:t>
+      </w:r>
+      <w:proofErr w:type="spellEnd"/>
+      <w:r>
+        <w:rPr>
+          <w:b/>
+          <w:bCs/>
+        </w:rPr>
+        <w:t xml:space="preserve"> channel </w:t>
+      </w:r>
+      <w:proofErr w:type="spellStart"/>
+      <w:r>
+        <w:rPr>
+          <w:b/>
+          <w:bCs/>
+        </w:rPr>
+        <w:t>ke</w:t>
+      </w:r>
+      <w:proofErr w:type="spellEnd"/>
+      <w:r>
+        <w:rPr>
+          <w:b/>
+          <w:bCs/>
+        </w:rPr>
+        <w:t xml:space="preserve"> "100 Days of Python Programming"</w:t>
+      </w:r>
+      <w:r>
+        <w:t xml:space="preserve"> series ka video </w:t>
+      </w:r>
+      <w:proofErr w:type="spellStart"/>
+      <w:r>
+        <w:t>hai</w:t>
+      </w:r>
+      <w:proofErr w:type="spellEnd"/>
+      <w:r>
+        <w:t xml:space="preserve">, </w:t>
+      </w:r>
+      <w:proofErr w:type="spellStart"/>
+      <w:r>
+        <w:t>jisme</w:t>
+      </w:r>
+      <w:proofErr w:type="spellEnd"/>
+      <w:r>
+        <w:t xml:space="preserve"> </w:t>
+      </w:r>
+      <w:r>
+        <w:rPr>
+          <w:b/>
+          <w:bCs/>
+        </w:rPr>
+        <w:t>Python Data Types</w:t>
+      </w:r>
+      <w:r>
+        <w:t xml:space="preserve"> </w:t>
+      </w:r>
+      <w:proofErr w:type="spellStart"/>
+      <w:r>
+        <w:t>ke</w:t>
+      </w:r>
+      <w:proofErr w:type="spellEnd"/>
+      <w:r>
+        <w:t xml:space="preserve"> </w:t>
+      </w:r>
+      <w:proofErr w:type="spellStart"/>
+      <w:r>
+        <w:t>baare</w:t>
+      </w:r>
+      <w:proofErr w:type="spellEnd"/>
+      <w:r>
+        <w:t xml:space="preserve"> </w:t>
+      </w:r>
+      <w:proofErr w:type="spellStart"/>
+      <w:r>
+        <w:t>mein</w:t>
+      </w:r>
+      <w:proofErr w:type="spellEnd"/>
+      <w:r>
+        <w:t xml:space="preserve"> </w:t>
+      </w:r>
+      <w:proofErr w:type="spellStart"/>
+      <w:r>
+        <w:t>samjhaya</w:t>
+      </w:r>
+      <w:proofErr w:type="spellEnd"/>
+      <w:r>
+        <w:t xml:space="preserve"> </w:t>
+      </w:r>
+      <w:proofErr w:type="spellStart"/>
+      <w:r>
+        <w:t>gaya</w:t>
+      </w:r>
+      <w:proofErr w:type="spellEnd"/>
+      <w:r>
+        <w:t xml:space="preserve"> </w:t>
+      </w:r>
+      <w:proofErr w:type="spellStart"/>
+      <w:r>
+        <w:t>hai</w:t>
+      </w:r>
+      <w:proofErr w:type="spellEnd"/>
+      <w:r>
+        <w:t>.</w:t>
+      </w:r>
+    </w:p>
+    <w:p>
+      <w:r>
+        <w:t xml:space="preserve">Bina </w:t>
+      </w:r>
+      <w:proofErr w:type="spellStart"/>
+      <w:r>
+        <w:t>kisi</w:t>
+      </w:r>
+      <w:proofErr w:type="spellEnd"/>
+      <w:r>
+        <w:t xml:space="preserve"> timeline/timestamp </w:t>
+      </w:r>
+      <w:proofErr w:type="spellStart"/>
+      <w:r>
+        <w:t>ke</w:t>
+      </w:r>
+      <w:proofErr w:type="spellEnd"/>
+      <w:r>
+        <w:t xml:space="preserve"> </w:t>
+      </w:r>
+      <w:proofErr w:type="spellStart"/>
+      <w:r>
+        <w:t>saare</w:t>
+      </w:r>
+      <w:proofErr w:type="spellEnd"/>
+      <w:r>
+        <w:t xml:space="preserve"> concepts detail me aur clean Hinglish notes </w:t>
+      </w:r>
+      <w:proofErr w:type="spellStart"/>
+      <w:r>
+        <w:t>ke</w:t>
+      </w:r>
+      <w:proofErr w:type="spellEnd"/>
+      <w:r>
+        <w:t xml:space="preserve"> form me </w:t>
+      </w:r>
+      <w:proofErr w:type="spellStart"/>
+      <w:r>
+        <w:t>neeche</w:t>
+      </w:r>
+      <w:proofErr w:type="spellEnd"/>
+      <w:r>
+        <w:t xml:space="preserve"> </w:t>
+      </w:r>
+      <w:proofErr w:type="spellStart"/>
+      <w:r>
+        <w:t>diye</w:t>
+      </w:r>
+      <w:proofErr w:type="spellEnd"/>
+      <w:r>
+        <w:t xml:space="preserve"> </w:t>
+      </w:r>
+      <w:proofErr w:type="spellStart"/>
+      <w:r>
+        <w:t>gaye</w:t>
+      </w:r>
+      <w:proofErr w:type="spellEnd"/>
+      <w:r>
+        <w:t xml:space="preserve"> hain. </w:t>
+      </w:r>
+      <w:proofErr w:type="spellStart"/>
+      <w:r>
+        <w:t>Apne</w:t>
+      </w:r>
+      <w:proofErr w:type="spellEnd"/>
+      <w:r>
+        <w:t xml:space="preserve"> register me copy </w:t>
+      </w:r>
+      <w:proofErr w:type="spellStart"/>
+      <w:r>
+        <w:t>kar</w:t>
+      </w:r>
+      <w:proofErr w:type="spellEnd"/>
+      <w:r>
+        <w:t xml:space="preserve"> lo! </w:t>
+      </w:r>
+      <w:r>
+        <w:rPr>
+          <w:rFonts w:ascii="Segoe UI Emoji" w:hAnsi="Segoe UI Emoji" w:cs="Segoe UI Emoji"/>
+        </w:rPr>
+        <w:t>📝👇</w:t>
+      </w:r>
+    </w:p>
+    <w:p>
+      <w:pPr>
+        <w:rPr>
+          <w:b/>
+          <w:bCs/>
+        </w:rPr>
+      </w:pPr>
+      <w:r>
+        <w:rPr>
+          <w:rFonts w:ascii="Segoe UI Emoji" w:hAnsi="Segoe UI Emoji" w:cs="Segoe UI Emoji"/>
+          <w:b/>
+          <w:bCs/>
+        </w:rPr>
+        <w:t>📌</w:t>
+      </w:r>
+      <w:r>
+        <w:rPr>
+          <w:b/>
+          <w:bCs/>
+        </w:rPr>
+        <w:t xml:space="preserve"> NOTES: Data Types in Python</w:t>
+      </w:r>
+    </w:p>
+    <w:p>
+      <w:pPr>
+        <w:rPr>
+          <w:b/>
+          <w:bCs/>
+        </w:rPr>
+      </w:pPr>
+      <w:r>
+        <w:rPr>
+          <w:b/>
+          <w:bCs/>
+        </w:rPr>
+        <w:t>1. What are Data Types? (Basics)</w:t>
+      </w:r>
+    </w:p>
+    <w:p>
+      <w:pPr>
+        <w:numPr>
+          <w:ilvl w:val="0"/>
+          <w:numId w:val="10"/>
+        </w:numPr>
+      </w:pPr>
+      <w:r>
+        <w:t xml:space="preserve">Data type yeh batata </w:t>
+      </w:r>
+      <w:proofErr w:type="spellStart"/>
+      <w:r>
+        <w:t>hai</w:t>
+      </w:r>
+      <w:proofErr w:type="spellEnd"/>
+      <w:r>
+        <w:t xml:space="preserve"> ki </w:t>
+      </w:r>
+      <w:proofErr w:type="spellStart"/>
+      <w:r>
+        <w:t>kisi</w:t>
+      </w:r>
+      <w:proofErr w:type="spellEnd"/>
+      <w:r>
+        <w:t xml:space="preserve"> variable </w:t>
+      </w:r>
+      <w:proofErr w:type="spellStart"/>
+      <w:r>
+        <w:t>ke</w:t>
+      </w:r>
+      <w:proofErr w:type="spellEnd"/>
+      <w:r>
+        <w:t xml:space="preserve"> </w:t>
+      </w:r>
+      <w:proofErr w:type="spellStart"/>
+      <w:r>
+        <w:t>andar</w:t>
+      </w:r>
+      <w:proofErr w:type="spellEnd"/>
+      <w:r>
+        <w:t xml:space="preserve"> </w:t>
+      </w:r>
+      <w:proofErr w:type="spellStart"/>
+      <w:r>
+        <w:rPr>
+          <w:b/>
+          <w:bCs/>
+        </w:rPr>
+        <w:t>kis</w:t>
+      </w:r>
+      <w:proofErr w:type="spellEnd"/>
+      <w:r>
+        <w:rPr>
+          <w:b/>
+          <w:bCs/>
+        </w:rPr>
+        <w:t xml:space="preserve"> </w:t>
+      </w:r>
+      <w:proofErr w:type="spellStart"/>
+      <w:r>
+        <w:rPr>
+          <w:b/>
+          <w:bCs/>
+        </w:rPr>
+        <w:t>tarah</w:t>
+      </w:r>
+      <w:proofErr w:type="spellEnd"/>
+      <w:r>
+        <w:rPr>
+          <w:b/>
+          <w:bCs/>
+        </w:rPr>
+        <w:t xml:space="preserve"> ka data/value store</w:t>
+      </w:r>
+      <w:r>
+        <w:t xml:space="preserve"> </w:t>
+      </w:r>
+      <w:proofErr w:type="spellStart"/>
+      <w:r>
+        <w:t>ho</w:t>
+      </w:r>
+      <w:proofErr w:type="spellEnd"/>
+      <w:r>
+        <w:t xml:space="preserve"> </w:t>
+      </w:r>
+      <w:proofErr w:type="spellStart"/>
+      <w:r>
+        <w:t>raha</w:t>
+      </w:r>
+      <w:proofErr w:type="spellEnd"/>
+      <w:r>
+        <w:t xml:space="preserve"> </w:t>
+      </w:r>
+      <w:proofErr w:type="spellStart"/>
+      <w:r>
+        <w:t>hai</w:t>
+      </w:r>
+      <w:proofErr w:type="spellEnd"/>
+      <w:r>
+        <w:t xml:space="preserve"> (</w:t>
+      </w:r>
+      <w:proofErr w:type="spellStart"/>
+      <w:r>
+        <w:t>jaise</w:t>
+      </w:r>
+      <w:proofErr w:type="spellEnd"/>
+      <w:r>
+        <w:t xml:space="preserve"> number, text, true/false, etc.).</w:t>
+      </w:r>
+    </w:p>
+    <w:p>
+      <w:pPr>
+        <w:numPr>
+          <w:ilvl w:val="0"/>
+          <w:numId w:val="10"/>
+        </w:numPr>
+      </w:pPr>
+      <w:r>
+        <w:t xml:space="preserve">Python </w:t>
+      </w:r>
+      <w:proofErr w:type="spellStart"/>
+      <w:r>
+        <w:t>mein</w:t>
+      </w:r>
+      <w:proofErr w:type="spellEnd"/>
+      <w:r>
+        <w:t xml:space="preserve"> Data Types ko main </w:t>
+      </w:r>
+      <w:r>
+        <w:rPr>
+          <w:b/>
+          <w:bCs/>
+        </w:rPr>
+        <w:t>3 Categories</w:t>
+      </w:r>
+      <w:r>
+        <w:t xml:space="preserve"> </w:t>
+      </w:r>
+      <w:proofErr w:type="spellStart"/>
+      <w:r>
+        <w:t>mein</w:t>
+      </w:r>
+      <w:proofErr w:type="spellEnd"/>
+      <w:r>
+        <w:t xml:space="preserve"> divide </w:t>
+      </w:r>
+      <w:proofErr w:type="spellStart"/>
+      <w:r>
+        <w:t>kiya</w:t>
+      </w:r>
+      <w:proofErr w:type="spellEnd"/>
+      <w:r>
+        <w:t xml:space="preserve"> </w:t>
+      </w:r>
+      <w:proofErr w:type="spellStart"/>
+      <w:r>
+        <w:t>gaya</w:t>
+      </w:r>
+      <w:proofErr w:type="spellEnd"/>
+      <w:r>
+        <w:t xml:space="preserve"> </w:t>
+      </w:r>
+      <w:proofErr w:type="spellStart"/>
+      <w:r>
+        <w:t>hai</w:t>
+      </w:r>
+      <w:proofErr w:type="spellEnd"/>
+      <w:r>
+        <w:t>:</w:t>
+      </w:r>
+    </w:p>
+    <w:p>
+      <w:pPr>
+        <w:numPr>
+          <w:ilvl w:val="1"/>
+          <w:numId w:val="10"/>
+        </w:numPr>
+      </w:pPr>
+      <w:r>
+        <w:rPr>
+          <w:b/>
+          <w:bCs/>
+        </w:rPr>
+        <w:t>Basic Types</w:t>
+      </w:r>
+    </w:p>
+    <w:p>
+      <w:pPr>
+        <w:numPr>
+          <w:ilvl w:val="1"/>
+          <w:numId w:val="10"/>
+        </w:numPr>
+      </w:pPr>
+      <w:r>
+        <w:rPr>
+          <w:b/>
+          <w:bCs/>
+        </w:rPr>
+        <w:t>Container Types</w:t>
+      </w:r>
+    </w:p>
+    <w:p>
+      <w:pPr>
+        <w:numPr>
+          <w:ilvl w:val="1"/>
+          <w:numId w:val="10"/>
+        </w:numPr>
+      </w:pPr>
+      <w:r>
+        <w:rPr>
+          <w:b/>
+          <w:bCs/>
+        </w:rPr>
+        <w:t>User-defined Types</w:t>
+      </w:r>
+    </w:p>
+    <w:p>
+      <w:pPr>
+        <w:rPr>
+          <w:b/>
+          <w:bCs/>
+        </w:rPr>
+      </w:pPr>
+      <w:r>
+        <w:rPr>
+          <w:b/>
+          <w:bCs/>
+        </w:rPr>
+        <w:t>2. Category 1: Basic Data Types</w:t>
+      </w:r>
+    </w:p>
+    <w:p>
+      <w:r>
+        <w:t xml:space="preserve">Yeh </w:t>
+      </w:r>
+      <w:proofErr w:type="spellStart"/>
+      <w:r>
+        <w:t>woh</w:t>
+      </w:r>
+      <w:proofErr w:type="spellEnd"/>
+      <w:r>
+        <w:t xml:space="preserve"> simple aur standard data types hain jo almost </w:t>
+      </w:r>
+      <w:proofErr w:type="spellStart"/>
+      <w:r>
+        <w:t>har</w:t>
+      </w:r>
+      <w:proofErr w:type="spellEnd"/>
+      <w:r>
+        <w:t xml:space="preserve"> programming language </w:t>
+      </w:r>
+      <w:proofErr w:type="spellStart"/>
+      <w:r>
+        <w:t>mein</w:t>
+      </w:r>
+      <w:proofErr w:type="spellEnd"/>
+      <w:r>
+        <w:t xml:space="preserve"> </w:t>
+      </w:r>
+      <w:proofErr w:type="spellStart"/>
+      <w:r>
+        <w:t>hote</w:t>
+      </w:r>
+      <w:proofErr w:type="spellEnd"/>
+      <w:r>
+        <w:t xml:space="preserve"> hain:</w:t>
+      </w:r>
+    </w:p>
+    <w:p>
+      <w:pPr>
+        <w:rPr>
+          <w:b/>
+          <w:bCs/>
+        </w:rPr>
+      </w:pPr>
+      <w:r>
+        <w:rPr>
+          <w:b/>
+          <w:bCs/>
+        </w:rPr>
+        <w:t>A. Integer (int)</w:t>
+      </w:r>
+    </w:p>
+    <w:p>
+      <w:pPr>
+        <w:numPr>
+          <w:ilvl w:val="0"/>
+          <w:numId w:val="11"/>
+        </w:numPr>
+      </w:pPr>
+      <w:r>
+        <w:t xml:space="preserve">Bina decimal wale </w:t>
+      </w:r>
+      <w:proofErr w:type="spellStart"/>
+      <w:r>
+        <w:t>saare</w:t>
+      </w:r>
+      <w:proofErr w:type="spellEnd"/>
+      <w:r>
+        <w:t xml:space="preserve"> numbers (positive </w:t>
+      </w:r>
+      <w:proofErr w:type="spellStart"/>
+      <w:r>
+        <w:t>ya</w:t>
+      </w:r>
+      <w:proofErr w:type="spellEnd"/>
+      <w:r>
+        <w:t xml:space="preserve"> negative) </w:t>
+      </w:r>
+      <w:r>
+        <w:rPr>
+          <w:b/>
+          <w:bCs/>
+        </w:rPr>
+        <w:t>Integer</w:t>
+      </w:r>
+      <w:r>
+        <w:t xml:space="preserve"> </w:t>
+      </w:r>
+      <w:proofErr w:type="spellStart"/>
+      <w:r>
+        <w:t>hote</w:t>
+      </w:r>
+      <w:proofErr w:type="spellEnd"/>
+      <w:r>
+        <w:t xml:space="preserve"> hain.</w:t>
+      </w:r>
+    </w:p>
+    <w:p>
+      <w:pPr>
+        <w:numPr>
+          <w:ilvl w:val="0"/>
+          <w:numId w:val="11"/>
+        </w:numPr>
+      </w:pPr>
+      <w:r>
+        <w:rPr>
+          <w:b/>
+          <w:bCs/>
+        </w:rPr>
+        <w:t>Example:</w:t>
+      </w:r>
+      <w:r>
+        <w:t xml:space="preserve"> 10, -50, 0, 12345</w:t>
+      </w:r>
+    </w:p>
+    <w:p>
+      <w:pPr>
+        <w:numPr>
+          <w:ilvl w:val="0"/>
+          <w:numId w:val="11"/>
+        </w:numPr>
+      </w:pPr>
+      <w:r>
+        <w:rPr>
+          <w:b/>
+          <w:bCs/>
+        </w:rPr>
+        <w:t>Python Special Feature:</w:t>
+      </w:r>
+      <w:r>
+        <w:t xml:space="preserve"> Python </w:t>
+      </w:r>
+      <w:proofErr w:type="spellStart"/>
+      <w:r>
+        <w:t>mein</w:t>
+      </w:r>
+      <w:proofErr w:type="spellEnd"/>
+      <w:r>
+        <w:t xml:space="preserve"> integers ki koi strict memory limit </w:t>
+      </w:r>
+      <w:proofErr w:type="spellStart"/>
+      <w:r>
+        <w:t>nahi</w:t>
+      </w:r>
+      <w:proofErr w:type="spellEnd"/>
+      <w:r>
+        <w:t xml:space="preserve"> </w:t>
+      </w:r>
+      <w:proofErr w:type="spellStart"/>
+      <w:r>
+        <w:t>hoti</w:t>
+      </w:r>
+      <w:proofErr w:type="spellEnd"/>
+      <w:r>
+        <w:t xml:space="preserve">! </w:t>
+      </w:r>
+      <w:proofErr w:type="spellStart"/>
+      <w:r>
+        <w:t>Aap</w:t>
+      </w:r>
+      <w:proofErr w:type="spellEnd"/>
+      <w:r>
+        <w:t xml:space="preserve"> </w:t>
+      </w:r>
+      <w:proofErr w:type="spellStart"/>
+      <w:r>
+        <w:t>jitna</w:t>
+      </w:r>
+      <w:proofErr w:type="spellEnd"/>
+      <w:r>
+        <w:t xml:space="preserve"> </w:t>
+      </w:r>
+      <w:proofErr w:type="spellStart"/>
+      <w:r>
+        <w:t>chahe</w:t>
+      </w:r>
+      <w:proofErr w:type="spellEnd"/>
+      <w:r>
+        <w:t xml:space="preserve"> </w:t>
+      </w:r>
+      <w:proofErr w:type="spellStart"/>
+      <w:r>
+        <w:t>bada</w:t>
+      </w:r>
+      <w:proofErr w:type="spellEnd"/>
+      <w:r>
+        <w:t xml:space="preserve"> number store </w:t>
+      </w:r>
+      <w:proofErr w:type="spellStart"/>
+      <w:r>
+        <w:t>kar</w:t>
+      </w:r>
+      <w:proofErr w:type="spellEnd"/>
+      <w:r>
+        <w:t xml:space="preserve"> </w:t>
+      </w:r>
+      <w:proofErr w:type="spellStart"/>
+      <w:r>
+        <w:t>sakte</w:t>
+      </w:r>
+      <w:proofErr w:type="spellEnd"/>
+      <w:r>
+        <w:t xml:space="preserve"> </w:t>
+      </w:r>
+      <w:proofErr w:type="spellStart"/>
+      <w:r>
+        <w:t>ho</w:t>
+      </w:r>
+      <w:proofErr w:type="spellEnd"/>
+      <w:r>
+        <w:t xml:space="preserve"> (Python maintains precision automatically).</w:t>
+      </w:r>
+    </w:p>
+    <w:p>
+      <w:pPr>
+        <w:rPr>
+          <w:b/>
+          <w:bCs/>
+        </w:rPr>
+      </w:pPr>
+      <w:r>
+        <w:rPr>
+          <w:b/>
+          <w:bCs/>
+        </w:rPr>
+        <w:t>B. Float (float)</w:t>
+      </w:r>
+    </w:p>
+    <w:p>
+      <w:pPr>
+        <w:numPr>
+          <w:ilvl w:val="0"/>
+          <w:numId w:val="12"/>
+        </w:numPr>
+      </w:pPr>
+      <w:r>
+        <w:t xml:space="preserve">Point/Decimal wale numbers ko </w:t>
+      </w:r>
+      <w:r>
+        <w:rPr>
+          <w:b/>
+          <w:bCs/>
+        </w:rPr>
+        <w:t>Float</w:t>
+      </w:r>
+      <w:r>
+        <w:t xml:space="preserve"> </w:t>
+      </w:r>
+      <w:proofErr w:type="spellStart"/>
+      <w:r>
+        <w:t>bolte</w:t>
+      </w:r>
+      <w:proofErr w:type="spellEnd"/>
+      <w:r>
+        <w:t xml:space="preserve"> hain.</w:t>
+      </w:r>
+    </w:p>
+    <w:p>
+      <w:pPr>
+        <w:numPr>
+          <w:ilvl w:val="0"/>
+          <w:numId w:val="12"/>
+        </w:numPr>
+      </w:pPr>
+      <w:r>
+        <w:rPr>
+          <w:b/>
+          <w:bCs/>
+        </w:rPr>
+        <w:t>Example:</w:t>
+      </w:r>
+      <w:r>
+        <w:t xml:space="preserve"> 10.5, -3.14, 0.0</w:t>
+      </w:r>
+    </w:p>
+    <w:p>
+      <w:pPr>
+        <w:rPr>
+          <w:b/>
+          <w:bCs/>
+        </w:rPr>
+      </w:pPr>
+      <w:r>
+        <w:rPr>
+          <w:b/>
+          <w:bCs/>
+        </w:rPr>
+        <w:t>C. Boolean (bool)</w:t>
+      </w:r>
+    </w:p>
+    <w:p>
+      <w:pPr>
+        <w:numPr>
+          <w:ilvl w:val="0"/>
+          <w:numId w:val="13"/>
+        </w:numPr>
+      </w:pPr>
+      <w:r>
+        <w:t xml:space="preserve">Yeh decision-making </w:t>
+      </w:r>
+      <w:proofErr w:type="spellStart"/>
+      <w:r>
+        <w:t>ke</w:t>
+      </w:r>
+      <w:proofErr w:type="spellEnd"/>
+      <w:r>
+        <w:t xml:space="preserve"> </w:t>
+      </w:r>
+      <w:proofErr w:type="spellStart"/>
+      <w:r>
+        <w:t>liye</w:t>
+      </w:r>
+      <w:proofErr w:type="spellEnd"/>
+      <w:r>
+        <w:t xml:space="preserve"> use </w:t>
+      </w:r>
+      <w:proofErr w:type="spellStart"/>
+      <w:r>
+        <w:t>hota</w:t>
+      </w:r>
+      <w:proofErr w:type="spellEnd"/>
+      <w:r>
+        <w:t xml:space="preserve"> </w:t>
+      </w:r>
+      <w:proofErr w:type="spellStart"/>
+      <w:r>
+        <w:t>hai</w:t>
+      </w:r>
+      <w:proofErr w:type="spellEnd"/>
+      <w:r>
+        <w:t xml:space="preserve">. Iski </w:t>
+      </w:r>
+      <w:proofErr w:type="spellStart"/>
+      <w:r>
+        <w:t>sirf</w:t>
+      </w:r>
+      <w:proofErr w:type="spellEnd"/>
+      <w:r>
+        <w:t xml:space="preserve"> do hi values </w:t>
+      </w:r>
+      <w:proofErr w:type="spellStart"/>
+      <w:r>
+        <w:t>ho</w:t>
+      </w:r>
+      <w:proofErr w:type="spellEnd"/>
+      <w:r>
+        <w:t xml:space="preserve"> </w:t>
+      </w:r>
+      <w:proofErr w:type="spellStart"/>
+      <w:r>
+        <w:t>sakti</w:t>
+      </w:r>
+      <w:proofErr w:type="spellEnd"/>
+      <w:r>
+        <w:t xml:space="preserve"> hain:</w:t>
+      </w:r>
+    </w:p>
+    <w:p>
+      <w:pPr>
+        <w:numPr>
+          <w:ilvl w:val="1"/>
+          <w:numId w:val="13"/>
+        </w:numPr>
+      </w:pPr>
+      <w:r>
+        <w:t xml:space="preserve">True (T capital </w:t>
+      </w:r>
+      <w:proofErr w:type="spellStart"/>
+      <w:r>
+        <w:t>hona</w:t>
+      </w:r>
+      <w:proofErr w:type="spellEnd"/>
+      <w:r>
+        <w:t xml:space="preserve"> </w:t>
+      </w:r>
+      <w:proofErr w:type="spellStart"/>
+      <w:r>
+        <w:t>chahiye</w:t>
+      </w:r>
+      <w:proofErr w:type="spellEnd"/>
+      <w:r>
+        <w:t>)</w:t>
+      </w:r>
+    </w:p>
+    <w:p>
+      <w:pPr>
+        <w:numPr>
+          <w:ilvl w:val="1"/>
+          <w:numId w:val="13"/>
+        </w:numPr>
+      </w:pPr>
+      <w:r>
+        <w:t xml:space="preserve">False (F capital </w:t>
+      </w:r>
+      <w:proofErr w:type="spellStart"/>
+      <w:r>
+        <w:t>hona</w:t>
+      </w:r>
+      <w:proofErr w:type="spellEnd"/>
+      <w:r>
+        <w:t xml:space="preserve"> </w:t>
+      </w:r>
+      <w:proofErr w:type="spellStart"/>
+      <w:r>
+        <w:t>chahiye</w:t>
+      </w:r>
+      <w:proofErr w:type="spellEnd"/>
+      <w:r>
+        <w:t>)</w:t>
+      </w:r>
+    </w:p>
+    <w:p>
+      <w:pPr>
+        <w:rPr>
+          <w:b/>
+          <w:bCs/>
+        </w:rPr>
+      </w:pPr>
+      <w:r>
+        <w:rPr>
+          <w:b/>
+          <w:bCs/>
+        </w:rPr>
+        <w:t>D. Complex Numbers (complex)</w:t>
+      </w:r>
+    </w:p>
+    <w:p>
+      <w:pPr>
+        <w:numPr>
+          <w:ilvl w:val="0"/>
+          <w:numId w:val="14"/>
+        </w:numPr>
+      </w:pPr>
+      <w:r>
+        <w:t xml:space="preserve">Python </w:t>
+      </w:r>
+      <w:proofErr w:type="spellStart"/>
+      <w:r>
+        <w:t>mein</w:t>
+      </w:r>
+      <w:proofErr w:type="spellEnd"/>
+      <w:r>
+        <w:t xml:space="preserve"> mathematical </w:t>
+      </w:r>
+      <w:r>
+        <w:rPr>
+          <w:b/>
+          <w:bCs/>
+        </w:rPr>
+        <w:t>Complex Numbers</w:t>
+      </w:r>
+      <w:r>
+        <w:t xml:space="preserve"> (</w:t>
+      </w:r>
+      <m:oMath>
+        <m:r>
+          <w:rPr>
+            <w:rFonts w:ascii="Cambria Math" w:hAnsi="Cambria Math"/>
+          </w:rPr>
+          <m:t>a+bj</m:t>
+        </m:r>
+      </m:oMath>
+      <w:r>
+        <w:t xml:space="preserve">) ka direct built-in support hota hai, jahan </w:t>
+      </w:r>
+      <m:oMath>
+        <m:r>
+          <w:rPr>
+            <w:rFonts w:ascii="Cambria Math" w:hAnsi="Cambria Math"/>
+          </w:rPr>
+          <m:t>j</m:t>
+        </m:r>
+      </m:oMath>
+      <w:r>
+        <w:t xml:space="preserve"> imaginary part ko represent karta hai.</w:t>
+      </w:r>
+    </w:p>
+    <w:p>
+      <w:pPr>
+        <w:numPr>
+          <w:ilvl w:val="0"/>
+          <w:numId w:val="14"/>
+        </w:numPr>
+      </w:pPr>
+      <w:r>
+        <w:rPr>
+          <w:b/>
+          <w:bCs/>
+        </w:rPr>
+        <w:t>Example:</w:t>
+      </w:r>
+      <w:r>
+        <w:t xml:space="preserve"> 3 + 4j</w:t>
+      </w:r>
+    </w:p>
+    <w:p>
+      <w:pPr>
+        <w:rPr>
+          <w:b/>
+          <w:bCs/>
+        </w:rPr>
+      </w:pPr>
+      <w:r>
+        <w:rPr>
+          <w:b/>
+          <w:bCs/>
+        </w:rPr>
+        <w:lastRenderedPageBreak/>
+        <w:t>E. String (str)</w:t>
+      </w:r>
+    </w:p>
+    <w:p>
+      <w:pPr>
+        <w:numPr>
+          <w:ilvl w:val="0"/>
+          <w:numId w:val="15"/>
+        </w:numPr>
+      </w:pPr>
+      <w:r>
+        <w:t xml:space="preserve">Single, double, </w:t>
+      </w:r>
+      <w:proofErr w:type="spellStart"/>
+      <w:r>
+        <w:t>ya</w:t>
+      </w:r>
+      <w:proofErr w:type="spellEnd"/>
+      <w:r>
+        <w:t xml:space="preserve"> triple quotes </w:t>
+      </w:r>
+      <w:proofErr w:type="spellStart"/>
+      <w:r>
+        <w:t>ke</w:t>
+      </w:r>
+      <w:proofErr w:type="spellEnd"/>
+      <w:r>
+        <w:t xml:space="preserve"> </w:t>
+      </w:r>
+      <w:proofErr w:type="spellStart"/>
+      <w:r>
+        <w:t>andar</w:t>
+      </w:r>
+      <w:proofErr w:type="spellEnd"/>
+      <w:r>
+        <w:t xml:space="preserve"> </w:t>
+      </w:r>
+      <w:proofErr w:type="spellStart"/>
+      <w:r>
+        <w:t>likha</w:t>
+      </w:r>
+      <w:proofErr w:type="spellEnd"/>
+      <w:r>
+        <w:t xml:space="preserve"> </w:t>
+      </w:r>
+      <w:proofErr w:type="spellStart"/>
+      <w:r>
+        <w:t>gaya</w:t>
+      </w:r>
+      <w:proofErr w:type="spellEnd"/>
+      <w:r>
+        <w:t xml:space="preserve"> koi </w:t>
+      </w:r>
+      <w:proofErr w:type="spellStart"/>
+      <w:r>
+        <w:t>bhi</w:t>
+      </w:r>
+      <w:proofErr w:type="spellEnd"/>
+      <w:r>
+        <w:t xml:space="preserve"> text </w:t>
+      </w:r>
+      <w:r>
+        <w:rPr>
+          <w:b/>
+          <w:bCs/>
+        </w:rPr>
+        <w:t>String</w:t>
+      </w:r>
+      <w:r>
+        <w:t xml:space="preserve"> </w:t>
+      </w:r>
+      <w:proofErr w:type="spellStart"/>
+      <w:r>
+        <w:t>kehlata</w:t>
+      </w:r>
+      <w:proofErr w:type="spellEnd"/>
+      <w:r>
+        <w:t xml:space="preserve"> </w:t>
+      </w:r>
+      <w:proofErr w:type="spellStart"/>
+      <w:r>
+        <w:t>hai</w:t>
+      </w:r>
+      <w:proofErr w:type="spellEnd"/>
+      <w:r>
+        <w:t>.</w:t>
+      </w:r>
+    </w:p>
+    <w:p>
+      <w:pPr>
+        <w:numPr>
+          <w:ilvl w:val="0"/>
+          <w:numId w:val="15"/>
+        </w:numPr>
+      </w:pPr>
+      <w:r>
+        <w:t xml:space="preserve">Python </w:t>
+      </w:r>
+      <w:proofErr w:type="spellStart"/>
+      <w:r>
+        <w:t>mein</w:t>
+      </w:r>
+      <w:proofErr w:type="spellEnd"/>
+      <w:r>
+        <w:t xml:space="preserve"> </w:t>
+      </w:r>
+      <w:proofErr w:type="spellStart"/>
+      <w:r>
+        <w:t>aap</w:t>
+      </w:r>
+      <w:proofErr w:type="spellEnd"/>
+      <w:r>
+        <w:t xml:space="preserve"> single ' ', double " ", </w:t>
+      </w:r>
+      <w:proofErr w:type="spellStart"/>
+      <w:r>
+        <w:t>ya</w:t>
+      </w:r>
+      <w:proofErr w:type="spellEnd"/>
+      <w:r>
+        <w:t xml:space="preserve"> triple ''' ''' / """ """ quotes ka use </w:t>
+      </w:r>
+      <w:proofErr w:type="spellStart"/>
+      <w:r>
+        <w:t>kar</w:t>
+      </w:r>
+      <w:proofErr w:type="spellEnd"/>
+      <w:r>
+        <w:t xml:space="preserve"> </w:t>
+      </w:r>
+      <w:proofErr w:type="spellStart"/>
+      <w:r>
+        <w:t>sakte</w:t>
+      </w:r>
+      <w:proofErr w:type="spellEnd"/>
+      <w:r>
+        <w:t xml:space="preserve"> ho.</w:t>
+      </w:r>
+    </w:p>
+    <w:p>
+      <w:pPr>
+        <w:numPr>
+          <w:ilvl w:val="0"/>
+          <w:numId w:val="15"/>
+        </w:numPr>
+      </w:pPr>
+      <w:r>
+        <w:rPr>
+          <w:b/>
+          <w:bCs/>
+        </w:rPr>
+        <w:t>Example:</w:t>
+      </w:r>
+    </w:p>
+    <w:p>
+      <w:r>
+        <w:t>Python</w:t>
+      </w:r>
+    </w:p>
+    <w:p>
+      <w:r>
+        <w:t>name1 = 'Python'</w:t>
+      </w:r>
+    </w:p>
+    <w:p>
+      <w:r>
+        <w:t>name2 = "</w:t>
+      </w:r>
+      <w:proofErr w:type="spellStart"/>
+      <w:r>
+        <w:t>CampusX</w:t>
+      </w:r>
+      <w:proofErr w:type="spellEnd"/>
+      <w:r>
+        <w:t>"</w:t>
+      </w:r>
+    </w:p>
+    <w:p>
+      <w:r>
+        <w:t>name3 = '''Hello World'''</w:t>
+      </w:r>
+    </w:p>
+    <w:p>
+      <w:pPr>
+        <w:rPr>
+          <w:b/>
+          <w:bCs/>
+        </w:rPr>
+      </w:pPr>
+      <w:r>
+        <w:rPr>
+          <w:b/>
+          <w:bCs/>
+        </w:rPr>
+        <w:t>3. Category 2: Container Data Types</w:t>
+      </w:r>
+    </w:p>
+    <w:p>
+      <w:r>
+        <w:t xml:space="preserve">Jab </w:t>
+      </w:r>
+      <w:proofErr w:type="spellStart"/>
+      <w:r>
+        <w:t>aapko</w:t>
+      </w:r>
+      <w:proofErr w:type="spellEnd"/>
+      <w:r>
+        <w:t xml:space="preserve"> ek hi variable </w:t>
+      </w:r>
+      <w:proofErr w:type="spellStart"/>
+      <w:r>
+        <w:t>ke</w:t>
+      </w:r>
+      <w:proofErr w:type="spellEnd"/>
+      <w:r>
+        <w:t xml:space="preserve"> </w:t>
+      </w:r>
+      <w:proofErr w:type="spellStart"/>
+      <w:r>
+        <w:t>andar</w:t>
+      </w:r>
+      <w:proofErr w:type="spellEnd"/>
+      <w:r>
+        <w:t xml:space="preserve"> </w:t>
+      </w:r>
+      <w:r>
+        <w:rPr>
+          <w:b/>
+          <w:bCs/>
+        </w:rPr>
+        <w:t>multiple values/items store</w:t>
+      </w:r>
+      <w:r>
+        <w:t xml:space="preserve"> </w:t>
+      </w:r>
+      <w:proofErr w:type="spellStart"/>
+      <w:r>
+        <w:t>karne</w:t>
+      </w:r>
+      <w:proofErr w:type="spellEnd"/>
+      <w:r>
+        <w:t xml:space="preserve"> </w:t>
+      </w:r>
+      <w:proofErr w:type="spellStart"/>
+      <w:r>
+        <w:t>hote</w:t>
+      </w:r>
+      <w:proofErr w:type="spellEnd"/>
+      <w:r>
+        <w:t xml:space="preserve"> hain, tab </w:t>
+      </w:r>
+      <w:r>
+        <w:rPr>
+          <w:b/>
+          <w:bCs/>
+        </w:rPr>
+        <w:t>Container Types</w:t>
+      </w:r>
+      <w:r>
+        <w:t xml:space="preserve"> ka </w:t>
+      </w:r>
+      <w:proofErr w:type="gramStart"/>
+      <w:r>
+        <w:t>use</w:t>
+      </w:r>
+      <w:proofErr w:type="gramEnd"/>
+      <w:r>
+        <w:t xml:space="preserve"> </w:t>
+      </w:r>
+      <w:proofErr w:type="spellStart"/>
+      <w:r>
+        <w:t>hota</w:t>
+      </w:r>
+      <w:proofErr w:type="spellEnd"/>
+      <w:r>
+        <w:t xml:space="preserve"> </w:t>
+      </w:r>
+      <w:proofErr w:type="spellStart"/>
+      <w:r>
+        <w:t>hai</w:t>
+      </w:r>
+      <w:proofErr w:type="spellEnd"/>
+      <w:r>
+        <w:t>.</w:t>
+      </w:r>
+    </w:p>
+    <w:p>
+      <w:pPr>
+        <w:rPr>
+          <w:b/>
+          <w:bCs/>
+        </w:rPr>
+      </w:pPr>
+      <w:r>
+        <w:rPr>
+          <w:b/>
+          <w:bCs/>
+        </w:rPr>
+        <w:t>A. List (list)</w:t>
+      </w:r>
+    </w:p>
+    <w:p>
+      <w:pPr>
+        <w:numPr>
+          <w:ilvl w:val="0"/>
+          <w:numId w:val="16"/>
+        </w:numPr>
+      </w:pPr>
+      <w:proofErr w:type="spellStart"/>
+      <w:r>
+        <w:t>Baaki</w:t>
+      </w:r>
+      <w:proofErr w:type="spellEnd"/>
+      <w:r>
+        <w:t xml:space="preserve"> languages </w:t>
+      </w:r>
+      <w:proofErr w:type="spellStart"/>
+      <w:r>
+        <w:t>mein</w:t>
+      </w:r>
+      <w:proofErr w:type="spellEnd"/>
+      <w:r>
+        <w:t xml:space="preserve"> </w:t>
+      </w:r>
+      <w:proofErr w:type="spellStart"/>
+      <w:r>
+        <w:t>ise</w:t>
+      </w:r>
+      <w:proofErr w:type="spellEnd"/>
+      <w:r>
+        <w:t xml:space="preserve"> </w:t>
+      </w:r>
+      <w:r>
+        <w:rPr>
+          <w:b/>
+          <w:bCs/>
+        </w:rPr>
+        <w:t>Array</w:t>
+      </w:r>
+      <w:r>
+        <w:t xml:space="preserve"> kaha </w:t>
+      </w:r>
+      <w:proofErr w:type="spellStart"/>
+      <w:r>
+        <w:t>jata</w:t>
+      </w:r>
+      <w:proofErr w:type="spellEnd"/>
+      <w:r>
+        <w:t xml:space="preserve"> </w:t>
+      </w:r>
+      <w:proofErr w:type="spellStart"/>
+      <w:r>
+        <w:t>hai</w:t>
+      </w:r>
+      <w:proofErr w:type="spellEnd"/>
+      <w:r>
+        <w:t>.</w:t>
+      </w:r>
+    </w:p>
+    <w:p>
+      <w:pPr>
+        <w:numPr>
+          <w:ilvl w:val="0"/>
+          <w:numId w:val="16"/>
+        </w:numPr>
+      </w:pPr>
+      <w:r>
+        <w:t xml:space="preserve">Isme multiple items ko </w:t>
+      </w:r>
+      <w:r>
+        <w:rPr>
+          <w:b/>
+          <w:bCs/>
+        </w:rPr>
+        <w:t xml:space="preserve">Square Brackets </w:t>
+      </w:r>
+      <w:proofErr w:type="gramStart"/>
+      <w:r>
+        <w:rPr>
+          <w:b/>
+          <w:bCs/>
+        </w:rPr>
+        <w:t>[ ]</w:t>
+      </w:r>
+      <w:proofErr w:type="gramEnd"/>
+      <w:r>
+        <w:t xml:space="preserve"> </w:t>
+      </w:r>
+      <w:proofErr w:type="spellStart"/>
+      <w:r>
+        <w:t>mein</w:t>
+      </w:r>
+      <w:proofErr w:type="spellEnd"/>
+      <w:r>
+        <w:t xml:space="preserve"> comma </w:t>
+      </w:r>
+      <w:proofErr w:type="spellStart"/>
+      <w:r>
+        <w:t>se</w:t>
+      </w:r>
+      <w:proofErr w:type="spellEnd"/>
+      <w:r>
+        <w:t xml:space="preserve"> separate </w:t>
+      </w:r>
+      <w:proofErr w:type="spellStart"/>
+      <w:r>
+        <w:t>karke</w:t>
+      </w:r>
+      <w:proofErr w:type="spellEnd"/>
+      <w:r>
+        <w:t xml:space="preserve"> </w:t>
+      </w:r>
+      <w:proofErr w:type="spellStart"/>
+      <w:r>
+        <w:t>rakha</w:t>
+      </w:r>
+      <w:proofErr w:type="spellEnd"/>
+      <w:r>
+        <w:t xml:space="preserve"> </w:t>
+      </w:r>
+      <w:proofErr w:type="spellStart"/>
+      <w:r>
+        <w:t>jata</w:t>
+      </w:r>
+      <w:proofErr w:type="spellEnd"/>
+      <w:r>
+        <w:t xml:space="preserve"> </w:t>
+      </w:r>
+      <w:proofErr w:type="spellStart"/>
+      <w:r>
+        <w:t>hai</w:t>
+      </w:r>
+      <w:proofErr w:type="spellEnd"/>
+      <w:r>
+        <w:t>.</w:t>
+      </w:r>
+    </w:p>
+    <w:p>
+      <w:pPr>
+        <w:numPr>
+          <w:ilvl w:val="0"/>
+          <w:numId w:val="16"/>
+        </w:numPr>
+      </w:pPr>
+      <w:r>
+        <w:rPr>
+          <w:b/>
+          <w:bCs/>
+        </w:rPr>
+        <w:t>Example:</w:t>
+      </w:r>
+    </w:p>
+    <w:p>
+      <w:r>
+        <w:t>Python</w:t>
+      </w:r>
+    </w:p>
+    <w:p>
+      <w:proofErr w:type="spellStart"/>
+      <w:r>
+        <w:t>my_list</w:t>
+      </w:r>
+      <w:proofErr w:type="spellEnd"/>
+      <w:r>
+        <w:t xml:space="preserve"> = [1, 2, 3, "India", True]</w:t>
+      </w:r>
+    </w:p>
+    <w:p>
+      <w:pPr>
+        <w:rPr>
+          <w:b/>
+          <w:bCs/>
+        </w:rPr>
+      </w:pPr>
+      <w:r>
+        <w:rPr>
+          <w:b/>
+          <w:bCs/>
+        </w:rPr>
+        <w:t>B. Tuple (tuple)</w:t>
+      </w:r>
+    </w:p>
+    <w:p>
+      <w:pPr>
+        <w:numPr>
+          <w:ilvl w:val="0"/>
+          <w:numId w:val="17"/>
+        </w:numPr>
+      </w:pPr>
+      <w:r>
+        <w:t xml:space="preserve">Yeh </w:t>
+      </w:r>
+      <w:proofErr w:type="spellStart"/>
+      <w:r>
+        <w:t>kafi</w:t>
+      </w:r>
+      <w:proofErr w:type="spellEnd"/>
+      <w:r>
+        <w:t xml:space="preserve"> </w:t>
+      </w:r>
+      <w:proofErr w:type="spellStart"/>
+      <w:r>
+        <w:t>hadd</w:t>
+      </w:r>
+      <w:proofErr w:type="spellEnd"/>
+      <w:r>
+        <w:t xml:space="preserve"> </w:t>
+      </w:r>
+      <w:proofErr w:type="spellStart"/>
+      <w:r>
+        <w:t>tak</w:t>
+      </w:r>
+      <w:proofErr w:type="spellEnd"/>
+      <w:r>
+        <w:t xml:space="preserve"> List </w:t>
+      </w:r>
+      <w:proofErr w:type="spellStart"/>
+      <w:r>
+        <w:t>jaisa</w:t>
+      </w:r>
+      <w:proofErr w:type="spellEnd"/>
+      <w:r>
+        <w:t xml:space="preserve"> hi </w:t>
+      </w:r>
+      <w:proofErr w:type="spellStart"/>
+      <w:r>
+        <w:t>hota</w:t>
+      </w:r>
+      <w:proofErr w:type="spellEnd"/>
+      <w:r>
+        <w:t xml:space="preserve"> </w:t>
+      </w:r>
+      <w:proofErr w:type="spellStart"/>
+      <w:r>
+        <w:t>hai</w:t>
+      </w:r>
+      <w:proofErr w:type="spellEnd"/>
+      <w:r>
+        <w:t xml:space="preserve">, </w:t>
+      </w:r>
+      <w:proofErr w:type="spellStart"/>
+      <w:r>
+        <w:t>lekin</w:t>
+      </w:r>
+      <w:proofErr w:type="spellEnd"/>
+      <w:r>
+        <w:t xml:space="preserve"> </w:t>
+      </w:r>
+      <w:proofErr w:type="spellStart"/>
+      <w:r>
+        <w:t>isme</w:t>
+      </w:r>
+      <w:proofErr w:type="spellEnd"/>
+      <w:r>
+        <w:t xml:space="preserve"> values ko </w:t>
+      </w:r>
+      <w:r>
+        <w:rPr>
+          <w:b/>
+          <w:bCs/>
+        </w:rPr>
+        <w:t xml:space="preserve">Round Brackets </w:t>
+      </w:r>
+      <w:proofErr w:type="gramStart"/>
+      <w:r>
+        <w:rPr>
+          <w:b/>
+          <w:bCs/>
+        </w:rPr>
+        <w:t>( )</w:t>
+      </w:r>
+      <w:proofErr w:type="gramEnd"/>
+      <w:r>
+        <w:t xml:space="preserve"> </w:t>
+      </w:r>
+      <w:proofErr w:type="spellStart"/>
+      <w:r>
+        <w:t>ya</w:t>
+      </w:r>
+      <w:proofErr w:type="spellEnd"/>
+      <w:r>
+        <w:t xml:space="preserve"> Parentheses </w:t>
+      </w:r>
+      <w:proofErr w:type="spellStart"/>
+      <w:r>
+        <w:t>ke</w:t>
+      </w:r>
+      <w:proofErr w:type="spellEnd"/>
+      <w:r>
+        <w:t xml:space="preserve"> </w:t>
+      </w:r>
+      <w:proofErr w:type="spellStart"/>
+      <w:r>
+        <w:t>andar</w:t>
+      </w:r>
+      <w:proofErr w:type="spellEnd"/>
+      <w:r>
+        <w:t xml:space="preserve"> </w:t>
+      </w:r>
+      <w:proofErr w:type="spellStart"/>
+      <w:r>
+        <w:t>rakha</w:t>
+      </w:r>
+      <w:proofErr w:type="spellEnd"/>
+      <w:r>
+        <w:t xml:space="preserve"> </w:t>
+      </w:r>
+      <w:proofErr w:type="spellStart"/>
+      <w:r>
+        <w:t>jata</w:t>
+      </w:r>
+      <w:proofErr w:type="spellEnd"/>
+      <w:r>
+        <w:t xml:space="preserve"> </w:t>
+      </w:r>
+      <w:proofErr w:type="spellStart"/>
+      <w:r>
+        <w:t>hai</w:t>
+      </w:r>
+      <w:proofErr w:type="spellEnd"/>
+      <w:r>
+        <w:t>.</w:t>
+      </w:r>
+    </w:p>
+    <w:p>
+      <w:pPr>
+        <w:numPr>
+          <w:ilvl w:val="0"/>
+          <w:numId w:val="17"/>
+        </w:numPr>
+      </w:pPr>
+      <w:r>
+        <w:rPr>
+          <w:b/>
+          <w:bCs/>
+        </w:rPr>
+        <w:t>Example:</w:t>
+      </w:r>
+    </w:p>
+    <w:p>
+      <w:r>
+        <w:t>Python</w:t>
+      </w:r>
+    </w:p>
+    <w:p>
+      <w:proofErr w:type="spellStart"/>
+      <w:r>
+        <w:t>my_tuple</w:t>
+      </w:r>
+      <w:proofErr w:type="spellEnd"/>
+      <w:r>
+        <w:t xml:space="preserve"> = (1, 2, 3, "India")</w:t>
+      </w:r>
+    </w:p>
+    <w:p>
+      <w:pPr>
+        <w:rPr>
+          <w:b/>
+          <w:bCs/>
+        </w:rPr>
+      </w:pPr>
+      <w:r>
+        <w:rPr>
+          <w:b/>
+          <w:bCs/>
+        </w:rPr>
+        <w:t>C. Set (set)</w:t>
+      </w:r>
+    </w:p>
+    <w:p>
+      <w:pPr>
+        <w:numPr>
+          <w:ilvl w:val="0"/>
+          <w:numId w:val="18"/>
+        </w:numPr>
+      </w:pPr>
+      <w:r>
+        <w:t xml:space="preserve">Yeh mathematics </w:t>
+      </w:r>
+      <w:proofErr w:type="spellStart"/>
+      <w:r>
+        <w:t>ke</w:t>
+      </w:r>
+      <w:proofErr w:type="spellEnd"/>
+      <w:r>
+        <w:t xml:space="preserve"> Set theory par </w:t>
+      </w:r>
+      <w:proofErr w:type="spellStart"/>
+      <w:r>
+        <w:rPr>
+          <w:rFonts w:ascii="Nirmala UI" w:hAnsi="Nirmala UI" w:cs="Nirmala UI"/>
+        </w:rPr>
+        <w:t>आधारित</w:t>
+      </w:r>
+      <w:proofErr w:type="spellEnd"/>
+      <w:r>
+        <w:t xml:space="preserve"> </w:t>
+      </w:r>
+      <w:proofErr w:type="spellStart"/>
+      <w:r>
+        <w:t>hai</w:t>
+      </w:r>
+      <w:proofErr w:type="spellEnd"/>
+      <w:r>
+        <w:t>.</w:t>
+      </w:r>
+    </w:p>
+    <w:p>
+      <w:pPr>
+        <w:numPr>
+          <w:ilvl w:val="0"/>
+          <w:numId w:val="18"/>
+        </w:numPr>
+      </w:pPr>
+      <w:r>
+        <w:t xml:space="preserve">Isme </w:t>
+      </w:r>
+      <w:r>
+        <w:rPr>
+          <w:b/>
+          <w:bCs/>
+        </w:rPr>
+        <w:t xml:space="preserve">Curly Brackets </w:t>
+      </w:r>
+      <w:proofErr w:type="gramStart"/>
+      <w:r>
+        <w:rPr>
+          <w:b/>
+          <w:bCs/>
+        </w:rPr>
+        <w:t>{ }</w:t>
+      </w:r>
+      <w:proofErr w:type="gramEnd"/>
+      <w:r>
+        <w:t xml:space="preserve"> ka </w:t>
+      </w:r>
+      <w:proofErr w:type="gramStart"/>
+      <w:r>
+        <w:t>use</w:t>
+      </w:r>
+      <w:proofErr w:type="gramEnd"/>
+      <w:r>
+        <w:t xml:space="preserve"> </w:t>
+      </w:r>
+      <w:proofErr w:type="spellStart"/>
+      <w:r>
+        <w:t>hota</w:t>
+      </w:r>
+      <w:proofErr w:type="spellEnd"/>
+      <w:r>
+        <w:t xml:space="preserve"> </w:t>
+      </w:r>
+      <w:proofErr w:type="spellStart"/>
+      <w:r>
+        <w:t>hai</w:t>
+      </w:r>
+      <w:proofErr w:type="spellEnd"/>
+      <w:r>
+        <w:t xml:space="preserve"> aur </w:t>
+      </w:r>
+      <w:proofErr w:type="spellStart"/>
+      <w:r>
+        <w:t>isme</w:t>
+      </w:r>
+      <w:proofErr w:type="spellEnd"/>
+      <w:r>
+        <w:t xml:space="preserve"> </w:t>
+      </w:r>
+      <w:r>
+        <w:rPr>
+          <w:b/>
+          <w:bCs/>
+        </w:rPr>
+        <w:t xml:space="preserve">duplicate values allowed </w:t>
+      </w:r>
+      <w:proofErr w:type="spellStart"/>
+      <w:r>
+        <w:rPr>
+          <w:b/>
+          <w:bCs/>
+        </w:rPr>
+        <w:t>nahi</w:t>
+      </w:r>
+      <w:proofErr w:type="spellEnd"/>
+      <w:r>
+        <w:rPr>
+          <w:b/>
+          <w:bCs/>
+        </w:rPr>
+        <w:t xml:space="preserve"> </w:t>
+      </w:r>
+      <w:proofErr w:type="spellStart"/>
+      <w:r>
+        <w:rPr>
+          <w:b/>
+          <w:bCs/>
+        </w:rPr>
+        <w:t>hoti</w:t>
+      </w:r>
+      <w:proofErr w:type="spellEnd"/>
+      <w:r>
+        <w:t>.</w:t>
+      </w:r>
+    </w:p>
+    <w:p>
+      <w:pPr>
+        <w:numPr>
+          <w:ilvl w:val="0"/>
+          <w:numId w:val="18"/>
+        </w:numPr>
+      </w:pPr>
+      <w:r>
+        <w:rPr>
+          <w:b/>
+          <w:bCs/>
+        </w:rPr>
+        <w:t>Example:</w:t>
+      </w:r>
+    </w:p>
+    <w:p>
+      <w:r>
+        <w:t>Python</w:t>
+      </w:r>
+    </w:p>
+    <w:p>
+      <w:proofErr w:type="spellStart"/>
+      <w:r>
+        <w:t>my_set</w:t>
+      </w:r>
+      <w:proofErr w:type="spellEnd"/>
+      <w:r>
+        <w:t xml:space="preserve"> = {1, 2, 3, 4}</w:t>
+      </w:r>
+    </w:p>
+    <w:p>
+      <w:pPr>
+        <w:rPr>
+          <w:b/>
+          <w:bCs/>
+        </w:rPr>
+      </w:pPr>
+      <w:r>
+        <w:rPr>
+          <w:b/>
+          <w:bCs/>
+        </w:rPr>
+        <w:t>D. Dictionary (</w:t>
+      </w:r>
+      <w:proofErr w:type="spellStart"/>
+      <w:r>
+        <w:rPr>
+          <w:b/>
+          <w:bCs/>
+        </w:rPr>
+        <w:t>dict</w:t>
+      </w:r>
+      <w:proofErr w:type="spellEnd"/>
+      <w:r>
+        <w:rPr>
+          <w:b/>
+          <w:bCs/>
+        </w:rPr>
+        <w:t>)</w:t>
+      </w:r>
+    </w:p>
+    <w:p>
+      <w:pPr>
+        <w:numPr>
+          <w:ilvl w:val="0"/>
+          <w:numId w:val="19"/>
+        </w:numPr>
+      </w:pPr>
+      <w:r>
+        <w:t xml:space="preserve">Yeh data ko </w:t>
+      </w:r>
+      <w:r>
+        <w:rPr>
+          <w:b/>
+          <w:bCs/>
+        </w:rPr>
+        <w:t>Key-Value pairs</w:t>
+      </w:r>
+      <w:r>
+        <w:t xml:space="preserve"> </w:t>
+      </w:r>
+      <w:proofErr w:type="spellStart"/>
+      <w:r>
+        <w:t>ke</w:t>
+      </w:r>
+      <w:proofErr w:type="spellEnd"/>
+      <w:r>
+        <w:t xml:space="preserve"> form </w:t>
+      </w:r>
+      <w:proofErr w:type="spellStart"/>
+      <w:r>
+        <w:t>mein</w:t>
+      </w:r>
+      <w:proofErr w:type="spellEnd"/>
+      <w:r>
+        <w:t xml:space="preserve"> store </w:t>
+      </w:r>
+      <w:proofErr w:type="spellStart"/>
+      <w:r>
+        <w:t>karta</w:t>
+      </w:r>
+      <w:proofErr w:type="spellEnd"/>
+      <w:r>
+        <w:t xml:space="preserve"> </w:t>
+      </w:r>
+      <w:proofErr w:type="spellStart"/>
+      <w:r>
+        <w:t>hai</w:t>
+      </w:r>
+      <w:proofErr w:type="spellEnd"/>
+      <w:r>
+        <w:t>.</w:t>
+      </w:r>
+    </w:p>
+    <w:p>
+      <w:pPr>
+        <w:numPr>
+          <w:ilvl w:val="0"/>
+          <w:numId w:val="19"/>
+        </w:numPr>
+      </w:pPr>
+      <w:r>
+        <w:t xml:space="preserve">Isme </w:t>
+      </w:r>
+      <w:proofErr w:type="spellStart"/>
+      <w:r>
+        <w:t>bhi</w:t>
+      </w:r>
+      <w:proofErr w:type="spellEnd"/>
+      <w:r>
+        <w:t xml:space="preserve"> </w:t>
+      </w:r>
+      <w:r>
+        <w:rPr>
+          <w:b/>
+          <w:bCs/>
+        </w:rPr>
+        <w:t xml:space="preserve">Curly Brackets </w:t>
+      </w:r>
+      <w:proofErr w:type="gramStart"/>
+      <w:r>
+        <w:rPr>
+          <w:b/>
+          <w:bCs/>
+        </w:rPr>
+        <w:t>{ }</w:t>
+      </w:r>
+      <w:proofErr w:type="gramEnd"/>
+      <w:r>
+        <w:t xml:space="preserve"> ka </w:t>
+      </w:r>
+      <w:proofErr w:type="gramStart"/>
+      <w:r>
+        <w:t>use</w:t>
+      </w:r>
+      <w:proofErr w:type="gramEnd"/>
+      <w:r>
+        <w:t xml:space="preserve"> </w:t>
+      </w:r>
+      <w:proofErr w:type="spellStart"/>
+      <w:r>
+        <w:t>hota</w:t>
+      </w:r>
+      <w:proofErr w:type="spellEnd"/>
+      <w:r>
+        <w:t xml:space="preserve"> </w:t>
+      </w:r>
+      <w:proofErr w:type="spellStart"/>
+      <w:r>
+        <w:t>hai</w:t>
+      </w:r>
+      <w:proofErr w:type="spellEnd"/>
+      <w:r>
+        <w:t>.</w:t>
+      </w:r>
+    </w:p>
+    <w:p>
+      <w:pPr>
+        <w:numPr>
+          <w:ilvl w:val="0"/>
+          <w:numId w:val="19"/>
+        </w:numPr>
+      </w:pPr>
+      <w:r>
+        <w:rPr>
+          <w:b/>
+          <w:bCs/>
+        </w:rPr>
+        <w:t>Example:</w:t>
+      </w:r>
+    </w:p>
+    <w:p>
+      <w:r>
+        <w:t>Python</w:t>
+      </w:r>
+    </w:p>
+    <w:p>
+      <w:r>
+        <w:lastRenderedPageBreak/>
+        <w:t>person = {</w:t>
+      </w:r>
+    </w:p>
+    <w:p>
+      <w:r>
+        <w:t xml:space="preserve">    "name": "Nitish",</w:t>
+      </w:r>
+    </w:p>
+    <w:p>
+      <w:r>
+        <w:t xml:space="preserve">    "age": 30,</w:t>
+      </w:r>
+    </w:p>
+    <w:p>
+      <w:r>
+        <w:t xml:space="preserve">    "gender": "Male"</w:t>
+      </w:r>
+    </w:p>
+    <w:p>
+      <w:r>
+        <w:t>}</w:t>
+      </w:r>
+    </w:p>
+    <w:p>
+      <w:pPr>
+        <w:rPr>
+          <w:b/>
+          <w:bCs/>
+        </w:rPr>
+      </w:pPr>
+      <w:r>
+        <w:rPr>
+          <w:b/>
+          <w:bCs/>
+        </w:rPr>
+        <w:t>4. Category 3: User-defined Data Types</w:t>
+      </w:r>
+    </w:p>
+    <w:p>
+      <w:pPr>
+        <w:numPr>
+          <w:ilvl w:val="0"/>
+          <w:numId w:val="20"/>
+        </w:numPr>
+      </w:pPr>
+      <w:r>
+        <w:t xml:space="preserve">Jab hum built-in data types </w:t>
+      </w:r>
+      <w:proofErr w:type="spellStart"/>
+      <w:r>
+        <w:t>ke</w:t>
+      </w:r>
+      <w:proofErr w:type="spellEnd"/>
+      <w:r>
+        <w:t xml:space="preserve"> </w:t>
+      </w:r>
+      <w:proofErr w:type="spellStart"/>
+      <w:r>
+        <w:t>alaava</w:t>
+      </w:r>
+      <w:proofErr w:type="spellEnd"/>
+      <w:r>
+        <w:t xml:space="preserve"> </w:t>
+      </w:r>
+      <w:proofErr w:type="spellStart"/>
+      <w:r>
+        <w:t>apna</w:t>
+      </w:r>
+      <w:proofErr w:type="spellEnd"/>
+      <w:r>
+        <w:t xml:space="preserve"> khud ka koi custom structure/data type banana </w:t>
+      </w:r>
+      <w:proofErr w:type="spellStart"/>
+      <w:r>
+        <w:t>chahte</w:t>
+      </w:r>
+      <w:proofErr w:type="spellEnd"/>
+      <w:r>
+        <w:t xml:space="preserve"> hain, </w:t>
+      </w:r>
+      <w:proofErr w:type="spellStart"/>
+      <w:r>
+        <w:t>toh</w:t>
+      </w:r>
+      <w:proofErr w:type="spellEnd"/>
+      <w:r>
+        <w:t xml:space="preserve"> use </w:t>
+      </w:r>
+      <w:r>
+        <w:rPr>
+          <w:b/>
+          <w:bCs/>
+        </w:rPr>
+        <w:t>User-defined Data Type</w:t>
+      </w:r>
+      <w:r>
+        <w:t xml:space="preserve"> </w:t>
+      </w:r>
+      <w:proofErr w:type="spellStart"/>
+      <w:r>
+        <w:t>bolte</w:t>
+      </w:r>
+      <w:proofErr w:type="spellEnd"/>
+      <w:r>
+        <w:t xml:space="preserve"> hain.</w:t>
+      </w:r>
+    </w:p>
+    <w:p>
+      <w:pPr>
+        <w:numPr>
+          <w:ilvl w:val="0"/>
+          <w:numId w:val="20"/>
+        </w:numPr>
+      </w:pPr>
+      <w:r>
+        <w:t xml:space="preserve">Yeh </w:t>
+      </w:r>
+      <w:r>
+        <w:rPr>
+          <w:b/>
+          <w:bCs/>
+        </w:rPr>
+        <w:t>OOPs (Object Oriented Programming)</w:t>
+      </w:r>
+      <w:r>
+        <w:t xml:space="preserve"> concept </w:t>
+      </w:r>
+      <w:proofErr w:type="spellStart"/>
+      <w:r>
+        <w:t>mein</w:t>
+      </w:r>
+      <w:proofErr w:type="spellEnd"/>
+      <w:r>
+        <w:t xml:space="preserve"> </w:t>
+      </w:r>
+      <w:r>
+        <w:rPr>
+          <w:b/>
+          <w:bCs/>
+        </w:rPr>
+        <w:t>Classes and Objects</w:t>
+      </w:r>
+      <w:r>
+        <w:t xml:space="preserve"> </w:t>
+      </w:r>
+      <w:proofErr w:type="spellStart"/>
+      <w:r>
+        <w:t>ke</w:t>
+      </w:r>
+      <w:proofErr w:type="spellEnd"/>
+      <w:r>
+        <w:t xml:space="preserve"> </w:t>
+      </w:r>
+      <w:proofErr w:type="spellStart"/>
+      <w:r>
+        <w:t>zariye</w:t>
+      </w:r>
+      <w:proofErr w:type="spellEnd"/>
+      <w:r>
+        <w:t xml:space="preserve"> </w:t>
+      </w:r>
+      <w:proofErr w:type="spellStart"/>
+      <w:r>
+        <w:t>banaya</w:t>
+      </w:r>
+      <w:proofErr w:type="spellEnd"/>
+      <w:r>
+        <w:t xml:space="preserve"> </w:t>
+      </w:r>
+      <w:proofErr w:type="spellStart"/>
+      <w:r>
+        <w:t>jata</w:t>
+      </w:r>
+      <w:proofErr w:type="spellEnd"/>
+      <w:r>
+        <w:t xml:space="preserve"> </w:t>
+      </w:r>
+      <w:proofErr w:type="spellStart"/>
+      <w:r>
+        <w:t>hai</w:t>
+      </w:r>
+      <w:proofErr w:type="spellEnd"/>
+      <w:r>
+        <w:t xml:space="preserve"> (Ise hum Aage OOPs module </w:t>
+      </w:r>
+      <w:proofErr w:type="spellStart"/>
+      <w:r>
+        <w:t>mein</w:t>
+      </w:r>
+      <w:proofErr w:type="spellEnd"/>
+      <w:r>
+        <w:t xml:space="preserve"> detail me </w:t>
+      </w:r>
+      <w:proofErr w:type="spellStart"/>
+      <w:r>
+        <w:t>padhenge</w:t>
+      </w:r>
+      <w:proofErr w:type="spellEnd"/>
+      <w:r>
+        <w:t>).</w:t>
+      </w:r>
+    </w:p>
+    <w:p>
+      <w:pPr>
+        <w:rPr>
+          <w:b/>
+          <w:bCs/>
+        </w:rPr>
+      </w:pPr>
+      <w:r>
+        <w:rPr>
+          <w:rFonts w:ascii="Segoe UI Emoji" w:hAnsi="Segoe UI Emoji" w:cs="Segoe UI Emoji"/>
+          <w:b/>
+          <w:bCs/>
+        </w:rPr>
+        <w:t>💡</w:t>
+      </w:r>
+      <w:r>
+        <w:rPr>
+          <w:b/>
+          <w:bCs/>
+        </w:rPr>
+        <w:t xml:space="preserve"> Quick Summary for Notes:</w:t>
+      </w:r>
+    </w:p>
+    <w:tbl>
+      <w:tblPr>
+        <w:tblW w:w="0" w:type="auto"/>
+        <w:tblCellSpacing w:w="15" w:type="dxa"/>
+        <w:tblCellMar>
+          <w:top w:w="15" w:type="dxa"/>
+          <w:left w:w="15" w:type="dxa"/>
+          <w:bottom w:w="15" w:type="dxa"/>
+          <w:right w:w="15" w:type="dxa"/>
+        </w:tblCellMar>
+        <w:tblLook w:val="04A0" w:firstRow="1" w:lastRow="0" w:firstColumn="1" w:lastColumn="0" w:noHBand="0" w:noVBand="1"/>
+      </w:tblPr>
+      <w:tblGrid>
+        <w:gridCol w:w="1903"/>
+        <w:gridCol w:w="3933"/>
+        <w:gridCol w:w="2771"/>
+      </w:tblGrid>
+      <w:tr>
+        <w:trPr>
+          <w:tblHeader/>
+          <w:tblCellSpacing w:w="15" w:type="dxa"/>
+        </w:trPr>
+        <w:tc>
+          <w:tcPr>
+            <w:tcW w:w="0" w:type="auto"/>
+            <w:tcBorders>
+              <w:top w:val="single" w:sz="6" w:space="0" w:color="C4C7C5"/>
+              <w:left w:val="single" w:sz="6" w:space="0" w:color="C4C7C5"/>
+              <w:bottom w:val="single" w:sz="6" w:space="0" w:color="C4C7C5"/>
+              <w:right w:val="single" w:sz="6" w:space="0" w:color="C4C7C5"/>
+            </w:tcBorders>
+            <w:tcMar>
+              <w:top w:w="120" w:type="dxa"/>
+              <w:left w:w="180" w:type="dxa"/>
+              <w:bottom w:w="120" w:type="dxa"/>
+              <w:right w:w="180" w:type="dxa"/>
+            </w:tcMar>
+            <w:vAlign w:val="center"/>
+            <w:hideMark/>
+          </w:tcPr>
+          <w:p>
+            <w:r>
+              <w:rPr>
+                <w:b/>
+                <w:bCs/>
+              </w:rPr>
+              <w:t>Category</w:t>
+            </w:r>
+          </w:p>
+        </w:tc>
+        <w:tc>
+          <w:tcPr>
+            <w:tcW w:w="0" w:type="auto"/>
+            <w:tcBorders>
+              <w:top w:val="single" w:sz="6" w:space="0" w:color="C4C7C5"/>
+              <w:left w:val="single" w:sz="6" w:space="0" w:color="C4C7C5"/>
+              <w:bottom w:val="single" w:sz="6" w:space="0" w:color="C4C7C5"/>
+              <w:right w:val="single" w:sz="6" w:space="0" w:color="C4C7C5"/>
+            </w:tcBorders>
+            <w:tcMar>
+              <w:top w:w="120" w:type="dxa"/>
+              <w:left w:w="180" w:type="dxa"/>
+              <w:bottom w:w="120" w:type="dxa"/>
+              <w:right w:w="180" w:type="dxa"/>
+            </w:tcMar>
+            <w:vAlign w:val="center"/>
+            <w:hideMark/>
+          </w:tcPr>
+          <w:p>
+            <w:r>
+              <w:rPr>
+                <w:b/>
+                <w:bCs/>
+              </w:rPr>
+              <w:t>Data Types</w:t>
+            </w:r>
+          </w:p>
+        </w:tc>
+        <w:tc>
+          <w:tcPr>
+            <w:tcW w:w="0" w:type="auto"/>
+            <w:tcBorders>
+              <w:top w:val="single" w:sz="6" w:space="0" w:color="C4C7C5"/>
+              <w:left w:val="single" w:sz="6" w:space="0" w:color="C4C7C5"/>
+              <w:bottom w:val="single" w:sz="6" w:space="0" w:color="C4C7C5"/>
+              <w:right w:val="single" w:sz="6" w:space="0" w:color="C4C7C5"/>
+            </w:tcBorders>
+            <w:tcMar>
+              <w:top w:w="120" w:type="dxa"/>
+              <w:left w:w="180" w:type="dxa"/>
+              <w:bottom w:w="120" w:type="dxa"/>
+              <w:right w:w="180" w:type="dxa"/>
+            </w:tcMar>
+            <w:vAlign w:val="center"/>
+            <w:hideMark/>
+          </w:tcPr>
+          <w:p>
+            <w:r>
+              <w:rPr>
+                <w:b/>
+                <w:bCs/>
+              </w:rPr>
+              <w:t>Syntax / Identifiers</w:t>
+            </w:r>
+          </w:p>
+        </w:tc>
+      </w:tr>
+      <w:tr>
+        <w:trPr>
+          <w:tblCellSpacing w:w="15" w:type="dxa"/>
+        </w:trPr>
+        <w:tc>
+          <w:tcPr>
+            <w:tcW w:w="0" w:type="auto"/>
+            <w:tcBorders>
+              <w:top w:val="single" w:sz="6" w:space="0" w:color="C4C7C5"/>
+              <w:left w:val="single" w:sz="6" w:space="0" w:color="C4C7C5"/>
+              <w:bottom w:val="single" w:sz="6" w:space="0" w:color="C4C7C5"/>
+              <w:right w:val="single" w:sz="6" w:space="0" w:color="C4C7C5"/>
+            </w:tcBorders>
+            <w:tcMar>
+              <w:top w:w="120" w:type="dxa"/>
+              <w:left w:w="180" w:type="dxa"/>
+              <w:bottom w:w="120" w:type="dxa"/>
+              <w:right w:w="180" w:type="dxa"/>
+            </w:tcMar>
+            <w:vAlign w:val="center"/>
+            <w:hideMark/>
+          </w:tcPr>
+          <w:p>
+            <w:r>
+              <w:rPr>
+                <w:b/>
+                <w:bCs/>
+              </w:rPr>
+              <w:t>Basic Types</w:t>
+            </w:r>
+          </w:p>
+        </w:tc>
+        <w:tc>
+          <w:tcPr>
+            <w:tcW w:w="0" w:type="auto"/>
+            <w:tcBorders>
+              <w:top w:val="single" w:sz="6" w:space="0" w:color="C4C7C5"/>
+              <w:left w:val="single" w:sz="6" w:space="0" w:color="C4C7C5"/>
+              <w:bottom w:val="single" w:sz="6" w:space="0" w:color="C4C7C5"/>
+              <w:right w:val="single" w:sz="6" w:space="0" w:color="C4C7C5"/>
+            </w:tcBorders>
+            <w:tcMar>
+              <w:top w:w="120" w:type="dxa"/>
+              <w:left w:w="180" w:type="dxa"/>
+              <w:bottom w:w="120" w:type="dxa"/>
+              <w:right w:w="180" w:type="dxa"/>
+            </w:tcMar>
+            <w:vAlign w:val="center"/>
+            <w:hideMark/>
+          </w:tcPr>
+          <w:p>
+            <w:r>
+              <w:t>Integer, Float, Boolean, Complex, String</w:t>
+            </w:r>
+          </w:p>
+        </w:tc>
+        <w:tc>
+          <w:tcPr>
+            <w:tcW w:w="0" w:type="auto"/>
+            <w:tcBorders>
+              <w:top w:val="single" w:sz="6" w:space="0" w:color="C4C7C5"/>
+              <w:left w:val="single" w:sz="6" w:space="0" w:color="C4C7C5"/>
+              <w:bottom w:val="single" w:sz="6" w:space="0" w:color="C4C7C5"/>
+              <w:right w:val="single" w:sz="6" w:space="0" w:color="C4C7C5"/>
+            </w:tcBorders>
+            <w:tcMar>
+              <w:top w:w="120" w:type="dxa"/>
+              <w:left w:w="180" w:type="dxa"/>
+              <w:bottom w:w="120" w:type="dxa"/>
+              <w:right w:w="180" w:type="dxa"/>
+            </w:tcMar>
+            <w:vAlign w:val="center"/>
+            <w:hideMark/>
+          </w:tcPr>
+          <w:p>
+            <w:r>
+              <w:t>10, 3.14, True, 3+4j, "text"</w:t>
+            </w:r>
+          </w:p>
+        </w:tc>
+      </w:tr>
+      <w:tr>
+        <w:trPr>
+          <w:tblCellSpacing w:w="15" w:type="dxa"/>
+        </w:trPr>
+        <w:tc>
+          <w:tcPr>
+            <w:tcW w:w="0" w:type="auto"/>
+            <w:tcBorders>
+              <w:top w:val="single" w:sz="6" w:space="0" w:color="C4C7C5"/>
+              <w:left w:val="single" w:sz="6" w:space="0" w:color="C4C7C5"/>
+              <w:bottom w:val="single" w:sz="6" w:space="0" w:color="C4C7C5"/>
+              <w:right w:val="single" w:sz="6" w:space="0" w:color="C4C7C5"/>
+            </w:tcBorders>
+            <w:tcMar>
+              <w:top w:w="120" w:type="dxa"/>
+              <w:left w:w="180" w:type="dxa"/>
+              <w:bottom w:w="120" w:type="dxa"/>
+              <w:right w:w="180" w:type="dxa"/>
+            </w:tcMar>
+            <w:vAlign w:val="center"/>
+            <w:hideMark/>
+          </w:tcPr>
+          <w:p>
+            <w:r>
+              <w:rPr>
+                <w:b/>
+                <w:bCs/>
+              </w:rPr>
+              <w:t>Container Types</w:t>
+            </w:r>
+          </w:p>
+        </w:tc>
+        <w:tc>
+          <w:tcPr>
+            <w:tcW w:w="0" w:type="auto"/>
+            <w:tcBorders>
+              <w:top w:val="single" w:sz="6" w:space="0" w:color="C4C7C5"/>
+              <w:left w:val="single" w:sz="6" w:space="0" w:color="C4C7C5"/>
+              <w:bottom w:val="single" w:sz="6" w:space="0" w:color="C4C7C5"/>
+              <w:right w:val="single" w:sz="6" w:space="0" w:color="C4C7C5"/>
+            </w:tcBorders>
+            <w:tcMar>
+              <w:top w:w="120" w:type="dxa"/>
+              <w:left w:w="180" w:type="dxa"/>
+              <w:bottom w:w="120" w:type="dxa"/>
+              <w:right w:w="180" w:type="dxa"/>
+            </w:tcMar>
+            <w:vAlign w:val="center"/>
+            <w:hideMark/>
+          </w:tcPr>
+          <w:p>
+            <w:r>
+              <w:t>List</w:t>
+            </w:r>
+          </w:p>
+        </w:tc>
+        <w:tc>
+          <w:tcPr>
+            <w:tcW w:w="0" w:type="auto"/>
+            <w:tcBorders>
+              <w:top w:val="single" w:sz="6" w:space="0" w:color="C4C7C5"/>
+              <w:left w:val="single" w:sz="6" w:space="0" w:color="C4C7C5"/>
+              <w:bottom w:val="single" w:sz="6" w:space="0" w:color="C4C7C5"/>
+              <w:right w:val="single" w:sz="6" w:space="0" w:color="C4C7C5"/>
+            </w:tcBorders>
+            <w:tcMar>
+              <w:top w:w="120" w:type="dxa"/>
+              <w:left w:w="180" w:type="dxa"/>
+              <w:bottom w:w="120" w:type="dxa"/>
+              <w:right w:w="180" w:type="dxa"/>
+            </w:tcMar>
+            <w:vAlign w:val="center"/>
+            <w:hideMark/>
+          </w:tcPr>
+          <w:p>
+            <w:r>
+              <w:t xml:space="preserve">Square Brackets </w:t>
+            </w:r>
+            <w:proofErr w:type="gramStart"/>
+            <w:r>
+              <w:t>[ ]</w:t>
+            </w:r>
+            <w:proofErr w:type="gramEnd"/>
+          </w:p>
+        </w:tc>
+      </w:tr>
+      <w:tr>
+        <w:trPr>
+          <w:tblCellSpacing w:w="15" w:type="dxa"/>
+        </w:trPr>
+        <w:tc>
+          <w:tcPr>
+            <w:tcW w:w="0" w:type="auto"/>
+            <w:tcBorders>
+              <w:top w:val="single" w:sz="6" w:space="0" w:color="C4C7C5"/>
+              <w:left w:val="single" w:sz="6" w:space="0" w:color="C4C7C5"/>
+              <w:bottom w:val="single" w:sz="6" w:space="0" w:color="C4C7C5"/>
+              <w:right w:val="single" w:sz="6" w:space="0" w:color="C4C7C5"/>
+            </w:tcBorders>
+            <w:tcMar>
+              <w:top w:w="120" w:type="dxa"/>
+              <w:left w:w="180" w:type="dxa"/>
+              <w:bottom w:w="120" w:type="dxa"/>
+              <w:right w:w="180" w:type="dxa"/>
+            </w:tcMar>
+            <w:vAlign w:val="center"/>
+            <w:hideMark/>
+          </w:tcPr>
+          <w:p/>
+        </w:tc>
+        <w:tc>
+          <w:tcPr>
+            <w:tcW w:w="0" w:type="auto"/>
+            <w:tcBorders>
+              <w:top w:val="single" w:sz="6" w:space="0" w:color="C4C7C5"/>
+              <w:left w:val="single" w:sz="6" w:space="0" w:color="C4C7C5"/>
+              <w:bottom w:val="single" w:sz="6" w:space="0" w:color="C4C7C5"/>
+              <w:right w:val="single" w:sz="6" w:space="0" w:color="C4C7C5"/>
+            </w:tcBorders>
+            <w:tcMar>
+              <w:top w:w="120" w:type="dxa"/>
+              <w:left w:w="180" w:type="dxa"/>
+              <w:bottom w:w="120" w:type="dxa"/>
+              <w:right w:w="180" w:type="dxa"/>
+            </w:tcMar>
+            <w:vAlign w:val="center"/>
+            <w:hideMark/>
+          </w:tcPr>
+          <w:p>
+            <w:r>
+              <w:t>Tuple</w:t>
+            </w:r>
+          </w:p>
+        </w:tc>
+        <w:tc>
+          <w:tcPr>
+            <w:tcW w:w="0" w:type="auto"/>
+            <w:tcBorders>
+              <w:top w:val="single" w:sz="6" w:space="0" w:color="C4C7C5"/>
+              <w:left w:val="single" w:sz="6" w:space="0" w:color="C4C7C5"/>
+              <w:bottom w:val="single" w:sz="6" w:space="0" w:color="C4C7C5"/>
+              <w:right w:val="single" w:sz="6" w:space="0" w:color="C4C7C5"/>
+            </w:tcBorders>
+            <w:tcMar>
+              <w:top w:w="120" w:type="dxa"/>
+              <w:left w:w="180" w:type="dxa"/>
+              <w:bottom w:w="120" w:type="dxa"/>
+              <w:right w:w="180" w:type="dxa"/>
+            </w:tcMar>
+            <w:vAlign w:val="center"/>
+            <w:hideMark/>
+          </w:tcPr>
+          <w:p>
+            <w:r>
+              <w:t xml:space="preserve">Round Brackets </w:t>
+            </w:r>
+            <w:proofErr w:type="gramStart"/>
+            <w:r>
+              <w:t>( )</w:t>
+            </w:r>
+            <w:proofErr w:type="gramEnd"/>
+          </w:p>
+        </w:tc>
+      </w:tr>
+      <w:tr>
+        <w:trPr>
+          <w:tblCellSpacing w:w="15" w:type="dxa"/>
+        </w:trPr>
+        <w:tc>
+          <w:tcPr>
+            <w:tcW w:w="0" w:type="auto"/>
+            <w:tcBorders>
+              <w:top w:val="single" w:sz="6" w:space="0" w:color="C4C7C5"/>
+              <w:left w:val="single" w:sz="6" w:space="0" w:color="C4C7C5"/>
+              <w:bottom w:val="single" w:sz="6" w:space="0" w:color="C4C7C5"/>
+              <w:right w:val="single" w:sz="6" w:space="0" w:color="C4C7C5"/>
+            </w:tcBorders>
+            <w:tcMar>
+              <w:top w:w="120" w:type="dxa"/>
+              <w:left w:w="180" w:type="dxa"/>
+              <w:bottom w:w="120" w:type="dxa"/>
+              <w:right w:w="180" w:type="dxa"/>
+            </w:tcMar>
+            <w:vAlign w:val="center"/>
+            <w:hideMark/>
+          </w:tcPr>
+          <w:p/>
+        </w:tc>
+        <w:tc>
+          <w:tcPr>
+            <w:tcW w:w="0" w:type="auto"/>
+            <w:tcBorders>
+              <w:top w:val="single" w:sz="6" w:space="0" w:color="C4C7C5"/>
+              <w:left w:val="single" w:sz="6" w:space="0" w:color="C4C7C5"/>
+              <w:bottom w:val="single" w:sz="6" w:space="0" w:color="C4C7C5"/>
+              <w:right w:val="single" w:sz="6" w:space="0" w:color="C4C7C5"/>
+            </w:tcBorders>
+            <w:tcMar>
+              <w:top w:w="120" w:type="dxa"/>
+              <w:left w:w="180" w:type="dxa"/>
+              <w:bottom w:w="120" w:type="dxa"/>
+              <w:right w:w="180" w:type="dxa"/>
+            </w:tcMar>
+            <w:vAlign w:val="center"/>
+            <w:hideMark/>
+          </w:tcPr>
+          <w:p>
+            <w:r>
+              <w:t>Set</w:t>
+            </w:r>
+          </w:p>
+        </w:tc>
+        <w:tc>
+          <w:tcPr>
+            <w:tcW w:w="0" w:type="auto"/>
+            <w:tcBorders>
+              <w:top w:val="single" w:sz="6" w:space="0" w:color="C4C7C5"/>
+              <w:left w:val="single" w:sz="6" w:space="0" w:color="C4C7C5"/>
+              <w:bottom w:val="single" w:sz="6" w:space="0" w:color="C4C7C5"/>
+              <w:right w:val="single" w:sz="6" w:space="0" w:color="C4C7C5"/>
+            </w:tcBorders>
+            <w:tcMar>
+              <w:top w:w="120" w:type="dxa"/>
+              <w:left w:w="180" w:type="dxa"/>
+              <w:bottom w:w="120" w:type="dxa"/>
+              <w:right w:w="180" w:type="dxa"/>
+            </w:tcMar>
+            <w:vAlign w:val="center"/>
+            <w:hideMark/>
+          </w:tcPr>
+          <w:p>
+            <w:r>
+              <w:t xml:space="preserve">Curly Brackets </w:t>
+            </w:r>
+            <w:proofErr w:type="gramStart"/>
+            <w:r>
+              <w:t>{ }</w:t>
+            </w:r>
+            <w:proofErr w:type="gramEnd"/>
+          </w:p>
+        </w:tc>
+      </w:tr>
+      <w:tr>
+        <w:trPr>
+          <w:tblCellSpacing w:w="15" w:type="dxa"/>
+        </w:trPr>
+        <w:tc>
+          <w:tcPr>
+            <w:tcW w:w="0" w:type="auto"/>
+            <w:tcBorders>
+              <w:top w:val="single" w:sz="6" w:space="0" w:color="C4C7C5"/>
+              <w:left w:val="single" w:sz="6" w:space="0" w:color="C4C7C5"/>
+              <w:bottom w:val="single" w:sz="6" w:space="0" w:color="C4C7C5"/>
+              <w:right w:val="single" w:sz="6" w:space="0" w:color="C4C7C5"/>
+            </w:tcBorders>
+            <w:tcMar>
+              <w:top w:w="120" w:type="dxa"/>
+              <w:left w:w="180" w:type="dxa"/>
+              <w:bottom w:w="120" w:type="dxa"/>
+              <w:right w:w="180" w:type="dxa"/>
+            </w:tcMar>
+            <w:vAlign w:val="center"/>
+            <w:hideMark/>
+          </w:tcPr>
+          <w:p/>
+        </w:tc>
+        <w:tc>
+          <w:tcPr>
+            <w:tcW w:w="0" w:type="auto"/>
+            <w:tcBorders>
+              <w:top w:val="single" w:sz="6" w:space="0" w:color="C4C7C5"/>
+              <w:left w:val="single" w:sz="6" w:space="0" w:color="C4C7C5"/>
+              <w:bottom w:val="single" w:sz="6" w:space="0" w:color="C4C7C5"/>
+              <w:right w:val="single" w:sz="6" w:space="0" w:color="C4C7C5"/>
+            </w:tcBorders>
+            <w:tcMar>
+              <w:top w:w="120" w:type="dxa"/>
+              <w:left w:w="180" w:type="dxa"/>
+              <w:bottom w:w="120" w:type="dxa"/>
+              <w:right w:w="180" w:type="dxa"/>
+            </w:tcMar>
+            <w:vAlign w:val="center"/>
+            <w:hideMark/>
+          </w:tcPr>
+          <w:p>
+            <w:r>
+              <w:t>Dictionary</w:t>
+            </w:r>
+          </w:p>
+        </w:tc>
+        <w:tc>
+          <w:tcPr>
+            <w:tcW w:w="0" w:type="auto"/>
+            <w:tcBorders>
+              <w:top w:val="single" w:sz="6" w:space="0" w:color="C4C7C5"/>
+              <w:left w:val="single" w:sz="6" w:space="0" w:color="C4C7C5"/>
+              <w:bottom w:val="single" w:sz="6" w:space="0" w:color="C4C7C5"/>
+              <w:right w:val="single" w:sz="6" w:space="0" w:color="C4C7C5"/>
+            </w:tcBorders>
+            <w:tcMar>
+              <w:top w:w="120" w:type="dxa"/>
+              <w:left w:w="180" w:type="dxa"/>
+              <w:bottom w:w="120" w:type="dxa"/>
+              <w:right w:w="180" w:type="dxa"/>
+            </w:tcMar>
+            <w:vAlign w:val="center"/>
+            <w:hideMark/>
+          </w:tcPr>
+          <w:p>
+            <w:r>
+              <w:t xml:space="preserve">Key-Value Pairs inside </w:t>
+            </w:r>
+            <w:proofErr w:type="gramStart"/>
+            <w:r>
+              <w:t>{ }</w:t>
+            </w:r>
+            <w:proofErr w:type="gramEnd"/>
+          </w:p>
+        </w:tc>
+      </w:tr>
+      <w:tr>
+        <w:trPr>
+          <w:tblCellSpacing w:w="15" w:type="dxa"/>
+        </w:trPr>
+        <w:tc>
+          <w:tcPr>
+            <w:tcW w:w="0" w:type="auto"/>
+            <w:tcBorders>
+              <w:top w:val="single" w:sz="6" w:space="0" w:color="C4C7C5"/>
+              <w:left w:val="single" w:sz="6" w:space="0" w:color="C4C7C5"/>
+              <w:bottom w:val="single" w:sz="6" w:space="0" w:color="C4C7C5"/>
+              <w:right w:val="single" w:sz="6" w:space="0" w:color="C4C7C5"/>
+            </w:tcBorders>
+            <w:tcMar>
+              <w:top w:w="120" w:type="dxa"/>
+              <w:left w:w="180" w:type="dxa"/>
+              <w:bottom w:w="120" w:type="dxa"/>
+              <w:right w:w="180" w:type="dxa"/>
+            </w:tcMar>
+            <w:vAlign w:val="center"/>
+            <w:hideMark/>
+          </w:tcPr>
+          <w:p>
+            <w:r>
+              <w:rPr>
+                <w:b/>
+                <w:bCs/>
+              </w:rPr>
+              <w:t>User-defined</w:t>
+            </w:r>
+          </w:p>
+        </w:tc>
+        <w:tc>
+          <w:tcPr>
+            <w:tcW w:w="0" w:type="auto"/>
+            <w:tcBorders>
+              <w:top w:val="single" w:sz="6" w:space="0" w:color="C4C7C5"/>
+              <w:left w:val="single" w:sz="6" w:space="0" w:color="C4C7C5"/>
+              <w:bottom w:val="single" w:sz="6" w:space="0" w:color="C4C7C5"/>
+              <w:right w:val="single" w:sz="6" w:space="0" w:color="C4C7C5"/>
+            </w:tcBorders>
+            <w:tcMar>
+              <w:top w:w="120" w:type="dxa"/>
+              <w:left w:w="180" w:type="dxa"/>
+              <w:bottom w:w="120" w:type="dxa"/>
+              <w:right w:w="180" w:type="dxa"/>
+            </w:tcMar>
+            <w:vAlign w:val="center"/>
+            <w:hideMark/>
+          </w:tcPr>
+          <w:p>
+            <w:r>
+              <w:t>Class &amp; Object</w:t>
+            </w:r>
+          </w:p>
+        </w:tc>
+        <w:tc>
+          <w:tcPr>
+            <w:tcW w:w="0" w:type="auto"/>
+            <w:tcBorders>
+              <w:top w:val="single" w:sz="6" w:space="0" w:color="C4C7C5"/>
+              <w:left w:val="single" w:sz="6" w:space="0" w:color="C4C7C5"/>
+              <w:bottom w:val="single" w:sz="6" w:space="0" w:color="C4C7C5"/>
+              <w:right w:val="single" w:sz="6" w:space="0" w:color="C4C7C5"/>
+            </w:tcBorders>
+            <w:tcMar>
+              <w:top w:w="120" w:type="dxa"/>
+              <w:left w:w="180" w:type="dxa"/>
+              <w:bottom w:w="120" w:type="dxa"/>
+              <w:right w:w="180" w:type="dxa"/>
+            </w:tcMar>
+            <w:vAlign w:val="center"/>
+            <w:hideMark/>
+          </w:tcPr>
+          <w:p>
+            <w:r>
+              <w:t>OOPs Concept</w:t>
+            </w:r>
+          </w:p>
+        </w:tc>
+      </w:tr>
+    </w:tbl>
+    <w:p/>
+    <w:p/>
     <w:sectPr>
       <w:pgSz w:w="11906" w:h="16838"/>
-      <w:pgMar w:top="1440" w:right="1440" w:bottom="1440" w:left="1440" w:header="708" w:footer="708" w:gutter="0"/>
+      <w:pgMar w:top="851" w:right="1440" w:bottom="993" w:left="1440" w:header="708" w:footer="708" w:gutter="0"/>
       <w:cols w:space="708"/>
       <w:docGrid w:linePitch="360"/>
     </w:sectPr>
@@ -2179,6 +4974,304 @@
     </w:lvl>
   </w:abstractNum>
   <w:abstractNum w:abstractNumId="1" w15:restartNumberingAfterBreak="0">
+    <w:nsid w:val="121C70AC"/>
+    <w:multiLevelType w:val="multilevel"/>
+    <w:tmpl w:val="8EDE46B6"/>
+    <w:lvl w:ilvl="0">
+      <w:start w:val="1"/>
+      <w:numFmt w:val="bullet"/>
+      <w:lvlText w:val=""/>
+      <w:lvlJc w:val="left"/>
+      <w:pPr>
+        <w:tabs>
+          <w:tab w:val="num" w:pos="720"/>
+        </w:tabs>
+        <w:ind w:left="720" w:hanging="360"/>
+      </w:pPr>
+      <w:rPr>
+        <w:rFonts w:ascii="Symbol" w:hAnsi="Symbol" w:hint="default"/>
+        <w:sz w:val="20"/>
+      </w:rPr>
+    </w:lvl>
+    <w:lvl w:ilvl="1" w:tentative="1">
+      <w:start w:val="1"/>
+      <w:numFmt w:val="bullet"/>
+      <w:lvlText w:val="o"/>
+      <w:lvlJc w:val="left"/>
+      <w:pPr>
+        <w:tabs>
+          <w:tab w:val="num" w:pos="1440"/>
+        </w:tabs>
+        <w:ind w:left="1440" w:hanging="360"/>
+      </w:pPr>
+      <w:rPr>
+        <w:rFonts w:ascii="Courier New" w:hAnsi="Courier New" w:hint="default"/>
+        <w:sz w:val="20"/>
+      </w:rPr>
+    </w:lvl>
+    <w:lvl w:ilvl="2" w:tentative="1">
+      <w:start w:val="1"/>
+      <w:numFmt w:val="bullet"/>
+      <w:lvlText w:val=""/>
+      <w:lvlJc w:val="left"/>
+      <w:pPr>
+        <w:tabs>
+          <w:tab w:val="num" w:pos="2160"/>
+        </w:tabs>
+        <w:ind w:left="2160" w:hanging="360"/>
+      </w:pPr>
+      <w:rPr>
+        <w:rFonts w:ascii="Wingdings" w:hAnsi="Wingdings" w:hint="default"/>
+        <w:sz w:val="20"/>
+      </w:rPr>
+    </w:lvl>
+    <w:lvl w:ilvl="3" w:tentative="1">
+      <w:start w:val="1"/>
+      <w:numFmt w:val="bullet"/>
+      <w:lvlText w:val=""/>
+      <w:lvlJc w:val="left"/>
+      <w:pPr>
+        <w:tabs>
+          <w:tab w:val="num" w:pos="2880"/>
+        </w:tabs>
+        <w:ind w:left="2880" w:hanging="360"/>
+      </w:pPr>
+      <w:rPr>
+        <w:rFonts w:ascii="Wingdings" w:hAnsi="Wingdings" w:hint="default"/>
+        <w:sz w:val="20"/>
+      </w:rPr>
+    </w:lvl>
+    <w:lvl w:ilvl="4" w:tentative="1">
+      <w:start w:val="1"/>
+      <w:numFmt w:val="bullet"/>
+      <w:lvlText w:val=""/>
+      <w:lvlJc w:val="left"/>
+      <w:pPr>
+        <w:tabs>
+          <w:tab w:val="num" w:pos="3600"/>
+        </w:tabs>
+        <w:ind w:left="3600" w:hanging="360"/>
+      </w:pPr>
+      <w:rPr>
+        <w:rFonts w:ascii="Wingdings" w:hAnsi="Wingdings" w:hint="default"/>
+        <w:sz w:val="20"/>
+      </w:rPr>
+    </w:lvl>
+    <w:lvl w:ilvl="5" w:tentative="1">
+      <w:start w:val="1"/>
+      <w:numFmt w:val="bullet"/>
+      <w:lvlText w:val=""/>
+      <w:lvlJc w:val="left"/>
+      <w:pPr>
+        <w:tabs>
+          <w:tab w:val="num" w:pos="4320"/>
+        </w:tabs>
+        <w:ind w:left="4320" w:hanging="360"/>
+      </w:pPr>
+      <w:rPr>
+        <w:rFonts w:ascii="Wingdings" w:hAnsi="Wingdings" w:hint="default"/>
+        <w:sz w:val="20"/>
+      </w:rPr>
+    </w:lvl>
+    <w:lvl w:ilvl="6" w:tentative="1">
+      <w:start w:val="1"/>
+      <w:numFmt w:val="bullet"/>
+      <w:lvlText w:val=""/>
+      <w:lvlJc w:val="left"/>
+      <w:pPr>
+        <w:tabs>
+          <w:tab w:val="num" w:pos="5040"/>
+        </w:tabs>
+        <w:ind w:left="5040" w:hanging="360"/>
+      </w:pPr>
+      <w:rPr>
+        <w:rFonts w:ascii="Wingdings" w:hAnsi="Wingdings" w:hint="default"/>
+        <w:sz w:val="20"/>
+      </w:rPr>
+    </w:lvl>
+    <w:lvl w:ilvl="7" w:tentative="1">
+      <w:start w:val="1"/>
+      <w:numFmt w:val="bullet"/>
+      <w:lvlText w:val=""/>
+      <w:lvlJc w:val="left"/>
+      <w:pPr>
+        <w:tabs>
+          <w:tab w:val="num" w:pos="5760"/>
+        </w:tabs>
+        <w:ind w:left="5760" w:hanging="360"/>
+      </w:pPr>
+      <w:rPr>
+        <w:rFonts w:ascii="Wingdings" w:hAnsi="Wingdings" w:hint="default"/>
+        <w:sz w:val="20"/>
+      </w:rPr>
+    </w:lvl>
+    <w:lvl w:ilvl="8" w:tentative="1">
+      <w:start w:val="1"/>
+      <w:numFmt w:val="bullet"/>
+      <w:lvlText w:val=""/>
+      <w:lvlJc w:val="left"/>
+      <w:pPr>
+        <w:tabs>
+          <w:tab w:val="num" w:pos="6480"/>
+        </w:tabs>
+        <w:ind w:left="6480" w:hanging="360"/>
+      </w:pPr>
+      <w:rPr>
+        <w:rFonts w:ascii="Wingdings" w:hAnsi="Wingdings" w:hint="default"/>
+        <w:sz w:val="20"/>
+      </w:rPr>
+    </w:lvl>
+  </w:abstractNum>
+  <w:abstractNum w:abstractNumId="2" w15:restartNumberingAfterBreak="0">
+    <w:nsid w:val="15D006BD"/>
+    <w:multiLevelType w:val="multilevel"/>
+    <w:tmpl w:val="63C019FA"/>
+    <w:lvl w:ilvl="0">
+      <w:start w:val="1"/>
+      <w:numFmt w:val="bullet"/>
+      <w:lvlText w:val=""/>
+      <w:lvlJc w:val="left"/>
+      <w:pPr>
+        <w:tabs>
+          <w:tab w:val="num" w:pos="720"/>
+        </w:tabs>
+        <w:ind w:left="720" w:hanging="360"/>
+      </w:pPr>
+      <w:rPr>
+        <w:rFonts w:ascii="Symbol" w:hAnsi="Symbol" w:hint="default"/>
+        <w:sz w:val="20"/>
+      </w:rPr>
+    </w:lvl>
+    <w:lvl w:ilvl="1" w:tentative="1">
+      <w:start w:val="1"/>
+      <w:numFmt w:val="bullet"/>
+      <w:lvlText w:val="o"/>
+      <w:lvlJc w:val="left"/>
+      <w:pPr>
+        <w:tabs>
+          <w:tab w:val="num" w:pos="1440"/>
+        </w:tabs>
+        <w:ind w:left="1440" w:hanging="360"/>
+      </w:pPr>
+      <w:rPr>
+        <w:rFonts w:ascii="Courier New" w:hAnsi="Courier New" w:hint="default"/>
+        <w:sz w:val="20"/>
+      </w:rPr>
+    </w:lvl>
+    <w:lvl w:ilvl="2" w:tentative="1">
+      <w:start w:val="1"/>
+      <w:numFmt w:val="bullet"/>
+      <w:lvlText w:val=""/>
+      <w:lvlJc w:val="left"/>
+      <w:pPr>
+        <w:tabs>
+          <w:tab w:val="num" w:pos="2160"/>
+        </w:tabs>
+        <w:ind w:left="2160" w:hanging="360"/>
+      </w:pPr>
+      <w:rPr>
+        <w:rFonts w:ascii="Wingdings" w:hAnsi="Wingdings" w:hint="default"/>
+        <w:sz w:val="20"/>
+      </w:rPr>
+    </w:lvl>
+    <w:lvl w:ilvl="3" w:tentative="1">
+      <w:start w:val="1"/>
+      <w:numFmt w:val="bullet"/>
+      <w:lvlText w:val=""/>
+      <w:lvlJc w:val="left"/>
+      <w:pPr>
+        <w:tabs>
+          <w:tab w:val="num" w:pos="2880"/>
+        </w:tabs>
+        <w:ind w:left="2880" w:hanging="360"/>
+      </w:pPr>
+      <w:rPr>
+        <w:rFonts w:ascii="Wingdings" w:hAnsi="Wingdings" w:hint="default"/>
+        <w:sz w:val="20"/>
+      </w:rPr>
+    </w:lvl>
+    <w:lvl w:ilvl="4" w:tentative="1">
+      <w:start w:val="1"/>
+      <w:numFmt w:val="bullet"/>
+      <w:lvlText w:val=""/>
+      <w:lvlJc w:val="left"/>
+      <w:pPr>
+        <w:tabs>
+          <w:tab w:val="num" w:pos="3600"/>
+        </w:tabs>
+        <w:ind w:left="3600" w:hanging="360"/>
+      </w:pPr>
+      <w:rPr>
+        <w:rFonts w:ascii="Wingdings" w:hAnsi="Wingdings" w:hint="default"/>
+        <w:sz w:val="20"/>
+      </w:rPr>
+    </w:lvl>
+    <w:lvl w:ilvl="5" w:tentative="1">
+      <w:start w:val="1"/>
+      <w:numFmt w:val="bullet"/>
+      <w:lvlText w:val=""/>
+      <w:lvlJc w:val="left"/>
+      <w:pPr>
+        <w:tabs>
+          <w:tab w:val="num" w:pos="4320"/>
+        </w:tabs>
+        <w:ind w:left="4320" w:hanging="360"/>
+      </w:pPr>
+      <w:rPr>
+        <w:rFonts w:ascii="Wingdings" w:hAnsi="Wingdings" w:hint="default"/>
+        <w:sz w:val="20"/>
+      </w:rPr>
+    </w:lvl>
+    <w:lvl w:ilvl="6" w:tentative="1">
+      <w:start w:val="1"/>
+      <w:numFmt w:val="bullet"/>
+      <w:lvlText w:val=""/>
+      <w:lvlJc w:val="left"/>
+      <w:pPr>
+        <w:tabs>
+          <w:tab w:val="num" w:pos="5040"/>
+        </w:tabs>
+        <w:ind w:left="5040" w:hanging="360"/>
+      </w:pPr>
+      <w:rPr>
+        <w:rFonts w:ascii="Wingdings" w:hAnsi="Wingdings" w:hint="default"/>
+        <w:sz w:val="20"/>
+      </w:rPr>
+    </w:lvl>
+    <w:lvl w:ilvl="7" w:tentative="1">
+      <w:start w:val="1"/>
+      <w:numFmt w:val="bullet"/>
+      <w:lvlText w:val=""/>
+      <w:lvlJc w:val="left"/>
+      <w:pPr>
+        <w:tabs>
+          <w:tab w:val="num" w:pos="5760"/>
+        </w:tabs>
+        <w:ind w:left="5760" w:hanging="360"/>
+      </w:pPr>
+      <w:rPr>
+        <w:rFonts w:ascii="Wingdings" w:hAnsi="Wingdings" w:hint="default"/>
+        <w:sz w:val="20"/>
+      </w:rPr>
+    </w:lvl>
+    <w:lvl w:ilvl="8" w:tentative="1">
+      <w:start w:val="1"/>
+      <w:numFmt w:val="bullet"/>
+      <w:lvlText w:val=""/>
+      <w:lvlJc w:val="left"/>
+      <w:pPr>
+        <w:tabs>
+          <w:tab w:val="num" w:pos="6480"/>
+        </w:tabs>
+        <w:ind w:left="6480" w:hanging="360"/>
+      </w:pPr>
+      <w:rPr>
+        <w:rFonts w:ascii="Wingdings" w:hAnsi="Wingdings" w:hint="default"/>
+        <w:sz w:val="20"/>
+      </w:rPr>
+    </w:lvl>
+  </w:abstractNum>
+  <w:abstractNum w:abstractNumId="3" w15:restartNumberingAfterBreak="0">
     <w:nsid w:val="16DC20BC"/>
     <w:multiLevelType w:val="multilevel"/>
     <w:tmpl w:val="F962B1E2"/>
@@ -2327,7 +5420,7 @@
       </w:rPr>
     </w:lvl>
   </w:abstractNum>
-  <w:abstractNum w:abstractNumId="2" w15:restartNumberingAfterBreak="0">
+  <w:abstractNum w:abstractNumId="4" w15:restartNumberingAfterBreak="0">
     <w:nsid w:val="1E142B31"/>
     <w:multiLevelType w:val="multilevel"/>
     <w:tmpl w:val="717E6EC6"/>
@@ -2476,7 +5569,156 @@
       </w:rPr>
     </w:lvl>
   </w:abstractNum>
-  <w:abstractNum w:abstractNumId="3" w15:restartNumberingAfterBreak="0">
+  <w:abstractNum w:abstractNumId="5" w15:restartNumberingAfterBreak="0">
+    <w:nsid w:val="303D4EDB"/>
+    <w:multiLevelType w:val="multilevel"/>
+    <w:tmpl w:val="DA4894EE"/>
+    <w:lvl w:ilvl="0">
+      <w:start w:val="1"/>
+      <w:numFmt w:val="bullet"/>
+      <w:lvlText w:val=""/>
+      <w:lvlJc w:val="left"/>
+      <w:pPr>
+        <w:tabs>
+          <w:tab w:val="num" w:pos="720"/>
+        </w:tabs>
+        <w:ind w:left="720" w:hanging="360"/>
+      </w:pPr>
+      <w:rPr>
+        <w:rFonts w:ascii="Symbol" w:hAnsi="Symbol" w:hint="default"/>
+        <w:sz w:val="20"/>
+      </w:rPr>
+    </w:lvl>
+    <w:lvl w:ilvl="1" w:tentative="1">
+      <w:start w:val="1"/>
+      <w:numFmt w:val="bullet"/>
+      <w:lvlText w:val="o"/>
+      <w:lvlJc w:val="left"/>
+      <w:pPr>
+        <w:tabs>
+          <w:tab w:val="num" w:pos="1440"/>
+        </w:tabs>
+        <w:ind w:left="1440" w:hanging="360"/>
+      </w:pPr>
+      <w:rPr>
+        <w:rFonts w:ascii="Courier New" w:hAnsi="Courier New" w:hint="default"/>
+        <w:sz w:val="20"/>
+      </w:rPr>
+    </w:lvl>
+    <w:lvl w:ilvl="2" w:tentative="1">
+      <w:start w:val="1"/>
+      <w:numFmt w:val="bullet"/>
+      <w:lvlText w:val=""/>
+      <w:lvlJc w:val="left"/>
+      <w:pPr>
+        <w:tabs>
+          <w:tab w:val="num" w:pos="2160"/>
+        </w:tabs>
+        <w:ind w:left="2160" w:hanging="360"/>
+      </w:pPr>
+      <w:rPr>
+        <w:rFonts w:ascii="Wingdings" w:hAnsi="Wingdings" w:hint="default"/>
+        <w:sz w:val="20"/>
+      </w:rPr>
+    </w:lvl>
+    <w:lvl w:ilvl="3" w:tentative="1">
+      <w:start w:val="1"/>
+      <w:numFmt w:val="bullet"/>
+      <w:lvlText w:val=""/>
+      <w:lvlJc w:val="left"/>
+      <w:pPr>
+        <w:tabs>
+          <w:tab w:val="num" w:pos="2880"/>
+        </w:tabs>
+        <w:ind w:left="2880" w:hanging="360"/>
+      </w:pPr>
+      <w:rPr>
+        <w:rFonts w:ascii="Wingdings" w:hAnsi="Wingdings" w:hint="default"/>
+        <w:sz w:val="20"/>
+      </w:rPr>
+    </w:lvl>
+    <w:lvl w:ilvl="4" w:tentative="1">
+      <w:start w:val="1"/>
+      <w:numFmt w:val="bullet"/>
+      <w:lvlText w:val=""/>
+      <w:lvlJc w:val="left"/>
+      <w:pPr>
+        <w:tabs>
+          <w:tab w:val="num" w:pos="3600"/>
+        </w:tabs>
+        <w:ind w:left="3600" w:hanging="360"/>
+      </w:pPr>
+      <w:rPr>
+        <w:rFonts w:ascii="Wingdings" w:hAnsi="Wingdings" w:hint="default"/>
+        <w:sz w:val="20"/>
+      </w:rPr>
+    </w:lvl>
+    <w:lvl w:ilvl="5" w:tentative="1">
+      <w:start w:val="1"/>
+      <w:numFmt w:val="bullet"/>
+      <w:lvlText w:val=""/>
+      <w:lvlJc w:val="left"/>
+      <w:pPr>
+        <w:tabs>
+          <w:tab w:val="num" w:pos="4320"/>
+        </w:tabs>
+        <w:ind w:left="4320" w:hanging="360"/>
+      </w:pPr>
+      <w:rPr>
+        <w:rFonts w:ascii="Wingdings" w:hAnsi="Wingdings" w:hint="default"/>
+        <w:sz w:val="20"/>
+      </w:rPr>
+    </w:lvl>
+    <w:lvl w:ilvl="6" w:tentative="1">
+      <w:start w:val="1"/>
+      <w:numFmt w:val="bullet"/>
+      <w:lvlText w:val=""/>
+      <w:lvlJc w:val="left"/>
+      <w:pPr>
+        <w:tabs>
+          <w:tab w:val="num" w:pos="5040"/>
+        </w:tabs>
+        <w:ind w:left="5040" w:hanging="360"/>
+      </w:pPr>
+      <w:rPr>
+        <w:rFonts w:ascii="Wingdings" w:hAnsi="Wingdings" w:hint="default"/>
+        <w:sz w:val="20"/>
+      </w:rPr>
+    </w:lvl>
+    <w:lvl w:ilvl="7" w:tentative="1">
+      <w:start w:val="1"/>
+      <w:numFmt w:val="bullet"/>
+      <w:lvlText w:val=""/>
+      <w:lvlJc w:val="left"/>
+      <w:pPr>
+        <w:tabs>
+          <w:tab w:val="num" w:pos="5760"/>
+        </w:tabs>
+        <w:ind w:left="5760" w:hanging="360"/>
+      </w:pPr>
+      <w:rPr>
+        <w:rFonts w:ascii="Wingdings" w:hAnsi="Wingdings" w:hint="default"/>
+        <w:sz w:val="20"/>
+      </w:rPr>
+    </w:lvl>
+    <w:lvl w:ilvl="8" w:tentative="1">
+      <w:start w:val="1"/>
+      <w:numFmt w:val="bullet"/>
+      <w:lvlText w:val=""/>
+      <w:lvlJc w:val="left"/>
+      <w:pPr>
+        <w:tabs>
+          <w:tab w:val="num" w:pos="6480"/>
+        </w:tabs>
+        <w:ind w:left="6480" w:hanging="360"/>
+      </w:pPr>
+      <w:rPr>
+        <w:rFonts w:ascii="Wingdings" w:hAnsi="Wingdings" w:hint="default"/>
+        <w:sz w:val="20"/>
+      </w:rPr>
+    </w:lvl>
+  </w:abstractNum>
+  <w:abstractNum w:abstractNumId="6" w15:restartNumberingAfterBreak="0">
     <w:nsid w:val="37D80B7A"/>
     <w:multiLevelType w:val="multilevel"/>
     <w:tmpl w:val="F4368136"/>
@@ -2625,7 +5867,156 @@
       </w:rPr>
     </w:lvl>
   </w:abstractNum>
-  <w:abstractNum w:abstractNumId="4" w15:restartNumberingAfterBreak="0">
+  <w:abstractNum w:abstractNumId="7" w15:restartNumberingAfterBreak="0">
+    <w:nsid w:val="39A77089"/>
+    <w:multiLevelType w:val="multilevel"/>
+    <w:tmpl w:val="269A6D1A"/>
+    <w:lvl w:ilvl="0">
+      <w:start w:val="1"/>
+      <w:numFmt w:val="bullet"/>
+      <w:lvlText w:val=""/>
+      <w:lvlJc w:val="left"/>
+      <w:pPr>
+        <w:tabs>
+          <w:tab w:val="num" w:pos="720"/>
+        </w:tabs>
+        <w:ind w:left="720" w:hanging="360"/>
+      </w:pPr>
+      <w:rPr>
+        <w:rFonts w:ascii="Symbol" w:hAnsi="Symbol" w:hint="default"/>
+        <w:sz w:val="20"/>
+      </w:rPr>
+    </w:lvl>
+    <w:lvl w:ilvl="1" w:tentative="1">
+      <w:start w:val="1"/>
+      <w:numFmt w:val="bullet"/>
+      <w:lvlText w:val="o"/>
+      <w:lvlJc w:val="left"/>
+      <w:pPr>
+        <w:tabs>
+          <w:tab w:val="num" w:pos="1440"/>
+        </w:tabs>
+        <w:ind w:left="1440" w:hanging="360"/>
+      </w:pPr>
+      <w:rPr>
+        <w:rFonts w:ascii="Courier New" w:hAnsi="Courier New" w:hint="default"/>
+        <w:sz w:val="20"/>
+      </w:rPr>
+    </w:lvl>
+    <w:lvl w:ilvl="2" w:tentative="1">
+      <w:start w:val="1"/>
+      <w:numFmt w:val="bullet"/>
+      <w:lvlText w:val=""/>
+      <w:lvlJc w:val="left"/>
+      <w:pPr>
+        <w:tabs>
+          <w:tab w:val="num" w:pos="2160"/>
+        </w:tabs>
+        <w:ind w:left="2160" w:hanging="360"/>
+      </w:pPr>
+      <w:rPr>
+        <w:rFonts w:ascii="Wingdings" w:hAnsi="Wingdings" w:hint="default"/>
+        <w:sz w:val="20"/>
+      </w:rPr>
+    </w:lvl>
+    <w:lvl w:ilvl="3" w:tentative="1">
+      <w:start w:val="1"/>
+      <w:numFmt w:val="bullet"/>
+      <w:lvlText w:val=""/>
+      <w:lvlJc w:val="left"/>
+      <w:pPr>
+        <w:tabs>
+          <w:tab w:val="num" w:pos="2880"/>
+        </w:tabs>
+        <w:ind w:left="2880" w:hanging="360"/>
+      </w:pPr>
+      <w:rPr>
+        <w:rFonts w:ascii="Wingdings" w:hAnsi="Wingdings" w:hint="default"/>
+        <w:sz w:val="20"/>
+      </w:rPr>
+    </w:lvl>
+    <w:lvl w:ilvl="4" w:tentative="1">
+      <w:start w:val="1"/>
+      <w:numFmt w:val="bullet"/>
+      <w:lvlText w:val=""/>
+      <w:lvlJc w:val="left"/>
+      <w:pPr>
+        <w:tabs>
+          <w:tab w:val="num" w:pos="3600"/>
+        </w:tabs>
+        <w:ind w:left="3600" w:hanging="360"/>
+      </w:pPr>
+      <w:rPr>
+        <w:rFonts w:ascii="Wingdings" w:hAnsi="Wingdings" w:hint="default"/>
+        <w:sz w:val="20"/>
+      </w:rPr>
+    </w:lvl>
+    <w:lvl w:ilvl="5" w:tentative="1">
+      <w:start w:val="1"/>
+      <w:numFmt w:val="bullet"/>
+      <w:lvlText w:val=""/>
+      <w:lvlJc w:val="left"/>
+      <w:pPr>
+        <w:tabs>
+          <w:tab w:val="num" w:pos="4320"/>
+        </w:tabs>
+        <w:ind w:left="4320" w:hanging="360"/>
+      </w:pPr>
+      <w:rPr>
+        <w:rFonts w:ascii="Wingdings" w:hAnsi="Wingdings" w:hint="default"/>
+        <w:sz w:val="20"/>
+      </w:rPr>
+    </w:lvl>
+    <w:lvl w:ilvl="6" w:tentative="1">
+      <w:start w:val="1"/>
+      <w:numFmt w:val="bullet"/>
+      <w:lvlText w:val=""/>
+      <w:lvlJc w:val="left"/>
+      <w:pPr>
+        <w:tabs>
+          <w:tab w:val="num" w:pos="5040"/>
+        </w:tabs>
+        <w:ind w:left="5040" w:hanging="360"/>
+      </w:pPr>
+      <w:rPr>
+        <w:rFonts w:ascii="Wingdings" w:hAnsi="Wingdings" w:hint="default"/>
+        <w:sz w:val="20"/>
+      </w:rPr>
+    </w:lvl>
+    <w:lvl w:ilvl="7" w:tentative="1">
+      <w:start w:val="1"/>
+      <w:numFmt w:val="bullet"/>
+      <w:lvlText w:val=""/>
+      <w:lvlJc w:val="left"/>
+      <w:pPr>
+        <w:tabs>
+          <w:tab w:val="num" w:pos="5760"/>
+        </w:tabs>
+        <w:ind w:left="5760" w:hanging="360"/>
+      </w:pPr>
+      <w:rPr>
+        <w:rFonts w:ascii="Wingdings" w:hAnsi="Wingdings" w:hint="default"/>
+        <w:sz w:val="20"/>
+      </w:rPr>
+    </w:lvl>
+    <w:lvl w:ilvl="8" w:tentative="1">
+      <w:start w:val="1"/>
+      <w:numFmt w:val="bullet"/>
+      <w:lvlText w:val=""/>
+      <w:lvlJc w:val="left"/>
+      <w:pPr>
+        <w:tabs>
+          <w:tab w:val="num" w:pos="6480"/>
+        </w:tabs>
+        <w:ind w:left="6480" w:hanging="360"/>
+      </w:pPr>
+      <w:rPr>
+        <w:rFonts w:ascii="Wingdings" w:hAnsi="Wingdings" w:hint="default"/>
+        <w:sz w:val="20"/>
+      </w:rPr>
+    </w:lvl>
+  </w:abstractNum>
+  <w:abstractNum w:abstractNumId="8" w15:restartNumberingAfterBreak="0">
     <w:nsid w:val="3FAA26B3"/>
     <w:multiLevelType w:val="multilevel"/>
     <w:tmpl w:val="A0206428"/>
@@ -2738,7 +6129,450 @@
       </w:pPr>
     </w:lvl>
   </w:abstractNum>
-  <w:abstractNum w:abstractNumId="5" w15:restartNumberingAfterBreak="0">
+  <w:abstractNum w:abstractNumId="9" w15:restartNumberingAfterBreak="0">
+    <w:nsid w:val="405006D8"/>
+    <w:multiLevelType w:val="multilevel"/>
+    <w:tmpl w:val="57222A90"/>
+    <w:lvl w:ilvl="0">
+      <w:start w:val="1"/>
+      <w:numFmt w:val="bullet"/>
+      <w:lvlText w:val=""/>
+      <w:lvlJc w:val="left"/>
+      <w:pPr>
+        <w:tabs>
+          <w:tab w:val="num" w:pos="720"/>
+        </w:tabs>
+        <w:ind w:left="720" w:hanging="360"/>
+      </w:pPr>
+      <w:rPr>
+        <w:rFonts w:ascii="Symbol" w:hAnsi="Symbol" w:hint="default"/>
+        <w:sz w:val="20"/>
+      </w:rPr>
+    </w:lvl>
+    <w:lvl w:ilvl="1" w:tentative="1">
+      <w:start w:val="1"/>
+      <w:numFmt w:val="bullet"/>
+      <w:lvlText w:val="o"/>
+      <w:lvlJc w:val="left"/>
+      <w:pPr>
+        <w:tabs>
+          <w:tab w:val="num" w:pos="1440"/>
+        </w:tabs>
+        <w:ind w:left="1440" w:hanging="360"/>
+      </w:pPr>
+      <w:rPr>
+        <w:rFonts w:ascii="Courier New" w:hAnsi="Courier New" w:hint="default"/>
+        <w:sz w:val="20"/>
+      </w:rPr>
+    </w:lvl>
+    <w:lvl w:ilvl="2" w:tentative="1">
+      <w:start w:val="1"/>
+      <w:numFmt w:val="bullet"/>
+      <w:lvlText w:val=""/>
+      <w:lvlJc w:val="left"/>
+      <w:pPr>
+        <w:tabs>
+          <w:tab w:val="num" w:pos="2160"/>
+        </w:tabs>
+        <w:ind w:left="2160" w:hanging="360"/>
+      </w:pPr>
+      <w:rPr>
+        <w:rFonts w:ascii="Wingdings" w:hAnsi="Wingdings" w:hint="default"/>
+        <w:sz w:val="20"/>
+      </w:rPr>
+    </w:lvl>
+    <w:lvl w:ilvl="3" w:tentative="1">
+      <w:start w:val="1"/>
+      <w:numFmt w:val="bullet"/>
+      <w:lvlText w:val=""/>
+      <w:lvlJc w:val="left"/>
+      <w:pPr>
+        <w:tabs>
+          <w:tab w:val="num" w:pos="2880"/>
+        </w:tabs>
+        <w:ind w:left="2880" w:hanging="360"/>
+      </w:pPr>
+      <w:rPr>
+        <w:rFonts w:ascii="Wingdings" w:hAnsi="Wingdings" w:hint="default"/>
+        <w:sz w:val="20"/>
+      </w:rPr>
+    </w:lvl>
+    <w:lvl w:ilvl="4" w:tentative="1">
+      <w:start w:val="1"/>
+      <w:numFmt w:val="bullet"/>
+      <w:lvlText w:val=""/>
+      <w:lvlJc w:val="left"/>
+      <w:pPr>
+        <w:tabs>
+          <w:tab w:val="num" w:pos="3600"/>
+        </w:tabs>
+        <w:ind w:left="3600" w:hanging="360"/>
+      </w:pPr>
+      <w:rPr>
+        <w:rFonts w:ascii="Wingdings" w:hAnsi="Wingdings" w:hint="default"/>
+        <w:sz w:val="20"/>
+      </w:rPr>
+    </w:lvl>
+    <w:lvl w:ilvl="5" w:tentative="1">
+      <w:start w:val="1"/>
+      <w:numFmt w:val="bullet"/>
+      <w:lvlText w:val=""/>
+      <w:lvlJc w:val="left"/>
+      <w:pPr>
+        <w:tabs>
+          <w:tab w:val="num" w:pos="4320"/>
+        </w:tabs>
+        <w:ind w:left="4320" w:hanging="360"/>
+      </w:pPr>
+      <w:rPr>
+        <w:rFonts w:ascii="Wingdings" w:hAnsi="Wingdings" w:hint="default"/>
+        <w:sz w:val="20"/>
+      </w:rPr>
+    </w:lvl>
+    <w:lvl w:ilvl="6" w:tentative="1">
+      <w:start w:val="1"/>
+      <w:numFmt w:val="bullet"/>
+      <w:lvlText w:val=""/>
+      <w:lvlJc w:val="left"/>
+      <w:pPr>
+        <w:tabs>
+          <w:tab w:val="num" w:pos="5040"/>
+        </w:tabs>
+        <w:ind w:left="5040" w:hanging="360"/>
+      </w:pPr>
+      <w:rPr>
+        <w:rFonts w:ascii="Wingdings" w:hAnsi="Wingdings" w:hint="default"/>
+        <w:sz w:val="20"/>
+      </w:rPr>
+    </w:lvl>
+    <w:lvl w:ilvl="7" w:tentative="1">
+      <w:start w:val="1"/>
+      <w:numFmt w:val="bullet"/>
+      <w:lvlText w:val=""/>
+      <w:lvlJc w:val="left"/>
+      <w:pPr>
+        <w:tabs>
+          <w:tab w:val="num" w:pos="5760"/>
+        </w:tabs>
+        <w:ind w:left="5760" w:hanging="360"/>
+      </w:pPr>
+      <w:rPr>
+        <w:rFonts w:ascii="Wingdings" w:hAnsi="Wingdings" w:hint="default"/>
+        <w:sz w:val="20"/>
+      </w:rPr>
+    </w:lvl>
+    <w:lvl w:ilvl="8" w:tentative="1">
+      <w:start w:val="1"/>
+      <w:numFmt w:val="bullet"/>
+      <w:lvlText w:val=""/>
+      <w:lvlJc w:val="left"/>
+      <w:pPr>
+        <w:tabs>
+          <w:tab w:val="num" w:pos="6480"/>
+        </w:tabs>
+        <w:ind w:left="6480" w:hanging="360"/>
+      </w:pPr>
+      <w:rPr>
+        <w:rFonts w:ascii="Wingdings" w:hAnsi="Wingdings" w:hint="default"/>
+        <w:sz w:val="20"/>
+      </w:rPr>
+    </w:lvl>
+  </w:abstractNum>
+  <w:abstractNum w:abstractNumId="10" w15:restartNumberingAfterBreak="0">
+    <w:nsid w:val="46765667"/>
+    <w:multiLevelType w:val="multilevel"/>
+    <w:tmpl w:val="E0547262"/>
+    <w:lvl w:ilvl="0">
+      <w:start w:val="1"/>
+      <w:numFmt w:val="bullet"/>
+      <w:lvlText w:val=""/>
+      <w:lvlJc w:val="left"/>
+      <w:pPr>
+        <w:tabs>
+          <w:tab w:val="num" w:pos="720"/>
+        </w:tabs>
+        <w:ind w:left="720" w:hanging="360"/>
+      </w:pPr>
+      <w:rPr>
+        <w:rFonts w:ascii="Symbol" w:hAnsi="Symbol" w:hint="default"/>
+        <w:sz w:val="20"/>
+      </w:rPr>
+    </w:lvl>
+    <w:lvl w:ilvl="1" w:tentative="1">
+      <w:start w:val="1"/>
+      <w:numFmt w:val="bullet"/>
+      <w:lvlText w:val="o"/>
+      <w:lvlJc w:val="left"/>
+      <w:pPr>
+        <w:tabs>
+          <w:tab w:val="num" w:pos="1440"/>
+        </w:tabs>
+        <w:ind w:left="1440" w:hanging="360"/>
+      </w:pPr>
+      <w:rPr>
+        <w:rFonts w:ascii="Courier New" w:hAnsi="Courier New" w:hint="default"/>
+        <w:sz w:val="20"/>
+      </w:rPr>
+    </w:lvl>
+    <w:lvl w:ilvl="2" w:tentative="1">
+      <w:start w:val="1"/>
+      <w:numFmt w:val="bullet"/>
+      <w:lvlText w:val=""/>
+      <w:lvlJc w:val="left"/>
+      <w:pPr>
+        <w:tabs>
+          <w:tab w:val="num" w:pos="2160"/>
+        </w:tabs>
+        <w:ind w:left="2160" w:hanging="360"/>
+      </w:pPr>
+      <w:rPr>
+        <w:rFonts w:ascii="Wingdings" w:hAnsi="Wingdings" w:hint="default"/>
+        <w:sz w:val="20"/>
+      </w:rPr>
+    </w:lvl>
+    <w:lvl w:ilvl="3" w:tentative="1">
+      <w:start w:val="1"/>
+      <w:numFmt w:val="bullet"/>
+      <w:lvlText w:val=""/>
+      <w:lvlJc w:val="left"/>
+      <w:pPr>
+        <w:tabs>
+          <w:tab w:val="num" w:pos="2880"/>
+        </w:tabs>
+        <w:ind w:left="2880" w:hanging="360"/>
+      </w:pPr>
+      <w:rPr>
+        <w:rFonts w:ascii="Wingdings" w:hAnsi="Wingdings" w:hint="default"/>
+        <w:sz w:val="20"/>
+      </w:rPr>
+    </w:lvl>
+    <w:lvl w:ilvl="4" w:tentative="1">
+      <w:start w:val="1"/>
+      <w:numFmt w:val="bullet"/>
+      <w:lvlText w:val=""/>
+      <w:lvlJc w:val="left"/>
+      <w:pPr>
+        <w:tabs>
+          <w:tab w:val="num" w:pos="3600"/>
+        </w:tabs>
+        <w:ind w:left="3600" w:hanging="360"/>
+      </w:pPr>
+      <w:rPr>
+        <w:rFonts w:ascii="Wingdings" w:hAnsi="Wingdings" w:hint="default"/>
+        <w:sz w:val="20"/>
+      </w:rPr>
+    </w:lvl>
+    <w:lvl w:ilvl="5" w:tentative="1">
+      <w:start w:val="1"/>
+      <w:numFmt w:val="bullet"/>
+      <w:lvlText w:val=""/>
+      <w:lvlJc w:val="left"/>
+      <w:pPr>
+        <w:tabs>
+          <w:tab w:val="num" w:pos="4320"/>
+        </w:tabs>
+        <w:ind w:left="4320" w:hanging="360"/>
+      </w:pPr>
+      <w:rPr>
+        <w:rFonts w:ascii="Wingdings" w:hAnsi="Wingdings" w:hint="default"/>
+        <w:sz w:val="20"/>
+      </w:rPr>
+    </w:lvl>
+    <w:lvl w:ilvl="6" w:tentative="1">
+      <w:start w:val="1"/>
+      <w:numFmt w:val="bullet"/>
+      <w:lvlText w:val=""/>
+      <w:lvlJc w:val="left"/>
+      <w:pPr>
+        <w:tabs>
+          <w:tab w:val="num" w:pos="5040"/>
+        </w:tabs>
+        <w:ind w:left="5040" w:hanging="360"/>
+      </w:pPr>
+      <w:rPr>
+        <w:rFonts w:ascii="Wingdings" w:hAnsi="Wingdings" w:hint="default"/>
+        <w:sz w:val="20"/>
+      </w:rPr>
+    </w:lvl>
+    <w:lvl w:ilvl="7" w:tentative="1">
+      <w:start w:val="1"/>
+      <w:numFmt w:val="bullet"/>
+      <w:lvlText w:val=""/>
+      <w:lvlJc w:val="left"/>
+      <w:pPr>
+        <w:tabs>
+          <w:tab w:val="num" w:pos="5760"/>
+        </w:tabs>
+        <w:ind w:left="5760" w:hanging="360"/>
+      </w:pPr>
+      <w:rPr>
+        <w:rFonts w:ascii="Wingdings" w:hAnsi="Wingdings" w:hint="default"/>
+        <w:sz w:val="20"/>
+      </w:rPr>
+    </w:lvl>
+    <w:lvl w:ilvl="8" w:tentative="1">
+      <w:start w:val="1"/>
+      <w:numFmt w:val="bullet"/>
+      <w:lvlText w:val=""/>
+      <w:lvlJc w:val="left"/>
+      <w:pPr>
+        <w:tabs>
+          <w:tab w:val="num" w:pos="6480"/>
+        </w:tabs>
+        <w:ind w:left="6480" w:hanging="360"/>
+      </w:pPr>
+      <w:rPr>
+        <w:rFonts w:ascii="Wingdings" w:hAnsi="Wingdings" w:hint="default"/>
+        <w:sz w:val="20"/>
+      </w:rPr>
+    </w:lvl>
+  </w:abstractNum>
+  <w:abstractNum w:abstractNumId="11" w15:restartNumberingAfterBreak="0">
+    <w:nsid w:val="48744AB6"/>
+    <w:multiLevelType w:val="multilevel"/>
+    <w:tmpl w:val="BBD434E0"/>
+    <w:lvl w:ilvl="0">
+      <w:start w:val="1"/>
+      <w:numFmt w:val="bullet"/>
+      <w:lvlText w:val=""/>
+      <w:lvlJc w:val="left"/>
+      <w:pPr>
+        <w:tabs>
+          <w:tab w:val="num" w:pos="720"/>
+        </w:tabs>
+        <w:ind w:left="720" w:hanging="360"/>
+      </w:pPr>
+      <w:rPr>
+        <w:rFonts w:ascii="Symbol" w:hAnsi="Symbol" w:hint="default"/>
+        <w:sz w:val="20"/>
+      </w:rPr>
+    </w:lvl>
+    <w:lvl w:ilvl="1">
+      <w:start w:val="1"/>
+      <w:numFmt w:val="decimal"/>
+      <w:lvlText w:val="%2."/>
+      <w:lvlJc w:val="left"/>
+      <w:pPr>
+        <w:tabs>
+          <w:tab w:val="num" w:pos="1440"/>
+        </w:tabs>
+        <w:ind w:left="1440" w:hanging="360"/>
+      </w:pPr>
+    </w:lvl>
+    <w:lvl w:ilvl="2" w:tentative="1">
+      <w:start w:val="1"/>
+      <w:numFmt w:val="bullet"/>
+      <w:lvlText w:val=""/>
+      <w:lvlJc w:val="left"/>
+      <w:pPr>
+        <w:tabs>
+          <w:tab w:val="num" w:pos="2160"/>
+        </w:tabs>
+        <w:ind w:left="2160" w:hanging="360"/>
+      </w:pPr>
+      <w:rPr>
+        <w:rFonts w:ascii="Wingdings" w:hAnsi="Wingdings" w:hint="default"/>
+        <w:sz w:val="20"/>
+      </w:rPr>
+    </w:lvl>
+    <w:lvl w:ilvl="3" w:tentative="1">
+      <w:start w:val="1"/>
+      <w:numFmt w:val="bullet"/>
+      <w:lvlText w:val=""/>
+      <w:lvlJc w:val="left"/>
+      <w:pPr>
+        <w:tabs>
+          <w:tab w:val="num" w:pos="2880"/>
+        </w:tabs>
+        <w:ind w:left="2880" w:hanging="360"/>
+      </w:pPr>
+      <w:rPr>
+        <w:rFonts w:ascii="Wingdings" w:hAnsi="Wingdings" w:hint="default"/>
+        <w:sz w:val="20"/>
+      </w:rPr>
+    </w:lvl>
+    <w:lvl w:ilvl="4" w:tentative="1">
+      <w:start w:val="1"/>
+      <w:numFmt w:val="bullet"/>
+      <w:lvlText w:val=""/>
+      <w:lvlJc w:val="left"/>
+      <w:pPr>
+        <w:tabs>
+          <w:tab w:val="num" w:pos="3600"/>
+        </w:tabs>
+        <w:ind w:left="3600" w:hanging="360"/>
+      </w:pPr>
+      <w:rPr>
+        <w:rFonts w:ascii="Wingdings" w:hAnsi="Wingdings" w:hint="default"/>
+        <w:sz w:val="20"/>
+      </w:rPr>
+    </w:lvl>
+    <w:lvl w:ilvl="5" w:tentative="1">
+      <w:start w:val="1"/>
+      <w:numFmt w:val="bullet"/>
+      <w:lvlText w:val=""/>
+      <w:lvlJc w:val="left"/>
+      <w:pPr>
+        <w:tabs>
+          <w:tab w:val="num" w:pos="4320"/>
+        </w:tabs>
+        <w:ind w:left="4320" w:hanging="360"/>
+      </w:pPr>
+      <w:rPr>
+        <w:rFonts w:ascii="Wingdings" w:hAnsi="Wingdings" w:hint="default"/>
+        <w:sz w:val="20"/>
+      </w:rPr>
+    </w:lvl>
+    <w:lvl w:ilvl="6" w:tentative="1">
+      <w:start w:val="1"/>
+      <w:numFmt w:val="bullet"/>
+      <w:lvlText w:val=""/>
+      <w:lvlJc w:val="left"/>
+      <w:pPr>
+        <w:tabs>
+          <w:tab w:val="num" w:pos="5040"/>
+        </w:tabs>
+        <w:ind w:left="5040" w:hanging="360"/>
+      </w:pPr>
+      <w:rPr>
+        <w:rFonts w:ascii="Wingdings" w:hAnsi="Wingdings" w:hint="default"/>
+        <w:sz w:val="20"/>
+      </w:rPr>
+    </w:lvl>
+    <w:lvl w:ilvl="7" w:tentative="1">
+      <w:start w:val="1"/>
+      <w:numFmt w:val="bullet"/>
+      <w:lvlText w:val=""/>
+      <w:lvlJc w:val="left"/>
+      <w:pPr>
+        <w:tabs>
+          <w:tab w:val="num" w:pos="5760"/>
+        </w:tabs>
+        <w:ind w:left="5760" w:hanging="360"/>
+      </w:pPr>
+      <w:rPr>
+        <w:rFonts w:ascii="Wingdings" w:hAnsi="Wingdings" w:hint="default"/>
+        <w:sz w:val="20"/>
+      </w:rPr>
+    </w:lvl>
+    <w:lvl w:ilvl="8" w:tentative="1">
+      <w:start w:val="1"/>
+      <w:numFmt w:val="bullet"/>
+      <w:lvlText w:val=""/>
+      <w:lvlJc w:val="left"/>
+      <w:pPr>
+        <w:tabs>
+          <w:tab w:val="num" w:pos="6480"/>
+        </w:tabs>
+        <w:ind w:left="6480" w:hanging="360"/>
+      </w:pPr>
+      <w:rPr>
+        <w:rFonts w:ascii="Wingdings" w:hAnsi="Wingdings" w:hint="default"/>
+        <w:sz w:val="20"/>
+      </w:rPr>
+    </w:lvl>
+  </w:abstractNum>
+  <w:abstractNum w:abstractNumId="12" w15:restartNumberingAfterBreak="0">
     <w:nsid w:val="4A3E61CF"/>
     <w:multiLevelType w:val="multilevel"/>
     <w:tmpl w:val="26A4D2CA"/>
@@ -2887,7 +6721,454 @@
       </w:rPr>
     </w:lvl>
   </w:abstractNum>
-  <w:abstractNum w:abstractNumId="6" w15:restartNumberingAfterBreak="0">
+  <w:abstractNum w:abstractNumId="13" w15:restartNumberingAfterBreak="0">
+    <w:nsid w:val="4D9D3B19"/>
+    <w:multiLevelType w:val="multilevel"/>
+    <w:tmpl w:val="CFDA7008"/>
+    <w:lvl w:ilvl="0">
+      <w:start w:val="1"/>
+      <w:numFmt w:val="bullet"/>
+      <w:lvlText w:val=""/>
+      <w:lvlJc w:val="left"/>
+      <w:pPr>
+        <w:tabs>
+          <w:tab w:val="num" w:pos="720"/>
+        </w:tabs>
+        <w:ind w:left="720" w:hanging="360"/>
+      </w:pPr>
+      <w:rPr>
+        <w:rFonts w:ascii="Symbol" w:hAnsi="Symbol" w:hint="default"/>
+        <w:sz w:val="20"/>
+      </w:rPr>
+    </w:lvl>
+    <w:lvl w:ilvl="1" w:tentative="1">
+      <w:start w:val="1"/>
+      <w:numFmt w:val="bullet"/>
+      <w:lvlText w:val="o"/>
+      <w:lvlJc w:val="left"/>
+      <w:pPr>
+        <w:tabs>
+          <w:tab w:val="num" w:pos="1440"/>
+        </w:tabs>
+        <w:ind w:left="1440" w:hanging="360"/>
+      </w:pPr>
+      <w:rPr>
+        <w:rFonts w:ascii="Courier New" w:hAnsi="Courier New" w:hint="default"/>
+        <w:sz w:val="20"/>
+      </w:rPr>
+    </w:lvl>
+    <w:lvl w:ilvl="2" w:tentative="1">
+      <w:start w:val="1"/>
+      <w:numFmt w:val="bullet"/>
+      <w:lvlText w:val=""/>
+      <w:lvlJc w:val="left"/>
+      <w:pPr>
+        <w:tabs>
+          <w:tab w:val="num" w:pos="2160"/>
+        </w:tabs>
+        <w:ind w:left="2160" w:hanging="360"/>
+      </w:pPr>
+      <w:rPr>
+        <w:rFonts w:ascii="Wingdings" w:hAnsi="Wingdings" w:hint="default"/>
+        <w:sz w:val="20"/>
+      </w:rPr>
+    </w:lvl>
+    <w:lvl w:ilvl="3" w:tentative="1">
+      <w:start w:val="1"/>
+      <w:numFmt w:val="bullet"/>
+      <w:lvlText w:val=""/>
+      <w:lvlJc w:val="left"/>
+      <w:pPr>
+        <w:tabs>
+          <w:tab w:val="num" w:pos="2880"/>
+        </w:tabs>
+        <w:ind w:left="2880" w:hanging="360"/>
+      </w:pPr>
+      <w:rPr>
+        <w:rFonts w:ascii="Wingdings" w:hAnsi="Wingdings" w:hint="default"/>
+        <w:sz w:val="20"/>
+      </w:rPr>
+    </w:lvl>
+    <w:lvl w:ilvl="4" w:tentative="1">
+      <w:start w:val="1"/>
+      <w:numFmt w:val="bullet"/>
+      <w:lvlText w:val=""/>
+      <w:lvlJc w:val="left"/>
+      <w:pPr>
+        <w:tabs>
+          <w:tab w:val="num" w:pos="3600"/>
+        </w:tabs>
+        <w:ind w:left="3600" w:hanging="360"/>
+      </w:pPr>
+      <w:rPr>
+        <w:rFonts w:ascii="Wingdings" w:hAnsi="Wingdings" w:hint="default"/>
+        <w:sz w:val="20"/>
+      </w:rPr>
+    </w:lvl>
+    <w:lvl w:ilvl="5" w:tentative="1">
+      <w:start w:val="1"/>
+      <w:numFmt w:val="bullet"/>
+      <w:lvlText w:val=""/>
+      <w:lvlJc w:val="left"/>
+      <w:pPr>
+        <w:tabs>
+          <w:tab w:val="num" w:pos="4320"/>
+        </w:tabs>
+        <w:ind w:left="4320" w:hanging="360"/>
+      </w:pPr>
+      <w:rPr>
+        <w:rFonts w:ascii="Wingdings" w:hAnsi="Wingdings" w:hint="default"/>
+        <w:sz w:val="20"/>
+      </w:rPr>
+    </w:lvl>
+    <w:lvl w:ilvl="6" w:tentative="1">
+      <w:start w:val="1"/>
+      <w:numFmt w:val="bullet"/>
+      <w:lvlText w:val=""/>
+      <w:lvlJc w:val="left"/>
+      <w:pPr>
+        <w:tabs>
+          <w:tab w:val="num" w:pos="5040"/>
+        </w:tabs>
+        <w:ind w:left="5040" w:hanging="360"/>
+      </w:pPr>
+      <w:rPr>
+        <w:rFonts w:ascii="Wingdings" w:hAnsi="Wingdings" w:hint="default"/>
+        <w:sz w:val="20"/>
+      </w:rPr>
+    </w:lvl>
+    <w:lvl w:ilvl="7" w:tentative="1">
+      <w:start w:val="1"/>
+      <w:numFmt w:val="bullet"/>
+      <w:lvlText w:val=""/>
+      <w:lvlJc w:val="left"/>
+      <w:pPr>
+        <w:tabs>
+          <w:tab w:val="num" w:pos="5760"/>
+        </w:tabs>
+        <w:ind w:left="5760" w:hanging="360"/>
+      </w:pPr>
+      <w:rPr>
+        <w:rFonts w:ascii="Wingdings" w:hAnsi="Wingdings" w:hint="default"/>
+        <w:sz w:val="20"/>
+      </w:rPr>
+    </w:lvl>
+    <w:lvl w:ilvl="8" w:tentative="1">
+      <w:start w:val="1"/>
+      <w:numFmt w:val="bullet"/>
+      <w:lvlText w:val=""/>
+      <w:lvlJc w:val="left"/>
+      <w:pPr>
+        <w:tabs>
+          <w:tab w:val="num" w:pos="6480"/>
+        </w:tabs>
+        <w:ind w:left="6480" w:hanging="360"/>
+      </w:pPr>
+      <w:rPr>
+        <w:rFonts w:ascii="Wingdings" w:hAnsi="Wingdings" w:hint="default"/>
+        <w:sz w:val="20"/>
+      </w:rPr>
+    </w:lvl>
+  </w:abstractNum>
+  <w:abstractNum w:abstractNumId="14" w15:restartNumberingAfterBreak="0">
+    <w:nsid w:val="6B4E5BD2"/>
+    <w:multiLevelType w:val="multilevel"/>
+    <w:tmpl w:val="8F86ADAE"/>
+    <w:lvl w:ilvl="0">
+      <w:start w:val="1"/>
+      <w:numFmt w:val="bullet"/>
+      <w:lvlText w:val=""/>
+      <w:lvlJc w:val="left"/>
+      <w:pPr>
+        <w:tabs>
+          <w:tab w:val="num" w:pos="720"/>
+        </w:tabs>
+        <w:ind w:left="720" w:hanging="360"/>
+      </w:pPr>
+      <w:rPr>
+        <w:rFonts w:ascii="Symbol" w:hAnsi="Symbol" w:hint="default"/>
+        <w:sz w:val="20"/>
+      </w:rPr>
+    </w:lvl>
+    <w:lvl w:ilvl="1" w:tentative="1">
+      <w:start w:val="1"/>
+      <w:numFmt w:val="bullet"/>
+      <w:lvlText w:val="o"/>
+      <w:lvlJc w:val="left"/>
+      <w:pPr>
+        <w:tabs>
+          <w:tab w:val="num" w:pos="1440"/>
+        </w:tabs>
+        <w:ind w:left="1440" w:hanging="360"/>
+      </w:pPr>
+      <w:rPr>
+        <w:rFonts w:ascii="Courier New" w:hAnsi="Courier New" w:hint="default"/>
+        <w:sz w:val="20"/>
+      </w:rPr>
+    </w:lvl>
+    <w:lvl w:ilvl="2" w:tentative="1">
+      <w:start w:val="1"/>
+      <w:numFmt w:val="bullet"/>
+      <w:lvlText w:val=""/>
+      <w:lvlJc w:val="left"/>
+      <w:pPr>
+        <w:tabs>
+          <w:tab w:val="num" w:pos="2160"/>
+        </w:tabs>
+        <w:ind w:left="2160" w:hanging="360"/>
+      </w:pPr>
+      <w:rPr>
+        <w:rFonts w:ascii="Wingdings" w:hAnsi="Wingdings" w:hint="default"/>
+        <w:sz w:val="20"/>
+      </w:rPr>
+    </w:lvl>
+    <w:lvl w:ilvl="3" w:tentative="1">
+      <w:start w:val="1"/>
+      <w:numFmt w:val="bullet"/>
+      <w:lvlText w:val=""/>
+      <w:lvlJc w:val="left"/>
+      <w:pPr>
+        <w:tabs>
+          <w:tab w:val="num" w:pos="2880"/>
+        </w:tabs>
+        <w:ind w:left="2880" w:hanging="360"/>
+      </w:pPr>
+      <w:rPr>
+        <w:rFonts w:ascii="Wingdings" w:hAnsi="Wingdings" w:hint="default"/>
+        <w:sz w:val="20"/>
+      </w:rPr>
+    </w:lvl>
+    <w:lvl w:ilvl="4" w:tentative="1">
+      <w:start w:val="1"/>
+      <w:numFmt w:val="bullet"/>
+      <w:lvlText w:val=""/>
+      <w:lvlJc w:val="left"/>
+      <w:pPr>
+        <w:tabs>
+          <w:tab w:val="num" w:pos="3600"/>
+        </w:tabs>
+        <w:ind w:left="3600" w:hanging="360"/>
+      </w:pPr>
+      <w:rPr>
+        <w:rFonts w:ascii="Wingdings" w:hAnsi="Wingdings" w:hint="default"/>
+        <w:sz w:val="20"/>
+      </w:rPr>
+    </w:lvl>
+    <w:lvl w:ilvl="5" w:tentative="1">
+      <w:start w:val="1"/>
+      <w:numFmt w:val="bullet"/>
+      <w:lvlText w:val=""/>
+      <w:lvlJc w:val="left"/>
+      <w:pPr>
+        <w:tabs>
+          <w:tab w:val="num" w:pos="4320"/>
+        </w:tabs>
+        <w:ind w:left="4320" w:hanging="360"/>
+      </w:pPr>
+      <w:rPr>
+        <w:rFonts w:ascii="Wingdings" w:hAnsi="Wingdings" w:hint="default"/>
+        <w:sz w:val="20"/>
+      </w:rPr>
+    </w:lvl>
+    <w:lvl w:ilvl="6" w:tentative="1">
+      <w:start w:val="1"/>
+      <w:numFmt w:val="bullet"/>
+      <w:lvlText w:val=""/>
+      <w:lvlJc w:val="left"/>
+      <w:pPr>
+        <w:tabs>
+          <w:tab w:val="num" w:pos="5040"/>
+        </w:tabs>
+        <w:ind w:left="5040" w:hanging="360"/>
+      </w:pPr>
+      <w:rPr>
+        <w:rFonts w:ascii="Wingdings" w:hAnsi="Wingdings" w:hint="default"/>
+        <w:sz w:val="20"/>
+      </w:rPr>
+    </w:lvl>
+    <w:lvl w:ilvl="7" w:tentative="1">
+      <w:start w:val="1"/>
+      <w:numFmt w:val="bullet"/>
+      <w:lvlText w:val=""/>
+      <w:lvlJc w:val="left"/>
+      <w:pPr>
+        <w:tabs>
+          <w:tab w:val="num" w:pos="5760"/>
+        </w:tabs>
+        <w:ind w:left="5760" w:hanging="360"/>
+      </w:pPr>
+      <w:rPr>
+        <w:rFonts w:ascii="Wingdings" w:hAnsi="Wingdings" w:hint="default"/>
+        <w:sz w:val="20"/>
+      </w:rPr>
+    </w:lvl>
+    <w:lvl w:ilvl="8" w:tentative="1">
+      <w:start w:val="1"/>
+      <w:numFmt w:val="bullet"/>
+      <w:lvlText w:val=""/>
+      <w:lvlJc w:val="left"/>
+      <w:pPr>
+        <w:tabs>
+          <w:tab w:val="num" w:pos="6480"/>
+        </w:tabs>
+        <w:ind w:left="6480" w:hanging="360"/>
+      </w:pPr>
+      <w:rPr>
+        <w:rFonts w:ascii="Wingdings" w:hAnsi="Wingdings" w:hint="default"/>
+        <w:sz w:val="20"/>
+      </w:rPr>
+    </w:lvl>
+  </w:abstractNum>
+  <w:abstractNum w:abstractNumId="15" w15:restartNumberingAfterBreak="0">
+    <w:nsid w:val="6D675446"/>
+    <w:multiLevelType w:val="multilevel"/>
+    <w:tmpl w:val="834EDBCA"/>
+    <w:lvl w:ilvl="0">
+      <w:start w:val="1"/>
+      <w:numFmt w:val="bullet"/>
+      <w:lvlText w:val=""/>
+      <w:lvlJc w:val="left"/>
+      <w:pPr>
+        <w:tabs>
+          <w:tab w:val="num" w:pos="720"/>
+        </w:tabs>
+        <w:ind w:left="720" w:hanging="360"/>
+      </w:pPr>
+      <w:rPr>
+        <w:rFonts w:ascii="Symbol" w:hAnsi="Symbol" w:hint="default"/>
+        <w:sz w:val="20"/>
+      </w:rPr>
+    </w:lvl>
+    <w:lvl w:ilvl="1">
+      <w:start w:val="1"/>
+      <w:numFmt w:val="bullet"/>
+      <w:lvlText w:val="o"/>
+      <w:lvlJc w:val="left"/>
+      <w:pPr>
+        <w:tabs>
+          <w:tab w:val="num" w:pos="1440"/>
+        </w:tabs>
+        <w:ind w:left="1440" w:hanging="360"/>
+      </w:pPr>
+      <w:rPr>
+        <w:rFonts w:ascii="Courier New" w:hAnsi="Courier New" w:hint="default"/>
+        <w:sz w:val="20"/>
+      </w:rPr>
+    </w:lvl>
+    <w:lvl w:ilvl="2" w:tentative="1">
+      <w:start w:val="1"/>
+      <w:numFmt w:val="bullet"/>
+      <w:lvlText w:val=""/>
+      <w:lvlJc w:val="left"/>
+      <w:pPr>
+        <w:tabs>
+          <w:tab w:val="num" w:pos="2160"/>
+        </w:tabs>
+        <w:ind w:left="2160" w:hanging="360"/>
+      </w:pPr>
+      <w:rPr>
+        <w:rFonts w:ascii="Wingdings" w:hAnsi="Wingdings" w:hint="default"/>
+        <w:sz w:val="20"/>
+      </w:rPr>
+    </w:lvl>
+    <w:lvl w:ilvl="3" w:tentative="1">
+      <w:start w:val="1"/>
+      <w:numFmt w:val="bullet"/>
+      <w:lvlText w:val=""/>
+      <w:lvlJc w:val="left"/>
+      <w:pPr>
+        <w:tabs>
+          <w:tab w:val="num" w:pos="2880"/>
+        </w:tabs>
+        <w:ind w:left="2880" w:hanging="360"/>
+      </w:pPr>
+      <w:rPr>
+        <w:rFonts w:ascii="Wingdings" w:hAnsi="Wingdings" w:hint="default"/>
+        <w:sz w:val="20"/>
+      </w:rPr>
+    </w:lvl>
+    <w:lvl w:ilvl="4" w:tentative="1">
+      <w:start w:val="1"/>
+      <w:numFmt w:val="bullet"/>
+      <w:lvlText w:val=""/>
+      <w:lvlJc w:val="left"/>
+      <w:pPr>
+        <w:tabs>
+          <w:tab w:val="num" w:pos="3600"/>
+        </w:tabs>
+        <w:ind w:left="3600" w:hanging="360"/>
+      </w:pPr>
+      <w:rPr>
+        <w:rFonts w:ascii="Wingdings" w:hAnsi="Wingdings" w:hint="default"/>
+        <w:sz w:val="20"/>
+      </w:rPr>
+    </w:lvl>
+    <w:lvl w:ilvl="5" w:tentative="1">
+      <w:start w:val="1"/>
+      <w:numFmt w:val="bullet"/>
+      <w:lvlText w:val=""/>
+      <w:lvlJc w:val="left"/>
+      <w:pPr>
+        <w:tabs>
+          <w:tab w:val="num" w:pos="4320"/>
+        </w:tabs>
+        <w:ind w:left="4320" w:hanging="360"/>
+      </w:pPr>
+      <w:rPr>
+        <w:rFonts w:ascii="Wingdings" w:hAnsi="Wingdings" w:hint="default"/>
+        <w:sz w:val="20"/>
+      </w:rPr>
+    </w:lvl>
+    <w:lvl w:ilvl="6" w:tentative="1">
+      <w:start w:val="1"/>
+      <w:numFmt w:val="bullet"/>
+      <w:lvlText w:val=""/>
+      <w:lvlJc w:val="left"/>
+      <w:pPr>
+        <w:tabs>
+          <w:tab w:val="num" w:pos="5040"/>
+        </w:tabs>
+        <w:ind w:left="5040" w:hanging="360"/>
+      </w:pPr>
+      <w:rPr>
+        <w:rFonts w:ascii="Wingdings" w:hAnsi="Wingdings" w:hint="default"/>
+        <w:sz w:val="20"/>
+      </w:rPr>
+    </w:lvl>
+    <w:lvl w:ilvl="7" w:tentative="1">
+      <w:start w:val="1"/>
+      <w:numFmt w:val="bullet"/>
+      <w:lvlText w:val=""/>
+      <w:lvlJc w:val="left"/>
+      <w:pPr>
+        <w:tabs>
+          <w:tab w:val="num" w:pos="5760"/>
+        </w:tabs>
+        <w:ind w:left="5760" w:hanging="360"/>
+      </w:pPr>
+      <w:rPr>
+        <w:rFonts w:ascii="Wingdings" w:hAnsi="Wingdings" w:hint="default"/>
+        <w:sz w:val="20"/>
+      </w:rPr>
+    </w:lvl>
+    <w:lvl w:ilvl="8" w:tentative="1">
+      <w:start w:val="1"/>
+      <w:numFmt w:val="bullet"/>
+      <w:lvlText w:val=""/>
+      <w:lvlJc w:val="left"/>
+      <w:pPr>
+        <w:tabs>
+          <w:tab w:val="num" w:pos="6480"/>
+        </w:tabs>
+        <w:ind w:left="6480" w:hanging="360"/>
+      </w:pPr>
+      <w:rPr>
+        <w:rFonts w:ascii="Wingdings" w:hAnsi="Wingdings" w:hint="default"/>
+        <w:sz w:val="20"/>
+      </w:rPr>
+    </w:lvl>
+  </w:abstractNum>
+  <w:abstractNum w:abstractNumId="16" w15:restartNumberingAfterBreak="0">
     <w:nsid w:val="73EB4722"/>
     <w:multiLevelType w:val="multilevel"/>
     <w:tmpl w:val="5F14FFBE"/>
@@ -3036,7 +7317,7 @@
       </w:rPr>
     </w:lvl>
   </w:abstractNum>
-  <w:abstractNum w:abstractNumId="7" w15:restartNumberingAfterBreak="0">
+  <w:abstractNum w:abstractNumId="17" w15:restartNumberingAfterBreak="0">
     <w:nsid w:val="7E7F1F59"/>
     <w:multiLevelType w:val="multilevel"/>
     <w:tmpl w:val="80B29E38"/>
@@ -3185,7 +7466,7 @@
       </w:rPr>
     </w:lvl>
   </w:abstractNum>
-  <w:abstractNum w:abstractNumId="8" w15:restartNumberingAfterBreak="0">
+  <w:abstractNum w:abstractNumId="18" w15:restartNumberingAfterBreak="0">
     <w:nsid w:val="7F274C0E"/>
     <w:multiLevelType w:val="multilevel"/>
     <w:tmpl w:val="D8665B86"/>
@@ -3334,32 +7615,214 @@
       </w:rPr>
     </w:lvl>
   </w:abstractNum>
+  <w:abstractNum w:abstractNumId="19" w15:restartNumberingAfterBreak="0">
+    <w:nsid w:val="7F8F6D96"/>
+    <w:multiLevelType w:val="multilevel"/>
+    <w:tmpl w:val="D668F702"/>
+    <w:lvl w:ilvl="0">
+      <w:start w:val="1"/>
+      <w:numFmt w:val="bullet"/>
+      <w:lvlText w:val=""/>
+      <w:lvlJc w:val="left"/>
+      <w:pPr>
+        <w:tabs>
+          <w:tab w:val="num" w:pos="720"/>
+        </w:tabs>
+        <w:ind w:left="720" w:hanging="360"/>
+      </w:pPr>
+      <w:rPr>
+        <w:rFonts w:ascii="Symbol" w:hAnsi="Symbol" w:hint="default"/>
+        <w:sz w:val="20"/>
+      </w:rPr>
+    </w:lvl>
+    <w:lvl w:ilvl="1" w:tentative="1">
+      <w:start w:val="1"/>
+      <w:numFmt w:val="bullet"/>
+      <w:lvlText w:val="o"/>
+      <w:lvlJc w:val="left"/>
+      <w:pPr>
+        <w:tabs>
+          <w:tab w:val="num" w:pos="1440"/>
+        </w:tabs>
+        <w:ind w:left="1440" w:hanging="360"/>
+      </w:pPr>
+      <w:rPr>
+        <w:rFonts w:ascii="Courier New" w:hAnsi="Courier New" w:hint="default"/>
+        <w:sz w:val="20"/>
+      </w:rPr>
+    </w:lvl>
+    <w:lvl w:ilvl="2" w:tentative="1">
+      <w:start w:val="1"/>
+      <w:numFmt w:val="bullet"/>
+      <w:lvlText w:val=""/>
+      <w:lvlJc w:val="left"/>
+      <w:pPr>
+        <w:tabs>
+          <w:tab w:val="num" w:pos="2160"/>
+        </w:tabs>
+        <w:ind w:left="2160" w:hanging="360"/>
+      </w:pPr>
+      <w:rPr>
+        <w:rFonts w:ascii="Wingdings" w:hAnsi="Wingdings" w:hint="default"/>
+        <w:sz w:val="20"/>
+      </w:rPr>
+    </w:lvl>
+    <w:lvl w:ilvl="3" w:tentative="1">
+      <w:start w:val="1"/>
+      <w:numFmt w:val="bullet"/>
+      <w:lvlText w:val=""/>
+      <w:lvlJc w:val="left"/>
+      <w:pPr>
+        <w:tabs>
+          <w:tab w:val="num" w:pos="2880"/>
+        </w:tabs>
+        <w:ind w:left="2880" w:hanging="360"/>
+      </w:pPr>
+      <w:rPr>
+        <w:rFonts w:ascii="Wingdings" w:hAnsi="Wingdings" w:hint="default"/>
+        <w:sz w:val="20"/>
+      </w:rPr>
+    </w:lvl>
+    <w:lvl w:ilvl="4" w:tentative="1">
+      <w:start w:val="1"/>
+      <w:numFmt w:val="bullet"/>
+      <w:lvlText w:val=""/>
+      <w:lvlJc w:val="left"/>
+      <w:pPr>
+        <w:tabs>
+          <w:tab w:val="num" w:pos="3600"/>
+        </w:tabs>
+        <w:ind w:left="3600" w:hanging="360"/>
+      </w:pPr>
+      <w:rPr>
+        <w:rFonts w:ascii="Wingdings" w:hAnsi="Wingdings" w:hint="default"/>
+        <w:sz w:val="20"/>
+      </w:rPr>
+    </w:lvl>
+    <w:lvl w:ilvl="5" w:tentative="1">
+      <w:start w:val="1"/>
+      <w:numFmt w:val="bullet"/>
+      <w:lvlText w:val=""/>
+      <w:lvlJc w:val="left"/>
+      <w:pPr>
+        <w:tabs>
+          <w:tab w:val="num" w:pos="4320"/>
+        </w:tabs>
+        <w:ind w:left="4320" w:hanging="360"/>
+      </w:pPr>
+      <w:rPr>
+        <w:rFonts w:ascii="Wingdings" w:hAnsi="Wingdings" w:hint="default"/>
+        <w:sz w:val="20"/>
+      </w:rPr>
+    </w:lvl>
+    <w:lvl w:ilvl="6" w:tentative="1">
+      <w:start w:val="1"/>
+      <w:numFmt w:val="bullet"/>
+      <w:lvlText w:val=""/>
+      <w:lvlJc w:val="left"/>
+      <w:pPr>
+        <w:tabs>
+          <w:tab w:val="num" w:pos="5040"/>
+        </w:tabs>
+        <w:ind w:left="5040" w:hanging="360"/>
+      </w:pPr>
+      <w:rPr>
+        <w:rFonts w:ascii="Wingdings" w:hAnsi="Wingdings" w:hint="default"/>
+        <w:sz w:val="20"/>
+      </w:rPr>
+    </w:lvl>
+    <w:lvl w:ilvl="7" w:tentative="1">
+      <w:start w:val="1"/>
+      <w:numFmt w:val="bullet"/>
+      <w:lvlText w:val=""/>
+      <w:lvlJc w:val="left"/>
+      <w:pPr>
+        <w:tabs>
+          <w:tab w:val="num" w:pos="5760"/>
+        </w:tabs>
+        <w:ind w:left="5760" w:hanging="360"/>
+      </w:pPr>
+      <w:rPr>
+        <w:rFonts w:ascii="Wingdings" w:hAnsi="Wingdings" w:hint="default"/>
+        <w:sz w:val="20"/>
+      </w:rPr>
+    </w:lvl>
+    <w:lvl w:ilvl="8" w:tentative="1">
+      <w:start w:val="1"/>
+      <w:numFmt w:val="bullet"/>
+      <w:lvlText w:val=""/>
+      <w:lvlJc w:val="left"/>
+      <w:pPr>
+        <w:tabs>
+          <w:tab w:val="num" w:pos="6480"/>
+        </w:tabs>
+        <w:ind w:left="6480" w:hanging="360"/>
+      </w:pPr>
+      <w:rPr>
+        <w:rFonts w:ascii="Wingdings" w:hAnsi="Wingdings" w:hint="default"/>
+        <w:sz w:val="20"/>
+      </w:rPr>
+    </w:lvl>
+  </w:abstractNum>
   <w:num w:numId="1" w16cid:durableId="1790664698">
+    <w:abstractNumId w:val="16"/>
+  </w:num>
+  <w:num w:numId="2" w16cid:durableId="913315237">
     <w:abstractNumId w:val="6"/>
   </w:num>
-  <w:num w:numId="2" w16cid:durableId="913315237">
-    <w:abstractNumId w:val="3"/>
-  </w:num>
   <w:num w:numId="3" w16cid:durableId="1592666586">
-    <w:abstractNumId w:val="8"/>
+    <w:abstractNumId w:val="18"/>
   </w:num>
   <w:num w:numId="4" w16cid:durableId="510418239">
-    <w:abstractNumId w:val="5"/>
+    <w:abstractNumId w:val="12"/>
   </w:num>
   <w:num w:numId="5" w16cid:durableId="680550783">
-    <w:abstractNumId w:val="7"/>
+    <w:abstractNumId w:val="17"/>
   </w:num>
   <w:num w:numId="6" w16cid:durableId="285746792">
-    <w:abstractNumId w:val="2"/>
+    <w:abstractNumId w:val="4"/>
   </w:num>
   <w:num w:numId="7" w16cid:durableId="1338732938">
-    <w:abstractNumId w:val="1"/>
+    <w:abstractNumId w:val="3"/>
   </w:num>
   <w:num w:numId="8" w16cid:durableId="162361005">
     <w:abstractNumId w:val="0"/>
   </w:num>
   <w:num w:numId="9" w16cid:durableId="1501001245">
-    <w:abstractNumId w:val="4"/>
+    <w:abstractNumId w:val="8"/>
+  </w:num>
+  <w:num w:numId="10" w16cid:durableId="1706250928">
+    <w:abstractNumId w:val="11"/>
+  </w:num>
+  <w:num w:numId="11" w16cid:durableId="1292050097">
+    <w:abstractNumId w:val="14"/>
+  </w:num>
+  <w:num w:numId="12" w16cid:durableId="1745948958">
+    <w:abstractNumId w:val="2"/>
+  </w:num>
+  <w:num w:numId="13" w16cid:durableId="679312742">
+    <w:abstractNumId w:val="15"/>
+  </w:num>
+  <w:num w:numId="14" w16cid:durableId="1597860147">
+    <w:abstractNumId w:val="19"/>
+  </w:num>
+  <w:num w:numId="15" w16cid:durableId="2042434571">
+    <w:abstractNumId w:val="7"/>
+  </w:num>
+  <w:num w:numId="16" w16cid:durableId="1867019793">
+    <w:abstractNumId w:val="5"/>
+  </w:num>
+  <w:num w:numId="17" w16cid:durableId="839076169">
+    <w:abstractNumId w:val="9"/>
+  </w:num>
+  <w:num w:numId="18" w16cid:durableId="1218131698">
+    <w:abstractNumId w:val="10"/>
+  </w:num>
+  <w:num w:numId="19" w16cid:durableId="213657393">
+    <w:abstractNumId w:val="1"/>
+  </w:num>
+  <w:num w:numId="20" w16cid:durableId="630095303">
+    <w:abstractNumId w:val="13"/>
   </w:num>
 </w:numbering>
 </file>

</xml_diff>

<commit_message>
nested loop in python
</commit_message>
<xml_diff>
--- a/notes.docx
+++ b/notes.docx
@@ -38576,6 +38576,3396 @@
         </w:rPr>
       </w:pPr>
     </w:p>
+    <w:p>
+      <w:pPr>
+        <w:rPr>
+          <w:sz w:val="28"/>
+          <w:szCs w:val="28"/>
+        </w:rPr>
+      </w:pPr>
+    </w:p>
+    <w:p>
+      <w:pPr>
+        <w:rPr>
+          <w:sz w:val="28"/>
+          <w:szCs w:val="28"/>
+        </w:rPr>
+      </w:pPr>
+    </w:p>
+    <w:p>
+      <w:pPr>
+        <w:rPr>
+          <w:b/>
+          <w:bCs/>
+          <w:sz w:val="36"/>
+          <w:szCs w:val="36"/>
+        </w:rPr>
+      </w:pPr>
+      <w:r>
+        <w:rPr>
+          <w:rFonts w:ascii="Segoe UI Emoji" w:hAnsi="Segoe UI Emoji" w:cs="Segoe UI Emoji"/>
+          <w:b/>
+          <w:bCs/>
+          <w:sz w:val="36"/>
+          <w:szCs w:val="36"/>
+        </w:rPr>
+        <w:t>📌</w:t>
+      </w:r>
+      <w:r>
+        <w:rPr>
+          <w:b/>
+          <w:bCs/>
+          <w:sz w:val="36"/>
+          <w:szCs w:val="36"/>
+        </w:rPr>
+        <w:t xml:space="preserve"> </w:t>
+      </w:r>
+      <w:r>
+        <w:rPr>
+          <w:b/>
+          <w:bCs/>
+          <w:color w:val="EE0000"/>
+          <w:sz w:val="36"/>
+          <w:szCs w:val="36"/>
+        </w:rPr>
+        <w:t>NOTES: Nested Loops in Python</w:t>
+      </w:r>
+    </w:p>
+    <w:p>
+      <w:pPr>
+        <w:rPr>
+          <w:b/>
+          <w:bCs/>
+          <w:sz w:val="28"/>
+          <w:szCs w:val="28"/>
+        </w:rPr>
+      </w:pPr>
+      <w:r>
+        <w:rPr>
+          <w:b/>
+          <w:bCs/>
+          <w:sz w:val="28"/>
+          <w:szCs w:val="28"/>
+        </w:rPr>
+        <w:t>1. What is a Nested Loop? (Definition)</w:t>
+      </w:r>
+    </w:p>
+    <w:p>
+      <w:pPr>
+        <w:rPr>
+          <w:sz w:val="28"/>
+          <w:szCs w:val="28"/>
+        </w:rPr>
+      </w:pPr>
+      <w:r>
+        <w:rPr>
+          <w:sz w:val="28"/>
+          <w:szCs w:val="28"/>
+        </w:rPr>
+        <w:t xml:space="preserve">Jab </w:t>
+      </w:r>
+      <w:r>
+        <w:rPr>
+          <w:b/>
+          <w:bCs/>
+          <w:sz w:val="28"/>
+          <w:szCs w:val="28"/>
+        </w:rPr>
+        <w:t xml:space="preserve">ek loop </w:t>
+      </w:r>
+      <w:proofErr w:type="spellStart"/>
+      <w:r>
+        <w:rPr>
+          <w:b/>
+          <w:bCs/>
+          <w:sz w:val="28"/>
+          <w:szCs w:val="28"/>
+        </w:rPr>
+        <w:t>ke</w:t>
+      </w:r>
+      <w:proofErr w:type="spellEnd"/>
+      <w:r>
+        <w:rPr>
+          <w:b/>
+          <w:bCs/>
+          <w:sz w:val="28"/>
+          <w:szCs w:val="28"/>
+        </w:rPr>
+        <w:t xml:space="preserve"> </w:t>
+      </w:r>
+      <w:proofErr w:type="spellStart"/>
+      <w:r>
+        <w:rPr>
+          <w:b/>
+          <w:bCs/>
+          <w:sz w:val="28"/>
+          <w:szCs w:val="28"/>
+        </w:rPr>
+        <w:t>andar</w:t>
+      </w:r>
+      <w:proofErr w:type="spellEnd"/>
+      <w:r>
+        <w:rPr>
+          <w:b/>
+          <w:bCs/>
+          <w:sz w:val="28"/>
+          <w:szCs w:val="28"/>
+        </w:rPr>
+        <w:t xml:space="preserve"> doosra loop</w:t>
+      </w:r>
+      <w:r>
+        <w:rPr>
+          <w:sz w:val="28"/>
+          <w:szCs w:val="28"/>
+        </w:rPr>
+        <w:t xml:space="preserve"> </w:t>
+      </w:r>
+      <w:proofErr w:type="spellStart"/>
+      <w:r>
+        <w:rPr>
+          <w:sz w:val="28"/>
+          <w:szCs w:val="28"/>
+        </w:rPr>
+        <w:t>likha</w:t>
+      </w:r>
+      <w:proofErr w:type="spellEnd"/>
+      <w:r>
+        <w:rPr>
+          <w:sz w:val="28"/>
+          <w:szCs w:val="28"/>
+        </w:rPr>
+        <w:t xml:space="preserve"> </w:t>
+      </w:r>
+      <w:proofErr w:type="spellStart"/>
+      <w:r>
+        <w:rPr>
+          <w:sz w:val="28"/>
+          <w:szCs w:val="28"/>
+        </w:rPr>
+        <w:t>jata</w:t>
+      </w:r>
+      <w:proofErr w:type="spellEnd"/>
+      <w:r>
+        <w:rPr>
+          <w:sz w:val="28"/>
+          <w:szCs w:val="28"/>
+        </w:rPr>
+        <w:t xml:space="preserve"> </w:t>
+      </w:r>
+      <w:proofErr w:type="spellStart"/>
+      <w:r>
+        <w:rPr>
+          <w:sz w:val="28"/>
+          <w:szCs w:val="28"/>
+        </w:rPr>
+        <w:t>hai</w:t>
+      </w:r>
+      <w:proofErr w:type="spellEnd"/>
+      <w:r>
+        <w:rPr>
+          <w:sz w:val="28"/>
+          <w:szCs w:val="28"/>
+        </w:rPr>
+        <w:t xml:space="preserve">, </w:t>
+      </w:r>
+      <w:proofErr w:type="spellStart"/>
+      <w:r>
+        <w:rPr>
+          <w:sz w:val="28"/>
+          <w:szCs w:val="28"/>
+        </w:rPr>
+        <w:t>toh</w:t>
+      </w:r>
+      <w:proofErr w:type="spellEnd"/>
+      <w:r>
+        <w:rPr>
+          <w:sz w:val="28"/>
+          <w:szCs w:val="28"/>
+        </w:rPr>
+        <w:t xml:space="preserve"> use </w:t>
+      </w:r>
+      <w:r>
+        <w:rPr>
+          <w:b/>
+          <w:bCs/>
+          <w:sz w:val="28"/>
+          <w:szCs w:val="28"/>
+        </w:rPr>
+        <w:t>Nested Loop</w:t>
+      </w:r>
+      <w:r>
+        <w:rPr>
+          <w:sz w:val="28"/>
+          <w:szCs w:val="28"/>
+        </w:rPr>
+        <w:t xml:space="preserve"> </w:t>
+      </w:r>
+      <w:proofErr w:type="spellStart"/>
+      <w:r>
+        <w:rPr>
+          <w:sz w:val="28"/>
+          <w:szCs w:val="28"/>
+        </w:rPr>
+        <w:t>kehte</w:t>
+      </w:r>
+      <w:proofErr w:type="spellEnd"/>
+      <w:r>
+        <w:rPr>
+          <w:sz w:val="28"/>
+          <w:szCs w:val="28"/>
+        </w:rPr>
+        <w:t xml:space="preserve"> hain.</w:t>
+      </w:r>
+    </w:p>
+    <w:p>
+      <w:pPr>
+        <w:numPr>
+          <w:ilvl w:val="0"/>
+          <w:numId w:val="77"/>
+        </w:numPr>
+        <w:rPr>
+          <w:sz w:val="28"/>
+          <w:szCs w:val="28"/>
+        </w:rPr>
+      </w:pPr>
+      <w:r>
+        <w:rPr>
+          <w:b/>
+          <w:bCs/>
+          <w:sz w:val="28"/>
+          <w:szCs w:val="28"/>
+        </w:rPr>
+        <w:t xml:space="preserve">Outer Loop (Bahar </w:t>
+      </w:r>
+      <w:proofErr w:type="spellStart"/>
+      <w:r>
+        <w:rPr>
+          <w:b/>
+          <w:bCs/>
+          <w:sz w:val="28"/>
+          <w:szCs w:val="28"/>
+        </w:rPr>
+        <w:t>wala</w:t>
+      </w:r>
+      <w:proofErr w:type="spellEnd"/>
+      <w:r>
+        <w:rPr>
+          <w:b/>
+          <w:bCs/>
+          <w:sz w:val="28"/>
+          <w:szCs w:val="28"/>
+        </w:rPr>
+        <w:t xml:space="preserve"> loop):</w:t>
+      </w:r>
+      <w:r>
+        <w:rPr>
+          <w:sz w:val="28"/>
+          <w:szCs w:val="28"/>
+        </w:rPr>
+        <w:t xml:space="preserve"> Controls the Rows / Primary iterations.</w:t>
+      </w:r>
+    </w:p>
+    <w:p>
+      <w:pPr>
+        <w:numPr>
+          <w:ilvl w:val="0"/>
+          <w:numId w:val="77"/>
+        </w:numPr>
+        <w:rPr>
+          <w:sz w:val="28"/>
+          <w:szCs w:val="28"/>
+        </w:rPr>
+      </w:pPr>
+      <w:r>
+        <w:rPr>
+          <w:b/>
+          <w:bCs/>
+          <w:sz w:val="28"/>
+          <w:szCs w:val="28"/>
+        </w:rPr>
+        <w:t xml:space="preserve">Inner Loop (Andar </w:t>
+      </w:r>
+      <w:proofErr w:type="spellStart"/>
+      <w:r>
+        <w:rPr>
+          <w:b/>
+          <w:bCs/>
+          <w:sz w:val="28"/>
+          <w:szCs w:val="28"/>
+        </w:rPr>
+        <w:t>wala</w:t>
+      </w:r>
+      <w:proofErr w:type="spellEnd"/>
+      <w:r>
+        <w:rPr>
+          <w:b/>
+          <w:bCs/>
+          <w:sz w:val="28"/>
+          <w:szCs w:val="28"/>
+        </w:rPr>
+        <w:t xml:space="preserve"> loop):</w:t>
+      </w:r>
+      <w:r>
+        <w:rPr>
+          <w:sz w:val="28"/>
+          <w:szCs w:val="28"/>
+        </w:rPr>
+        <w:t xml:space="preserve"> Controls the Columns / Secondary iterations for EVERY single step of the outer loop.</w:t>
+      </w:r>
+    </w:p>
+    <w:p>
+      <w:pPr>
+        <w:rPr>
+          <w:sz w:val="28"/>
+          <w:szCs w:val="28"/>
+        </w:rPr>
+      </w:pPr>
+      <w:r>
+        <w:rPr>
+          <w:rFonts w:ascii="Segoe UI Emoji" w:hAnsi="Segoe UI Emoji" w:cs="Segoe UI Emoji"/>
+          <w:sz w:val="28"/>
+          <w:szCs w:val="28"/>
+        </w:rPr>
+        <w:lastRenderedPageBreak/>
+        <w:t>💡</w:t>
+      </w:r>
+      <w:r>
+        <w:rPr>
+          <w:sz w:val="28"/>
+          <w:szCs w:val="28"/>
+        </w:rPr>
+        <w:t xml:space="preserve"> </w:t>
+      </w:r>
+      <w:r>
+        <w:rPr>
+          <w:b/>
+          <w:bCs/>
+          <w:sz w:val="28"/>
+          <w:szCs w:val="28"/>
+        </w:rPr>
+        <w:t>Key Mechanics:</w:t>
+      </w:r>
+    </w:p>
+    <w:p>
+      <w:pPr>
+        <w:rPr>
+          <w:sz w:val="28"/>
+          <w:szCs w:val="28"/>
+        </w:rPr>
+      </w:pPr>
+      <w:r>
+        <w:rPr>
+          <w:sz w:val="28"/>
+          <w:szCs w:val="28"/>
+        </w:rPr>
+        <w:t xml:space="preserve">Outer loop ki </w:t>
+      </w:r>
+      <w:r>
+        <w:rPr>
+          <w:b/>
+          <w:bCs/>
+          <w:sz w:val="28"/>
+          <w:szCs w:val="28"/>
+        </w:rPr>
+        <w:t>ek single iteration</w:t>
+      </w:r>
+      <w:r>
+        <w:rPr>
+          <w:sz w:val="28"/>
+          <w:szCs w:val="28"/>
+        </w:rPr>
+        <w:t xml:space="preserve"> </w:t>
+      </w:r>
+      <w:proofErr w:type="spellStart"/>
+      <w:r>
+        <w:rPr>
+          <w:sz w:val="28"/>
+          <w:szCs w:val="28"/>
+        </w:rPr>
+        <w:t>ke</w:t>
+      </w:r>
+      <w:proofErr w:type="spellEnd"/>
+      <w:r>
+        <w:rPr>
+          <w:sz w:val="28"/>
+          <w:szCs w:val="28"/>
+        </w:rPr>
+        <w:t xml:space="preserve"> </w:t>
+      </w:r>
+      <w:proofErr w:type="spellStart"/>
+      <w:r>
+        <w:rPr>
+          <w:sz w:val="28"/>
+          <w:szCs w:val="28"/>
+        </w:rPr>
+        <w:t>liye</w:t>
+      </w:r>
+      <w:proofErr w:type="spellEnd"/>
+      <w:r>
+        <w:rPr>
+          <w:sz w:val="28"/>
+          <w:szCs w:val="28"/>
+        </w:rPr>
+        <w:t xml:space="preserve">, inner loop </w:t>
+      </w:r>
+      <w:proofErr w:type="spellStart"/>
+      <w:r>
+        <w:rPr>
+          <w:b/>
+          <w:bCs/>
+          <w:sz w:val="28"/>
+          <w:szCs w:val="28"/>
+        </w:rPr>
+        <w:t>apni</w:t>
+      </w:r>
+      <w:proofErr w:type="spellEnd"/>
+      <w:r>
+        <w:rPr>
+          <w:b/>
+          <w:bCs/>
+          <w:sz w:val="28"/>
+          <w:szCs w:val="28"/>
+        </w:rPr>
+        <w:t xml:space="preserve"> </w:t>
+      </w:r>
+      <w:proofErr w:type="spellStart"/>
+      <w:r>
+        <w:rPr>
+          <w:b/>
+          <w:bCs/>
+          <w:sz w:val="28"/>
+          <w:szCs w:val="28"/>
+        </w:rPr>
+        <w:t>saari</w:t>
+      </w:r>
+      <w:proofErr w:type="spellEnd"/>
+      <w:r>
+        <w:rPr>
+          <w:b/>
+          <w:bCs/>
+          <w:sz w:val="28"/>
+          <w:szCs w:val="28"/>
+        </w:rPr>
+        <w:t xml:space="preserve"> iterations poori run </w:t>
+      </w:r>
+      <w:proofErr w:type="spellStart"/>
+      <w:r>
+        <w:rPr>
+          <w:b/>
+          <w:bCs/>
+          <w:sz w:val="28"/>
+          <w:szCs w:val="28"/>
+        </w:rPr>
+        <w:t>karta</w:t>
+      </w:r>
+      <w:proofErr w:type="spellEnd"/>
+      <w:r>
+        <w:rPr>
+          <w:b/>
+          <w:bCs/>
+          <w:sz w:val="28"/>
+          <w:szCs w:val="28"/>
+        </w:rPr>
+        <w:t xml:space="preserve"> </w:t>
+      </w:r>
+      <w:proofErr w:type="spellStart"/>
+      <w:r>
+        <w:rPr>
+          <w:b/>
+          <w:bCs/>
+          <w:sz w:val="28"/>
+          <w:szCs w:val="28"/>
+        </w:rPr>
+        <w:t>hai</w:t>
+      </w:r>
+      <w:proofErr w:type="spellEnd"/>
+      <w:r>
+        <w:rPr>
+          <w:sz w:val="28"/>
+          <w:szCs w:val="28"/>
+        </w:rPr>
+        <w:t>.</w:t>
+      </w:r>
+    </w:p>
+    <w:p>
+      <w:pPr>
+        <w:rPr>
+          <w:b/>
+          <w:bCs/>
+          <w:sz w:val="28"/>
+          <w:szCs w:val="28"/>
+        </w:rPr>
+      </w:pPr>
+      <w:r>
+        <w:rPr>
+          <w:b/>
+          <w:bCs/>
+          <w:sz w:val="28"/>
+          <w:szCs w:val="28"/>
+        </w:rPr>
+        <w:t>2. Real-World Use Cases &amp; Applications</w:t>
+      </w:r>
+    </w:p>
+    <w:p>
+      <w:pPr>
+        <w:numPr>
+          <w:ilvl w:val="0"/>
+          <w:numId w:val="78"/>
+        </w:numPr>
+        <w:rPr>
+          <w:sz w:val="28"/>
+          <w:szCs w:val="28"/>
+        </w:rPr>
+      </w:pPr>
+      <w:r>
+        <w:rPr>
+          <w:b/>
+          <w:bCs/>
+          <w:sz w:val="28"/>
+          <w:szCs w:val="28"/>
+        </w:rPr>
+        <w:t>Social Media Analysis:</w:t>
+      </w:r>
+    </w:p>
+    <w:p>
+      <w:pPr>
+        <w:numPr>
+          <w:ilvl w:val="1"/>
+          <w:numId w:val="78"/>
+        </w:numPr>
+        <w:rPr>
+          <w:sz w:val="28"/>
+          <w:szCs w:val="28"/>
+        </w:rPr>
+      </w:pPr>
+      <w:r>
+        <w:rPr>
+          <w:sz w:val="28"/>
+          <w:szCs w:val="28"/>
+        </w:rPr>
+        <w:t xml:space="preserve">Outer Loop: Har </w:t>
+      </w:r>
+      <w:r>
+        <w:rPr>
+          <w:b/>
+          <w:bCs/>
+          <w:sz w:val="28"/>
+          <w:szCs w:val="28"/>
+        </w:rPr>
+        <w:t>User</w:t>
+      </w:r>
+      <w:r>
+        <w:rPr>
+          <w:sz w:val="28"/>
+          <w:szCs w:val="28"/>
+        </w:rPr>
+        <w:t xml:space="preserve"> par </w:t>
+      </w:r>
+      <w:proofErr w:type="gramStart"/>
+      <w:r>
+        <w:rPr>
+          <w:sz w:val="28"/>
+          <w:szCs w:val="28"/>
+        </w:rPr>
+        <w:t>iterate</w:t>
+      </w:r>
+      <w:proofErr w:type="gramEnd"/>
+      <w:r>
+        <w:rPr>
+          <w:sz w:val="28"/>
+          <w:szCs w:val="28"/>
+        </w:rPr>
+        <w:t xml:space="preserve"> </w:t>
+      </w:r>
+      <w:proofErr w:type="spellStart"/>
+      <w:r>
+        <w:rPr>
+          <w:sz w:val="28"/>
+          <w:szCs w:val="28"/>
+        </w:rPr>
+        <w:t>karega</w:t>
+      </w:r>
+      <w:proofErr w:type="spellEnd"/>
+      <w:r>
+        <w:rPr>
+          <w:sz w:val="28"/>
+          <w:szCs w:val="28"/>
+        </w:rPr>
+        <w:t>.</w:t>
+      </w:r>
+    </w:p>
+    <w:p>
+      <w:pPr>
+        <w:numPr>
+          <w:ilvl w:val="1"/>
+          <w:numId w:val="78"/>
+        </w:numPr>
+        <w:rPr>
+          <w:sz w:val="28"/>
+          <w:szCs w:val="28"/>
+        </w:rPr>
+      </w:pPr>
+      <w:r>
+        <w:rPr>
+          <w:sz w:val="28"/>
+          <w:szCs w:val="28"/>
+        </w:rPr>
+        <w:t xml:space="preserve">Inner Loop: Us user </w:t>
+      </w:r>
+      <w:proofErr w:type="spellStart"/>
+      <w:r>
+        <w:rPr>
+          <w:sz w:val="28"/>
+          <w:szCs w:val="28"/>
+        </w:rPr>
+        <w:t>ke</w:t>
+      </w:r>
+      <w:proofErr w:type="spellEnd"/>
+      <w:r>
+        <w:rPr>
+          <w:sz w:val="28"/>
+          <w:szCs w:val="28"/>
+        </w:rPr>
+        <w:t xml:space="preserve"> </w:t>
+      </w:r>
+      <w:proofErr w:type="spellStart"/>
+      <w:r>
+        <w:rPr>
+          <w:sz w:val="28"/>
+          <w:szCs w:val="28"/>
+        </w:rPr>
+        <w:t>saare</w:t>
+      </w:r>
+      <w:proofErr w:type="spellEnd"/>
+      <w:r>
+        <w:rPr>
+          <w:sz w:val="28"/>
+          <w:szCs w:val="28"/>
+        </w:rPr>
+        <w:t xml:space="preserve"> </w:t>
+      </w:r>
+      <w:r>
+        <w:rPr>
+          <w:b/>
+          <w:bCs/>
+          <w:sz w:val="28"/>
+          <w:szCs w:val="28"/>
+        </w:rPr>
+        <w:t>Friends / Followers</w:t>
+      </w:r>
+      <w:r>
+        <w:rPr>
+          <w:sz w:val="28"/>
+          <w:szCs w:val="28"/>
+        </w:rPr>
+        <w:t xml:space="preserve"> par iterate </w:t>
+      </w:r>
+      <w:proofErr w:type="spellStart"/>
+      <w:r>
+        <w:rPr>
+          <w:sz w:val="28"/>
+          <w:szCs w:val="28"/>
+        </w:rPr>
+        <w:t>karega</w:t>
+      </w:r>
+      <w:proofErr w:type="spellEnd"/>
+      <w:r>
+        <w:rPr>
+          <w:sz w:val="28"/>
+          <w:szCs w:val="28"/>
+        </w:rPr>
+        <w:t>.</w:t>
+      </w:r>
+    </w:p>
+    <w:p>
+      <w:pPr>
+        <w:numPr>
+          <w:ilvl w:val="0"/>
+          <w:numId w:val="78"/>
+        </w:numPr>
+        <w:rPr>
+          <w:sz w:val="28"/>
+          <w:szCs w:val="28"/>
+        </w:rPr>
+      </w:pPr>
+      <w:r>
+        <w:rPr>
+          <w:b/>
+          <w:bCs/>
+          <w:sz w:val="28"/>
+          <w:szCs w:val="28"/>
+        </w:rPr>
+        <w:t>Banking Systems:</w:t>
+      </w:r>
+    </w:p>
+    <w:p>
+      <w:pPr>
+        <w:numPr>
+          <w:ilvl w:val="1"/>
+          <w:numId w:val="78"/>
+        </w:numPr>
+        <w:rPr>
+          <w:sz w:val="28"/>
+          <w:szCs w:val="28"/>
+        </w:rPr>
+      </w:pPr>
+      <w:r>
+        <w:rPr>
+          <w:sz w:val="28"/>
+          <w:szCs w:val="28"/>
+        </w:rPr>
+        <w:t xml:space="preserve">Outer Loop: Saare </w:t>
+      </w:r>
+      <w:r>
+        <w:rPr>
+          <w:b/>
+          <w:bCs/>
+          <w:sz w:val="28"/>
+          <w:szCs w:val="28"/>
+        </w:rPr>
+        <w:t>Customer Accounts</w:t>
+      </w:r>
+      <w:r>
+        <w:rPr>
+          <w:sz w:val="28"/>
+          <w:szCs w:val="28"/>
+        </w:rPr>
+        <w:t xml:space="preserve"> par </w:t>
+      </w:r>
+      <w:proofErr w:type="gramStart"/>
+      <w:r>
+        <w:rPr>
+          <w:sz w:val="28"/>
+          <w:szCs w:val="28"/>
+        </w:rPr>
+        <w:t>iterate</w:t>
+      </w:r>
+      <w:proofErr w:type="gramEnd"/>
+      <w:r>
+        <w:rPr>
+          <w:sz w:val="28"/>
+          <w:szCs w:val="28"/>
+        </w:rPr>
+        <w:t xml:space="preserve"> </w:t>
+      </w:r>
+      <w:proofErr w:type="spellStart"/>
+      <w:r>
+        <w:rPr>
+          <w:sz w:val="28"/>
+          <w:szCs w:val="28"/>
+        </w:rPr>
+        <w:t>karega</w:t>
+      </w:r>
+      <w:proofErr w:type="spellEnd"/>
+      <w:r>
+        <w:rPr>
+          <w:sz w:val="28"/>
+          <w:szCs w:val="28"/>
+        </w:rPr>
+        <w:t>.</w:t>
+      </w:r>
+    </w:p>
+    <w:p>
+      <w:pPr>
+        <w:numPr>
+          <w:ilvl w:val="1"/>
+          <w:numId w:val="78"/>
+        </w:numPr>
+        <w:rPr>
+          <w:sz w:val="28"/>
+          <w:szCs w:val="28"/>
+        </w:rPr>
+      </w:pPr>
+      <w:r>
+        <w:rPr>
+          <w:sz w:val="28"/>
+          <w:szCs w:val="28"/>
+        </w:rPr>
+        <w:t xml:space="preserve">Inner Loop: Har account </w:t>
+      </w:r>
+      <w:proofErr w:type="spellStart"/>
+      <w:r>
+        <w:rPr>
+          <w:sz w:val="28"/>
+          <w:szCs w:val="28"/>
+        </w:rPr>
+        <w:t>ke</w:t>
+      </w:r>
+      <w:proofErr w:type="spellEnd"/>
+      <w:r>
+        <w:rPr>
+          <w:sz w:val="28"/>
+          <w:szCs w:val="28"/>
+        </w:rPr>
+        <w:t xml:space="preserve"> </w:t>
+      </w:r>
+      <w:proofErr w:type="spellStart"/>
+      <w:r>
+        <w:rPr>
+          <w:sz w:val="28"/>
+          <w:szCs w:val="28"/>
+        </w:rPr>
+        <w:t>saare</w:t>
+      </w:r>
+      <w:proofErr w:type="spellEnd"/>
+      <w:r>
+        <w:rPr>
+          <w:sz w:val="28"/>
+          <w:szCs w:val="28"/>
+        </w:rPr>
+        <w:t xml:space="preserve"> </w:t>
+      </w:r>
+      <w:r>
+        <w:rPr>
+          <w:b/>
+          <w:bCs/>
+          <w:sz w:val="28"/>
+          <w:szCs w:val="28"/>
+        </w:rPr>
+        <w:t>Transactions</w:t>
+      </w:r>
+      <w:r>
+        <w:rPr>
+          <w:sz w:val="28"/>
+          <w:szCs w:val="28"/>
+        </w:rPr>
+        <w:t xml:space="preserve"> fetch </w:t>
+      </w:r>
+      <w:proofErr w:type="spellStart"/>
+      <w:r>
+        <w:rPr>
+          <w:sz w:val="28"/>
+          <w:szCs w:val="28"/>
+        </w:rPr>
+        <w:t>karega</w:t>
+      </w:r>
+      <w:proofErr w:type="spellEnd"/>
+      <w:r>
+        <w:rPr>
+          <w:sz w:val="28"/>
+          <w:szCs w:val="28"/>
+        </w:rPr>
+        <w:t>.</w:t>
+      </w:r>
+    </w:p>
+    <w:p>
+      <w:pPr>
+        <w:numPr>
+          <w:ilvl w:val="0"/>
+          <w:numId w:val="78"/>
+        </w:numPr>
+        <w:rPr>
+          <w:sz w:val="28"/>
+          <w:szCs w:val="28"/>
+        </w:rPr>
+      </w:pPr>
+      <w:r>
+        <w:rPr>
+          <w:b/>
+          <w:bCs/>
+          <w:sz w:val="28"/>
+          <w:szCs w:val="28"/>
+        </w:rPr>
+        <w:t>2D Grid &amp; Matrix Operations:</w:t>
+      </w:r>
+    </w:p>
+    <w:p>
+      <w:pPr>
+        <w:numPr>
+          <w:ilvl w:val="1"/>
+          <w:numId w:val="78"/>
+        </w:numPr>
+        <w:rPr>
+          <w:sz w:val="28"/>
+          <w:szCs w:val="28"/>
+        </w:rPr>
+      </w:pPr>
+      <w:r>
+        <w:rPr>
+          <w:sz w:val="28"/>
+          <w:szCs w:val="28"/>
+        </w:rPr>
+        <w:t xml:space="preserve">Images (Pixels in Height </w:t>
+      </w:r>
+      <m:oMath>
+        <m:r>
+          <w:rPr>
+            <w:rFonts w:ascii="Cambria Math" w:hAnsi="Cambria Math"/>
+            <w:sz w:val="28"/>
+            <w:szCs w:val="28"/>
+          </w:rPr>
+          <m:t>×</m:t>
+        </m:r>
+      </m:oMath>
+      <w:r>
+        <w:rPr>
+          <w:sz w:val="28"/>
+          <w:szCs w:val="28"/>
+        </w:rPr>
+        <w:t xml:space="preserve"> Width), Game Boards (Chess, Tic-Tac-Toe), aur Tables (Rows </w:t>
+      </w:r>
+      <m:oMath>
+        <m:r>
+          <w:rPr>
+            <w:rFonts w:ascii="Cambria Math" w:hAnsi="Cambria Math"/>
+            <w:sz w:val="28"/>
+            <w:szCs w:val="28"/>
+          </w:rPr>
+          <m:t>×</m:t>
+        </m:r>
+      </m:oMath>
+      <w:r>
+        <w:rPr>
+          <w:sz w:val="28"/>
+          <w:szCs w:val="28"/>
+        </w:rPr>
+        <w:t xml:space="preserve"> Columns) ko process karne ke liye.</w:t>
+      </w:r>
+    </w:p>
+    <w:p>
+      <w:pPr>
+        <w:rPr>
+          <w:b/>
+          <w:bCs/>
+          <w:sz w:val="28"/>
+          <w:szCs w:val="28"/>
+        </w:rPr>
+      </w:pPr>
+      <w:r>
+        <w:rPr>
+          <w:b/>
+          <w:bCs/>
+          <w:sz w:val="28"/>
+          <w:szCs w:val="28"/>
+        </w:rPr>
+        <w:t>3. Code Example: Star Pattern Printing (Right Triangle)</w:t>
+      </w:r>
+    </w:p>
+    <w:p>
+      <w:pPr>
+        <w:rPr>
+          <w:sz w:val="28"/>
+          <w:szCs w:val="28"/>
+        </w:rPr>
+      </w:pPr>
+      <w:r>
+        <w:rPr>
+          <w:sz w:val="28"/>
+          <w:szCs w:val="28"/>
+        </w:rPr>
+        <w:t>Python</w:t>
+      </w:r>
+    </w:p>
+    <w:p>
+      <w:pPr>
+        <w:rPr>
+          <w:sz w:val="28"/>
+          <w:szCs w:val="28"/>
+        </w:rPr>
+      </w:pPr>
+      <w:r>
+        <w:rPr>
+          <w:sz w:val="28"/>
+          <w:szCs w:val="28"/>
+        </w:rPr>
+        <w:t xml:space="preserve">rows = </w:t>
+      </w:r>
+      <w:proofErr w:type="gramStart"/>
+      <w:r>
+        <w:rPr>
+          <w:sz w:val="28"/>
+          <w:szCs w:val="28"/>
+        </w:rPr>
+        <w:t>int(input(</w:t>
+      </w:r>
+      <w:proofErr w:type="gramEnd"/>
+      <w:r>
+        <w:rPr>
+          <w:sz w:val="28"/>
+          <w:szCs w:val="28"/>
+        </w:rPr>
+        <w:t>"Enter the number of rows: "))</w:t>
+      </w:r>
+    </w:p>
+    <w:p>
+      <w:pPr>
+        <w:rPr>
+          <w:sz w:val="28"/>
+          <w:szCs w:val="28"/>
+        </w:rPr>
+      </w:pPr>
+    </w:p>
+    <w:p>
+      <w:pPr>
+        <w:rPr>
+          <w:sz w:val="28"/>
+          <w:szCs w:val="28"/>
+        </w:rPr>
+      </w:pPr>
+      <w:r>
+        <w:rPr>
+          <w:sz w:val="28"/>
+          <w:szCs w:val="28"/>
+        </w:rPr>
+        <w:t># Outer Loop (Handles Rows: 1 to 'rows')</w:t>
+      </w:r>
+    </w:p>
+    <w:p>
+      <w:pPr>
+        <w:rPr>
+          <w:sz w:val="28"/>
+          <w:szCs w:val="28"/>
+        </w:rPr>
+      </w:pPr>
+      <w:r>
+        <w:rPr>
+          <w:sz w:val="28"/>
+          <w:szCs w:val="28"/>
+        </w:rPr>
+        <w:t xml:space="preserve">for </w:t>
+      </w:r>
+      <w:proofErr w:type="spellStart"/>
+      <w:r>
+        <w:rPr>
+          <w:sz w:val="28"/>
+          <w:szCs w:val="28"/>
+        </w:rPr>
+        <w:t>i</w:t>
+      </w:r>
+      <w:proofErr w:type="spellEnd"/>
+      <w:r>
+        <w:rPr>
+          <w:sz w:val="28"/>
+          <w:szCs w:val="28"/>
+        </w:rPr>
+        <w:t xml:space="preserve"> in </w:t>
+      </w:r>
+      <w:proofErr w:type="gramStart"/>
+      <w:r>
+        <w:rPr>
+          <w:sz w:val="28"/>
+          <w:szCs w:val="28"/>
+        </w:rPr>
+        <w:t>range(</w:t>
+      </w:r>
+      <w:proofErr w:type="gramEnd"/>
+      <w:r>
+        <w:rPr>
+          <w:sz w:val="28"/>
+          <w:szCs w:val="28"/>
+        </w:rPr>
+        <w:t>1, rows + 1):</w:t>
+      </w:r>
+    </w:p>
+    <w:p>
+      <w:pPr>
+        <w:rPr>
+          <w:sz w:val="28"/>
+          <w:szCs w:val="28"/>
+        </w:rPr>
+      </w:pPr>
+      <w:r>
+        <w:rPr>
+          <w:sz w:val="28"/>
+          <w:szCs w:val="28"/>
+        </w:rPr>
+        <w:t xml:space="preserve">    </w:t>
+      </w:r>
+    </w:p>
+    <w:p>
+      <w:pPr>
+        <w:rPr>
+          <w:sz w:val="28"/>
+          <w:szCs w:val="28"/>
+        </w:rPr>
+      </w:pPr>
+      <w:r>
+        <w:rPr>
+          <w:sz w:val="28"/>
+          <w:szCs w:val="28"/>
+        </w:rPr>
+        <w:t xml:space="preserve">    # Inner Loop (Handles Stars per Row: 0 to i-1)</w:t>
+      </w:r>
+    </w:p>
+    <w:p>
+      <w:pPr>
+        <w:rPr>
+          <w:sz w:val="28"/>
+          <w:szCs w:val="28"/>
+        </w:rPr>
+      </w:pPr>
+      <w:r>
+        <w:rPr>
+          <w:sz w:val="28"/>
+          <w:szCs w:val="28"/>
+        </w:rPr>
+        <w:t xml:space="preserve">    for j in </w:t>
+      </w:r>
+      <w:proofErr w:type="gramStart"/>
+      <w:r>
+        <w:rPr>
+          <w:sz w:val="28"/>
+          <w:szCs w:val="28"/>
+        </w:rPr>
+        <w:t>range(</w:t>
+      </w:r>
+      <w:proofErr w:type="gramEnd"/>
+      <w:r>
+        <w:rPr>
+          <w:sz w:val="28"/>
+          <w:szCs w:val="28"/>
+        </w:rPr>
+        <w:t xml:space="preserve">0, </w:t>
+      </w:r>
+      <w:proofErr w:type="spellStart"/>
+      <w:r>
+        <w:rPr>
+          <w:sz w:val="28"/>
+          <w:szCs w:val="28"/>
+        </w:rPr>
+        <w:t>i</w:t>
+      </w:r>
+      <w:proofErr w:type="spellEnd"/>
+      <w:r>
+        <w:rPr>
+          <w:sz w:val="28"/>
+          <w:szCs w:val="28"/>
+        </w:rPr>
+        <w:t>):</w:t>
+      </w:r>
+    </w:p>
+    <w:p>
+      <w:pPr>
+        <w:rPr>
+          <w:sz w:val="28"/>
+          <w:szCs w:val="28"/>
+        </w:rPr>
+      </w:pPr>
+      <w:r>
+        <w:rPr>
+          <w:sz w:val="28"/>
+          <w:szCs w:val="28"/>
+        </w:rPr>
+        <w:t xml:space="preserve">        </w:t>
+      </w:r>
+      <w:proofErr w:type="gramStart"/>
+      <w:r>
+        <w:rPr>
+          <w:sz w:val="28"/>
+          <w:szCs w:val="28"/>
+        </w:rPr>
+        <w:t>print(</w:t>
+      </w:r>
+      <w:proofErr w:type="gramEnd"/>
+      <w:r>
+        <w:rPr>
+          <w:sz w:val="28"/>
+          <w:szCs w:val="28"/>
+        </w:rPr>
+        <w:t xml:space="preserve">"*", end=" </w:t>
+      </w:r>
+      <w:proofErr w:type="gramStart"/>
+      <w:r>
+        <w:rPr>
+          <w:sz w:val="28"/>
+          <w:szCs w:val="28"/>
+        </w:rPr>
+        <w:t>")  #</w:t>
+      </w:r>
+      <w:proofErr w:type="gramEnd"/>
+      <w:r>
+        <w:rPr>
+          <w:sz w:val="28"/>
+          <w:szCs w:val="28"/>
+        </w:rPr>
+        <w:t xml:space="preserve"> 'end=" "' prevents new line</w:t>
+      </w:r>
+    </w:p>
+    <w:p>
+      <w:pPr>
+        <w:rPr>
+          <w:sz w:val="28"/>
+          <w:szCs w:val="28"/>
+        </w:rPr>
+      </w:pPr>
+      <w:r>
+        <w:rPr>
+          <w:sz w:val="28"/>
+          <w:szCs w:val="28"/>
+        </w:rPr>
+        <w:t xml:space="preserve">        </w:t>
+      </w:r>
+    </w:p>
+    <w:p>
+      <w:pPr>
+        <w:rPr>
+          <w:sz w:val="28"/>
+          <w:szCs w:val="28"/>
+        </w:rPr>
+      </w:pPr>
+      <w:r>
+        <w:rPr>
+          <w:sz w:val="28"/>
+          <w:szCs w:val="28"/>
+        </w:rPr>
+        <w:t xml:space="preserve">    </w:t>
+      </w:r>
+      <w:proofErr w:type="gramStart"/>
+      <w:r>
+        <w:rPr>
+          <w:sz w:val="28"/>
+          <w:szCs w:val="28"/>
+        </w:rPr>
+        <w:t>print()  #</w:t>
+      </w:r>
+      <w:proofErr w:type="gramEnd"/>
+      <w:r>
+        <w:rPr>
+          <w:sz w:val="28"/>
+          <w:szCs w:val="28"/>
+        </w:rPr>
+        <w:t xml:space="preserve"> Moves to the next line after inner loop completes</w:t>
+      </w:r>
+    </w:p>
+    <w:p>
+      <w:pPr>
+        <w:rPr>
+          <w:b/>
+          <w:bCs/>
+          <w:sz w:val="28"/>
+          <w:szCs w:val="28"/>
+        </w:rPr>
+      </w:pPr>
+      <w:r>
+        <w:rPr>
+          <w:b/>
+          <w:bCs/>
+          <w:sz w:val="28"/>
+          <w:szCs w:val="28"/>
+        </w:rPr>
+        <w:t>Output (if rows = 5):</w:t>
+      </w:r>
+    </w:p>
+    <w:p>
+      <w:pPr>
+        <w:rPr>
+          <w:sz w:val="28"/>
+          <w:szCs w:val="28"/>
+        </w:rPr>
+      </w:pPr>
+      <w:r>
+        <w:rPr>
+          <w:sz w:val="28"/>
+          <w:szCs w:val="28"/>
+        </w:rPr>
+        <w:t>Plaintext</w:t>
+      </w:r>
+    </w:p>
+    <w:p>
+      <w:pPr>
+        <w:rPr>
+          <w:sz w:val="28"/>
+          <w:szCs w:val="28"/>
+        </w:rPr>
+      </w:pPr>
+      <w:r>
+        <w:rPr>
+          <w:sz w:val="28"/>
+          <w:szCs w:val="28"/>
+        </w:rPr>
+        <w:t xml:space="preserve">* </w:t>
+      </w:r>
+    </w:p>
+    <w:p>
+      <w:pPr>
+        <w:rPr>
+          <w:sz w:val="28"/>
+          <w:szCs w:val="28"/>
+        </w:rPr>
+      </w:pPr>
+      <w:r>
+        <w:rPr>
+          <w:sz w:val="28"/>
+          <w:szCs w:val="28"/>
+        </w:rPr>
+        <w:lastRenderedPageBreak/>
+        <w:t xml:space="preserve">* * </w:t>
+      </w:r>
+    </w:p>
+    <w:p>
+      <w:pPr>
+        <w:rPr>
+          <w:sz w:val="28"/>
+          <w:szCs w:val="28"/>
+        </w:rPr>
+      </w:pPr>
+      <w:r>
+        <w:rPr>
+          <w:sz w:val="28"/>
+          <w:szCs w:val="28"/>
+        </w:rPr>
+        <w:t xml:space="preserve">* * * </w:t>
+      </w:r>
+    </w:p>
+    <w:p>
+      <w:pPr>
+        <w:rPr>
+          <w:sz w:val="28"/>
+          <w:szCs w:val="28"/>
+        </w:rPr>
+      </w:pPr>
+      <w:r>
+        <w:rPr>
+          <w:sz w:val="28"/>
+          <w:szCs w:val="28"/>
+        </w:rPr>
+        <w:t xml:space="preserve">* * * * </w:t>
+      </w:r>
+    </w:p>
+    <w:p>
+      <w:pPr>
+        <w:rPr>
+          <w:sz w:val="28"/>
+          <w:szCs w:val="28"/>
+        </w:rPr>
+      </w:pPr>
+      <w:r>
+        <w:rPr>
+          <w:sz w:val="28"/>
+          <w:szCs w:val="28"/>
+        </w:rPr>
+        <w:t xml:space="preserve">* * * * * </w:t>
+      </w:r>
+    </w:p>
+    <w:p>
+      <w:pPr>
+        <w:rPr>
+          <w:b/>
+          <w:bCs/>
+          <w:sz w:val="28"/>
+          <w:szCs w:val="28"/>
+        </w:rPr>
+      </w:pPr>
+      <w:r>
+        <w:rPr>
+          <w:b/>
+          <w:bCs/>
+          <w:sz w:val="28"/>
+          <w:szCs w:val="28"/>
+        </w:rPr>
+        <w:t>4. Step-by-Step Execution Flow (Dry Run)</w:t>
+      </w:r>
+    </w:p>
+    <w:p>
+      <w:pPr>
+        <w:rPr>
+          <w:sz w:val="28"/>
+          <w:szCs w:val="28"/>
+        </w:rPr>
+      </w:pPr>
+      <w:r>
+        <w:rPr>
+          <w:sz w:val="28"/>
+          <w:szCs w:val="28"/>
+        </w:rPr>
+        <w:t>Lete hain rows = 3:</w:t>
+      </w:r>
+    </w:p>
+    <w:p>
+      <w:pPr>
+        <w:numPr>
+          <w:ilvl w:val="0"/>
+          <w:numId w:val="79"/>
+        </w:numPr>
+        <w:rPr>
+          <w:sz w:val="28"/>
+          <w:szCs w:val="28"/>
+        </w:rPr>
+      </w:pPr>
+      <w:proofErr w:type="spellStart"/>
+      <w:r>
+        <w:rPr>
+          <w:b/>
+          <w:bCs/>
+          <w:sz w:val="28"/>
+          <w:szCs w:val="28"/>
+        </w:rPr>
+        <w:t>i</w:t>
+      </w:r>
+      <w:proofErr w:type="spellEnd"/>
+      <w:r>
+        <w:rPr>
+          <w:b/>
+          <w:bCs/>
+          <w:sz w:val="28"/>
+          <w:szCs w:val="28"/>
+        </w:rPr>
+        <w:t xml:space="preserve"> = 1 (Row 1):</w:t>
+      </w:r>
+    </w:p>
+    <w:p>
+      <w:pPr>
+        <w:numPr>
+          <w:ilvl w:val="1"/>
+          <w:numId w:val="79"/>
+        </w:numPr>
+        <w:rPr>
+          <w:sz w:val="28"/>
+          <w:szCs w:val="28"/>
+        </w:rPr>
+      </w:pPr>
+      <w:r>
+        <w:rPr>
+          <w:sz w:val="28"/>
+          <w:szCs w:val="28"/>
+        </w:rPr>
+        <w:t>Inner loop runs j from 0 to 0 (</w:t>
+      </w:r>
+      <w:r>
+        <w:rPr>
+          <w:b/>
+          <w:bCs/>
+          <w:sz w:val="28"/>
+          <w:szCs w:val="28"/>
+        </w:rPr>
+        <w:t>1 time</w:t>
+      </w:r>
+      <w:r>
+        <w:rPr>
+          <w:sz w:val="28"/>
+          <w:szCs w:val="28"/>
+        </w:rPr>
+        <w:t>).</w:t>
+      </w:r>
+    </w:p>
+    <w:p>
+      <w:pPr>
+        <w:numPr>
+          <w:ilvl w:val="1"/>
+          <w:numId w:val="79"/>
+        </w:numPr>
+        <w:rPr>
+          <w:sz w:val="28"/>
+          <w:szCs w:val="28"/>
+        </w:rPr>
+      </w:pPr>
+      <w:r>
+        <w:rPr>
+          <w:sz w:val="28"/>
+          <w:szCs w:val="28"/>
+        </w:rPr>
+        <w:t>Prints *</w:t>
+      </w:r>
+    </w:p>
+    <w:p>
+      <w:pPr>
+        <w:numPr>
+          <w:ilvl w:val="1"/>
+          <w:numId w:val="79"/>
+        </w:numPr>
+        <w:rPr>
+          <w:sz w:val="28"/>
+          <w:szCs w:val="28"/>
+        </w:rPr>
+      </w:pPr>
+      <w:r>
+        <w:rPr>
+          <w:sz w:val="28"/>
+          <w:szCs w:val="28"/>
+        </w:rPr>
+        <w:t xml:space="preserve">Inner loop ends </w:t>
+      </w:r>
+      <m:oMath>
+        <m:r>
+          <w:rPr>
+            <w:rFonts w:ascii="Cambria Math" w:hAnsi="Cambria Math"/>
+            <w:sz w:val="28"/>
+            <w:szCs w:val="28"/>
+          </w:rPr>
+          <m:t>→</m:t>
+        </m:r>
+      </m:oMath>
+      <w:r>
+        <w:rPr>
+          <w:sz w:val="28"/>
+          <w:szCs w:val="28"/>
+        </w:rPr>
+        <w:t xml:space="preserve"> </w:t>
+      </w:r>
+      <w:proofErr w:type="gramStart"/>
+      <w:r>
+        <w:rPr>
+          <w:sz w:val="28"/>
+          <w:szCs w:val="28"/>
+        </w:rPr>
+        <w:t>print(</w:t>
+      </w:r>
+      <w:proofErr w:type="gramEnd"/>
+      <w:r>
+        <w:rPr>
+          <w:sz w:val="28"/>
+          <w:szCs w:val="28"/>
+        </w:rPr>
+        <w:t>) line change karta hai.</w:t>
+      </w:r>
+    </w:p>
+    <w:p>
+      <w:pPr>
+        <w:numPr>
+          <w:ilvl w:val="0"/>
+          <w:numId w:val="79"/>
+        </w:numPr>
+        <w:rPr>
+          <w:sz w:val="28"/>
+          <w:szCs w:val="28"/>
+        </w:rPr>
+      </w:pPr>
+      <w:proofErr w:type="spellStart"/>
+      <w:r>
+        <w:rPr>
+          <w:b/>
+          <w:bCs/>
+          <w:sz w:val="28"/>
+          <w:szCs w:val="28"/>
+        </w:rPr>
+        <w:t>i</w:t>
+      </w:r>
+      <w:proofErr w:type="spellEnd"/>
+      <w:r>
+        <w:rPr>
+          <w:b/>
+          <w:bCs/>
+          <w:sz w:val="28"/>
+          <w:szCs w:val="28"/>
+        </w:rPr>
+        <w:t xml:space="preserve"> = 2 (Row 2):</w:t>
+      </w:r>
+    </w:p>
+    <w:p>
+      <w:pPr>
+        <w:numPr>
+          <w:ilvl w:val="1"/>
+          <w:numId w:val="79"/>
+        </w:numPr>
+        <w:rPr>
+          <w:sz w:val="28"/>
+          <w:szCs w:val="28"/>
+        </w:rPr>
+      </w:pPr>
+      <w:r>
+        <w:rPr>
+          <w:sz w:val="28"/>
+          <w:szCs w:val="28"/>
+        </w:rPr>
+        <w:t>Inner loop runs j from 0 to 1 (</w:t>
+      </w:r>
+      <w:r>
+        <w:rPr>
+          <w:b/>
+          <w:bCs/>
+          <w:sz w:val="28"/>
+          <w:szCs w:val="28"/>
+        </w:rPr>
+        <w:t>2 times</w:t>
+      </w:r>
+      <w:r>
+        <w:rPr>
+          <w:sz w:val="28"/>
+          <w:szCs w:val="28"/>
+        </w:rPr>
+        <w:t>).</w:t>
+      </w:r>
+    </w:p>
+    <w:p>
+      <w:pPr>
+        <w:numPr>
+          <w:ilvl w:val="1"/>
+          <w:numId w:val="79"/>
+        </w:numPr>
+        <w:rPr>
+          <w:sz w:val="28"/>
+          <w:szCs w:val="28"/>
+        </w:rPr>
+      </w:pPr>
+      <w:r>
+        <w:rPr>
+          <w:sz w:val="28"/>
+          <w:szCs w:val="28"/>
+        </w:rPr>
+        <w:t>Prints * *</w:t>
+      </w:r>
+    </w:p>
+    <w:p>
+      <w:pPr>
+        <w:numPr>
+          <w:ilvl w:val="1"/>
+          <w:numId w:val="79"/>
+        </w:numPr>
+        <w:rPr>
+          <w:sz w:val="28"/>
+          <w:szCs w:val="28"/>
+        </w:rPr>
+      </w:pPr>
+      <w:r>
+        <w:rPr>
+          <w:sz w:val="28"/>
+          <w:szCs w:val="28"/>
+        </w:rPr>
+        <w:t xml:space="preserve">Inner loop ends </w:t>
+      </w:r>
+      <m:oMath>
+        <m:r>
+          <w:rPr>
+            <w:rFonts w:ascii="Cambria Math" w:hAnsi="Cambria Math"/>
+            <w:sz w:val="28"/>
+            <w:szCs w:val="28"/>
+          </w:rPr>
+          <m:t>→</m:t>
+        </m:r>
+      </m:oMath>
+      <w:r>
+        <w:rPr>
+          <w:sz w:val="28"/>
+          <w:szCs w:val="28"/>
+        </w:rPr>
+        <w:t xml:space="preserve"> </w:t>
+      </w:r>
+      <w:proofErr w:type="gramStart"/>
+      <w:r>
+        <w:rPr>
+          <w:sz w:val="28"/>
+          <w:szCs w:val="28"/>
+        </w:rPr>
+        <w:t>print(</w:t>
+      </w:r>
+      <w:proofErr w:type="gramEnd"/>
+      <w:r>
+        <w:rPr>
+          <w:sz w:val="28"/>
+          <w:szCs w:val="28"/>
+        </w:rPr>
+        <w:t>) line change karta hai.</w:t>
+      </w:r>
+    </w:p>
+    <w:p>
+      <w:pPr>
+        <w:numPr>
+          <w:ilvl w:val="0"/>
+          <w:numId w:val="79"/>
+        </w:numPr>
+        <w:rPr>
+          <w:sz w:val="28"/>
+          <w:szCs w:val="28"/>
+        </w:rPr>
+      </w:pPr>
+      <w:proofErr w:type="spellStart"/>
+      <w:r>
+        <w:rPr>
+          <w:b/>
+          <w:bCs/>
+          <w:sz w:val="28"/>
+          <w:szCs w:val="28"/>
+        </w:rPr>
+        <w:t>i</w:t>
+      </w:r>
+      <w:proofErr w:type="spellEnd"/>
+      <w:r>
+        <w:rPr>
+          <w:b/>
+          <w:bCs/>
+          <w:sz w:val="28"/>
+          <w:szCs w:val="28"/>
+        </w:rPr>
+        <w:t xml:space="preserve"> = 3 (Row 3):</w:t>
+      </w:r>
+    </w:p>
+    <w:p>
+      <w:pPr>
+        <w:numPr>
+          <w:ilvl w:val="1"/>
+          <w:numId w:val="79"/>
+        </w:numPr>
+        <w:rPr>
+          <w:sz w:val="28"/>
+          <w:szCs w:val="28"/>
+        </w:rPr>
+      </w:pPr>
+      <w:r>
+        <w:rPr>
+          <w:sz w:val="28"/>
+          <w:szCs w:val="28"/>
+        </w:rPr>
+        <w:t>Inner loop runs j from 0 to 2 (</w:t>
+      </w:r>
+      <w:r>
+        <w:rPr>
+          <w:b/>
+          <w:bCs/>
+          <w:sz w:val="28"/>
+          <w:szCs w:val="28"/>
+        </w:rPr>
+        <w:t>3 times</w:t>
+      </w:r>
+      <w:r>
+        <w:rPr>
+          <w:sz w:val="28"/>
+          <w:szCs w:val="28"/>
+        </w:rPr>
+        <w:t>).</w:t>
+      </w:r>
+    </w:p>
+    <w:p>
+      <w:pPr>
+        <w:numPr>
+          <w:ilvl w:val="1"/>
+          <w:numId w:val="79"/>
+        </w:numPr>
+        <w:rPr>
+          <w:sz w:val="28"/>
+          <w:szCs w:val="28"/>
+        </w:rPr>
+      </w:pPr>
+      <w:r>
+        <w:rPr>
+          <w:sz w:val="28"/>
+          <w:szCs w:val="28"/>
+        </w:rPr>
+        <w:t>Prints * * *</w:t>
+      </w:r>
+    </w:p>
+    <w:p>
+      <w:pPr>
+        <w:numPr>
+          <w:ilvl w:val="1"/>
+          <w:numId w:val="79"/>
+        </w:numPr>
+        <w:rPr>
+          <w:sz w:val="28"/>
+          <w:szCs w:val="28"/>
+        </w:rPr>
+      </w:pPr>
+      <w:r>
+        <w:rPr>
+          <w:sz w:val="28"/>
+          <w:szCs w:val="28"/>
+        </w:rPr>
+        <w:t xml:space="preserve">Inner loop ends </w:t>
+      </w:r>
+      <m:oMath>
+        <m:r>
+          <w:rPr>
+            <w:rFonts w:ascii="Cambria Math" w:hAnsi="Cambria Math"/>
+            <w:sz w:val="28"/>
+            <w:szCs w:val="28"/>
+          </w:rPr>
+          <m:t>→</m:t>
+        </m:r>
+      </m:oMath>
+      <w:r>
+        <w:rPr>
+          <w:sz w:val="28"/>
+          <w:szCs w:val="28"/>
+        </w:rPr>
+        <w:t xml:space="preserve"> </w:t>
+      </w:r>
+      <w:proofErr w:type="gramStart"/>
+      <w:r>
+        <w:rPr>
+          <w:sz w:val="28"/>
+          <w:szCs w:val="28"/>
+        </w:rPr>
+        <w:t>print(</w:t>
+      </w:r>
+      <w:proofErr w:type="gramEnd"/>
+      <w:r>
+        <w:rPr>
+          <w:sz w:val="28"/>
+          <w:szCs w:val="28"/>
+        </w:rPr>
+        <w:t>) line change karta hai.</w:t>
+      </w:r>
+    </w:p>
+    <w:p>
+      <w:pPr>
+        <w:rPr>
+          <w:b/>
+          <w:bCs/>
+          <w:sz w:val="28"/>
+          <w:szCs w:val="28"/>
+        </w:rPr>
+      </w:pPr>
+      <w:r>
+        <w:rPr>
+          <w:b/>
+          <w:bCs/>
+          <w:sz w:val="28"/>
+          <w:szCs w:val="28"/>
+        </w:rPr>
+        <w:t xml:space="preserve">5. Additional Critical Concepts (Self-Added Knowledge </w:t>
+      </w:r>
+      <w:r>
+        <w:rPr>
+          <w:rFonts w:ascii="Segoe UI Emoji" w:hAnsi="Segoe UI Emoji" w:cs="Segoe UI Emoji"/>
+          <w:b/>
+          <w:bCs/>
+          <w:sz w:val="28"/>
+          <w:szCs w:val="28"/>
+        </w:rPr>
+        <w:t>⭐</w:t>
+      </w:r>
+      <w:r>
+        <w:rPr>
+          <w:b/>
+          <w:bCs/>
+          <w:sz w:val="28"/>
+          <w:szCs w:val="28"/>
+        </w:rPr>
+        <w:t>)</w:t>
+      </w:r>
+    </w:p>
+    <w:p>
+      <w:pPr>
+        <w:rPr>
+          <w:b/>
+          <w:bCs/>
+          <w:sz w:val="28"/>
+          <w:szCs w:val="28"/>
+        </w:rPr>
+      </w:pPr>
+      <w:r>
+        <w:rPr>
+          <w:b/>
+          <w:bCs/>
+          <w:sz w:val="28"/>
+          <w:szCs w:val="28"/>
+        </w:rPr>
+        <w:t>A. Time Complexity &amp; Performance Considerations</w:t>
+      </w:r>
+    </w:p>
+    <w:p>
+      <w:pPr>
+        <w:rPr>
+          <w:sz w:val="28"/>
+          <w:szCs w:val="28"/>
+        </w:rPr>
+      </w:pPr>
+      <w:r>
+        <w:rPr>
+          <w:sz w:val="28"/>
+          <w:szCs w:val="28"/>
+        </w:rPr>
+        <w:t xml:space="preserve">Nested loops ka performance large data par slow </w:t>
+      </w:r>
+      <w:proofErr w:type="spellStart"/>
+      <w:r>
+        <w:rPr>
+          <w:sz w:val="28"/>
+          <w:szCs w:val="28"/>
+        </w:rPr>
+        <w:t>ho</w:t>
+      </w:r>
+      <w:proofErr w:type="spellEnd"/>
+      <w:r>
+        <w:rPr>
+          <w:sz w:val="28"/>
+          <w:szCs w:val="28"/>
+        </w:rPr>
+        <w:t xml:space="preserve"> </w:t>
+      </w:r>
+      <w:proofErr w:type="spellStart"/>
+      <w:r>
+        <w:rPr>
+          <w:sz w:val="28"/>
+          <w:szCs w:val="28"/>
+        </w:rPr>
+        <w:t>jata</w:t>
+      </w:r>
+      <w:proofErr w:type="spellEnd"/>
+      <w:r>
+        <w:rPr>
+          <w:sz w:val="28"/>
+          <w:szCs w:val="28"/>
+        </w:rPr>
+        <w:t xml:space="preserve"> </w:t>
+      </w:r>
+      <w:proofErr w:type="spellStart"/>
+      <w:r>
+        <w:rPr>
+          <w:sz w:val="28"/>
+          <w:szCs w:val="28"/>
+        </w:rPr>
+        <w:t>hai</w:t>
+      </w:r>
+      <w:proofErr w:type="spellEnd"/>
+      <w:r>
+        <w:rPr>
+          <w:sz w:val="28"/>
+          <w:szCs w:val="28"/>
+        </w:rPr>
+        <w:t>:</w:t>
+      </w:r>
+    </w:p>
+    <w:p>
+      <w:pPr>
+        <w:numPr>
+          <w:ilvl w:val="0"/>
+          <w:numId w:val="80"/>
+        </w:numPr>
+        <w:rPr>
+          <w:sz w:val="28"/>
+          <w:szCs w:val="28"/>
+        </w:rPr>
+      </w:pPr>
+      <w:r>
+        <w:rPr>
+          <w:b/>
+          <w:bCs/>
+          <w:sz w:val="28"/>
+          <w:szCs w:val="28"/>
+        </w:rPr>
+        <w:t>Single Loop:</w:t>
+      </w:r>
+      <w:r>
+        <w:rPr>
+          <w:sz w:val="28"/>
+          <w:szCs w:val="28"/>
+        </w:rPr>
+        <w:t xml:space="preserve"> </w:t>
+      </w:r>
+      <m:oMath>
+        <m:r>
+          <w:rPr>
+            <w:rFonts w:ascii="Cambria Math" w:hAnsi="Cambria Math"/>
+            <w:sz w:val="28"/>
+            <w:szCs w:val="28"/>
+          </w:rPr>
+          <m:t>O</m:t>
+        </m:r>
+        <m:d>
+          <m:dPr>
+            <m:ctrlPr>
+              <w:rPr>
+                <w:rFonts w:ascii="Cambria Math" w:hAnsi="Cambria Math"/>
+                <w:sz w:val="28"/>
+                <w:szCs w:val="28"/>
+              </w:rPr>
+            </m:ctrlPr>
+          </m:dPr>
+          <m:e>
+            <m:r>
+              <w:rPr>
+                <w:rFonts w:ascii="Cambria Math" w:hAnsi="Cambria Math"/>
+                <w:sz w:val="28"/>
+                <w:szCs w:val="28"/>
+              </w:rPr>
+              <m:t>N</m:t>
+            </m:r>
+          </m:e>
+        </m:d>
+      </m:oMath>
+      <w:r>
+        <w:rPr>
+          <w:sz w:val="28"/>
+          <w:szCs w:val="28"/>
+        </w:rPr>
+        <w:t xml:space="preserve"> (Linear Time)</w:t>
+      </w:r>
+    </w:p>
+    <w:p>
+      <w:pPr>
+        <w:numPr>
+          <w:ilvl w:val="0"/>
+          <w:numId w:val="80"/>
+        </w:numPr>
+        <w:rPr>
+          <w:sz w:val="28"/>
+          <w:szCs w:val="28"/>
+        </w:rPr>
+      </w:pPr>
+      <w:r>
+        <w:rPr>
+          <w:b/>
+          <w:bCs/>
+          <w:sz w:val="28"/>
+          <w:szCs w:val="28"/>
+        </w:rPr>
+        <w:t>Double Nested Loop (</w:t>
+      </w:r>
+      <m:oMath>
+        <m:r>
+          <w:rPr>
+            <w:rFonts w:ascii="Cambria Math" w:hAnsi="Cambria Math"/>
+            <w:sz w:val="28"/>
+            <w:szCs w:val="28"/>
+          </w:rPr>
+          <m:t>2</m:t>
+        </m:r>
+      </m:oMath>
+      <w:r>
+        <w:rPr>
+          <w:b/>
+          <w:bCs/>
+          <w:sz w:val="28"/>
+          <w:szCs w:val="28"/>
+        </w:rPr>
+        <w:t xml:space="preserve"> loops):</w:t>
+      </w:r>
+      <w:r>
+        <w:rPr>
+          <w:sz w:val="28"/>
+          <w:szCs w:val="28"/>
+        </w:rPr>
+        <w:t xml:space="preserve"> </w:t>
+      </w:r>
+      <m:oMath>
+        <m:r>
+          <w:rPr>
+            <w:rFonts w:ascii="Cambria Math" w:hAnsi="Cambria Math"/>
+            <w:sz w:val="28"/>
+            <w:szCs w:val="28"/>
+          </w:rPr>
+          <m:t>O</m:t>
+        </m:r>
+        <m:d>
+          <m:dPr>
+            <m:ctrlPr>
+              <w:rPr>
+                <w:rFonts w:ascii="Cambria Math" w:hAnsi="Cambria Math"/>
+                <w:sz w:val="28"/>
+                <w:szCs w:val="28"/>
+              </w:rPr>
+            </m:ctrlPr>
+          </m:dPr>
+          <m:e>
+            <m:sSup>
+              <m:sSupPr>
+                <m:ctrlPr>
+                  <w:rPr>
+                    <w:rFonts w:ascii="Cambria Math" w:hAnsi="Cambria Math"/>
+                    <w:sz w:val="28"/>
+                    <w:szCs w:val="28"/>
+                  </w:rPr>
+                </m:ctrlPr>
+              </m:sSupPr>
+              <m:e>
+                <m:r>
+                  <w:rPr>
+                    <w:rFonts w:ascii="Cambria Math" w:hAnsi="Cambria Math"/>
+                    <w:sz w:val="28"/>
+                    <w:szCs w:val="28"/>
+                  </w:rPr>
+                  <m:t>N</m:t>
+                </m:r>
+              </m:e>
+              <m:sup>
+                <m:r>
+                  <w:rPr>
+                    <w:rFonts w:ascii="Cambria Math" w:hAnsi="Cambria Math"/>
+                    <w:sz w:val="28"/>
+                    <w:szCs w:val="28"/>
+                  </w:rPr>
+                  <m:t>2</m:t>
+                </m:r>
+              </m:sup>
+            </m:sSup>
+          </m:e>
+        </m:d>
+      </m:oMath>
+      <w:r>
+        <w:rPr>
+          <w:sz w:val="28"/>
+          <w:szCs w:val="28"/>
+        </w:rPr>
+        <w:t xml:space="preserve"> (Quadratic Time — Input </w:t>
+      </w:r>
+      <m:oMath>
+        <m:r>
+          <w:rPr>
+            <w:rFonts w:ascii="Cambria Math" w:hAnsi="Cambria Math"/>
+            <w:sz w:val="28"/>
+            <w:szCs w:val="28"/>
+          </w:rPr>
+          <m:t>10×</m:t>
+        </m:r>
+      </m:oMath>
+      <w:r>
+        <w:rPr>
+          <w:sz w:val="28"/>
+          <w:szCs w:val="28"/>
+        </w:rPr>
+        <w:t xml:space="preserve"> badhne par operations </w:t>
+      </w:r>
+      <m:oMath>
+        <m:r>
+          <w:rPr>
+            <w:rFonts w:ascii="Cambria Math" w:hAnsi="Cambria Math"/>
+            <w:sz w:val="28"/>
+            <w:szCs w:val="28"/>
+          </w:rPr>
+          <m:t>100×</m:t>
+        </m:r>
+      </m:oMath>
+      <w:r>
+        <w:rPr>
+          <w:sz w:val="28"/>
+          <w:szCs w:val="28"/>
+        </w:rPr>
+        <w:t xml:space="preserve"> badhte hain!)</w:t>
+      </w:r>
+    </w:p>
+    <w:p>
+      <w:pPr>
+        <w:numPr>
+          <w:ilvl w:val="0"/>
+          <w:numId w:val="80"/>
+        </w:numPr>
+        <w:rPr>
+          <w:sz w:val="28"/>
+          <w:szCs w:val="28"/>
+        </w:rPr>
+      </w:pPr>
+      <w:r>
+        <w:rPr>
+          <w:b/>
+          <w:bCs/>
+          <w:sz w:val="28"/>
+          <w:szCs w:val="28"/>
+        </w:rPr>
+        <w:t>Triple Nested Loop (</w:t>
+      </w:r>
+      <m:oMath>
+        <m:r>
+          <w:rPr>
+            <w:rFonts w:ascii="Cambria Math" w:hAnsi="Cambria Math"/>
+            <w:sz w:val="28"/>
+            <w:szCs w:val="28"/>
+          </w:rPr>
+          <m:t>3</m:t>
+        </m:r>
+      </m:oMath>
+      <w:r>
+        <w:rPr>
+          <w:b/>
+          <w:bCs/>
+          <w:sz w:val="28"/>
+          <w:szCs w:val="28"/>
+        </w:rPr>
+        <w:t xml:space="preserve"> loops):</w:t>
+      </w:r>
+      <w:r>
+        <w:rPr>
+          <w:sz w:val="28"/>
+          <w:szCs w:val="28"/>
+        </w:rPr>
+        <w:t xml:space="preserve"> </w:t>
+      </w:r>
+      <m:oMath>
+        <m:r>
+          <w:rPr>
+            <w:rFonts w:ascii="Cambria Math" w:hAnsi="Cambria Math"/>
+            <w:sz w:val="28"/>
+            <w:szCs w:val="28"/>
+          </w:rPr>
+          <m:t>O</m:t>
+        </m:r>
+        <m:d>
+          <m:dPr>
+            <m:ctrlPr>
+              <w:rPr>
+                <w:rFonts w:ascii="Cambria Math" w:hAnsi="Cambria Math"/>
+                <w:sz w:val="28"/>
+                <w:szCs w:val="28"/>
+              </w:rPr>
+            </m:ctrlPr>
+          </m:dPr>
+          <m:e>
+            <m:sSup>
+              <m:sSupPr>
+                <m:ctrlPr>
+                  <w:rPr>
+                    <w:rFonts w:ascii="Cambria Math" w:hAnsi="Cambria Math"/>
+                    <w:sz w:val="28"/>
+                    <w:szCs w:val="28"/>
+                  </w:rPr>
+                </m:ctrlPr>
+              </m:sSupPr>
+              <m:e>
+                <m:r>
+                  <w:rPr>
+                    <w:rFonts w:ascii="Cambria Math" w:hAnsi="Cambria Math"/>
+                    <w:sz w:val="28"/>
+                    <w:szCs w:val="28"/>
+                  </w:rPr>
+                  <m:t>N</m:t>
+                </m:r>
+              </m:e>
+              <m:sup>
+                <m:r>
+                  <w:rPr>
+                    <w:rFonts w:ascii="Cambria Math" w:hAnsi="Cambria Math"/>
+                    <w:sz w:val="28"/>
+                    <w:szCs w:val="28"/>
+                  </w:rPr>
+                  <m:t>3</m:t>
+                </m:r>
+              </m:sup>
+            </m:sSup>
+          </m:e>
+        </m:d>
+      </m:oMath>
+      <w:r>
+        <w:rPr>
+          <w:sz w:val="28"/>
+          <w:szCs w:val="28"/>
+        </w:rPr>
+        <w:t xml:space="preserve"> (Cubic Time)</w:t>
+      </w:r>
+    </w:p>
+    <w:p>
+      <w:pPr>
+        <w:rPr>
+          <w:sz w:val="28"/>
+          <w:szCs w:val="28"/>
+        </w:rPr>
+      </w:pPr>
+      <w:r>
+        <w:rPr>
+          <w:rFonts w:ascii="Segoe UI Emoji" w:hAnsi="Segoe UI Emoji" w:cs="Segoe UI Emoji"/>
+          <w:sz w:val="28"/>
+          <w:szCs w:val="28"/>
+        </w:rPr>
+        <w:t>⚠️</w:t>
+      </w:r>
+      <w:r>
+        <w:rPr>
+          <w:sz w:val="28"/>
+          <w:szCs w:val="28"/>
+        </w:rPr>
+        <w:t xml:space="preserve"> </w:t>
+      </w:r>
+      <w:r>
+        <w:rPr>
+          <w:b/>
+          <w:bCs/>
+          <w:sz w:val="28"/>
+          <w:szCs w:val="28"/>
+        </w:rPr>
+        <w:t>Best Practice:</w:t>
+      </w:r>
+      <w:r>
+        <w:rPr>
+          <w:sz w:val="28"/>
+          <w:szCs w:val="28"/>
+        </w:rPr>
+        <w:t xml:space="preserve"> Nested loops ko deep levels (</w:t>
+      </w:r>
+      <m:oMath>
+        <m:r>
+          <w:rPr>
+            <w:rFonts w:ascii="Cambria Math" w:hAnsi="Cambria Math"/>
+            <w:sz w:val="28"/>
+            <w:szCs w:val="28"/>
+          </w:rPr>
+          <m:t>&gt;2</m:t>
+        </m:r>
+      </m:oMath>
+      <w:r>
+        <w:rPr>
+          <w:sz w:val="28"/>
+          <w:szCs w:val="28"/>
+        </w:rPr>
+        <w:t xml:space="preserve"> levels) tak lagane se bachna chahiye, nahi toh program slow ya unresponsive ho jata hai.</w:t>
+      </w:r>
+    </w:p>
+    <w:p>
+      <w:pPr>
+        <w:rPr>
+          <w:b/>
+          <w:bCs/>
+          <w:sz w:val="28"/>
+          <w:szCs w:val="28"/>
+        </w:rPr>
+      </w:pPr>
+      <w:r>
+        <w:rPr>
+          <w:b/>
+          <w:bCs/>
+          <w:sz w:val="28"/>
+          <w:szCs w:val="28"/>
+        </w:rPr>
+        <w:t>B. Visualizing Execution with Tools</w:t>
+      </w:r>
+    </w:p>
+    <w:p>
+      <w:pPr>
+        <w:rPr>
+          <w:sz w:val="28"/>
+          <w:szCs w:val="28"/>
+        </w:rPr>
+      </w:pPr>
+      <w:r>
+        <w:rPr>
+          <w:sz w:val="28"/>
+          <w:szCs w:val="28"/>
+        </w:rPr>
+        <w:lastRenderedPageBreak/>
+        <w:t xml:space="preserve">Code ka step-by-step memory frame aur execution flow </w:t>
+      </w:r>
+      <w:proofErr w:type="spellStart"/>
+      <w:r>
+        <w:rPr>
+          <w:sz w:val="28"/>
+          <w:szCs w:val="28"/>
+        </w:rPr>
+        <w:t>dekhne</w:t>
+      </w:r>
+      <w:proofErr w:type="spellEnd"/>
+      <w:r>
+        <w:rPr>
+          <w:sz w:val="28"/>
+          <w:szCs w:val="28"/>
+        </w:rPr>
+        <w:t xml:space="preserve"> </w:t>
+      </w:r>
+      <w:proofErr w:type="spellStart"/>
+      <w:r>
+        <w:rPr>
+          <w:sz w:val="28"/>
+          <w:szCs w:val="28"/>
+        </w:rPr>
+        <w:t>ke</w:t>
+      </w:r>
+      <w:proofErr w:type="spellEnd"/>
+      <w:r>
+        <w:rPr>
+          <w:sz w:val="28"/>
+          <w:szCs w:val="28"/>
+        </w:rPr>
+        <w:t xml:space="preserve"> </w:t>
+      </w:r>
+      <w:proofErr w:type="spellStart"/>
+      <w:r>
+        <w:rPr>
+          <w:sz w:val="28"/>
+          <w:szCs w:val="28"/>
+        </w:rPr>
+        <w:t>liye</w:t>
+      </w:r>
+      <w:proofErr w:type="spellEnd"/>
+      <w:r>
+        <w:rPr>
+          <w:sz w:val="28"/>
+          <w:szCs w:val="28"/>
+        </w:rPr>
+        <w:t xml:space="preserve"> </w:t>
+      </w:r>
+      <w:r>
+        <w:rPr>
+          <w:b/>
+          <w:bCs/>
+          <w:sz w:val="28"/>
+          <w:szCs w:val="28"/>
+        </w:rPr>
+        <w:t>Python Tutor</w:t>
+      </w:r>
+      <w:r>
+        <w:rPr>
+          <w:sz w:val="28"/>
+          <w:szCs w:val="28"/>
+        </w:rPr>
+        <w:t xml:space="preserve"> (pythontutor.com) </w:t>
+      </w:r>
+      <w:proofErr w:type="spellStart"/>
+      <w:r>
+        <w:rPr>
+          <w:sz w:val="28"/>
+          <w:szCs w:val="28"/>
+        </w:rPr>
+        <w:t>jaisa</w:t>
+      </w:r>
+      <w:proofErr w:type="spellEnd"/>
+      <w:r>
+        <w:rPr>
+          <w:sz w:val="28"/>
+          <w:szCs w:val="28"/>
+        </w:rPr>
+        <w:t xml:space="preserve"> free visualizer tool use </w:t>
+      </w:r>
+      <w:proofErr w:type="spellStart"/>
+      <w:r>
+        <w:rPr>
+          <w:sz w:val="28"/>
+          <w:szCs w:val="28"/>
+        </w:rPr>
+        <w:t>karna</w:t>
+      </w:r>
+      <w:proofErr w:type="spellEnd"/>
+      <w:r>
+        <w:rPr>
+          <w:sz w:val="28"/>
+          <w:szCs w:val="28"/>
+        </w:rPr>
+        <w:t xml:space="preserve"> best practice </w:t>
+      </w:r>
+      <w:proofErr w:type="spellStart"/>
+      <w:r>
+        <w:rPr>
+          <w:sz w:val="28"/>
+          <w:szCs w:val="28"/>
+        </w:rPr>
+        <w:t>hota</w:t>
+      </w:r>
+      <w:proofErr w:type="spellEnd"/>
+      <w:r>
+        <w:rPr>
+          <w:sz w:val="28"/>
+          <w:szCs w:val="28"/>
+        </w:rPr>
+        <w:t xml:space="preserve"> </w:t>
+      </w:r>
+      <w:proofErr w:type="spellStart"/>
+      <w:r>
+        <w:rPr>
+          <w:sz w:val="28"/>
+          <w:szCs w:val="28"/>
+        </w:rPr>
+        <w:t>hai</w:t>
+      </w:r>
+      <w:proofErr w:type="spellEnd"/>
+      <w:r>
+        <w:rPr>
+          <w:sz w:val="28"/>
+          <w:szCs w:val="28"/>
+        </w:rPr>
+        <w:t>.</w:t>
+      </w:r>
+    </w:p>
+    <w:p>
+      <w:pPr>
+        <w:rPr>
+          <w:b/>
+          <w:bCs/>
+          <w:sz w:val="28"/>
+          <w:szCs w:val="28"/>
+        </w:rPr>
+      </w:pPr>
+      <w:r>
+        <w:rPr>
+          <w:rFonts w:ascii="Segoe UI Emoji" w:hAnsi="Segoe UI Emoji" w:cs="Segoe UI Emoji"/>
+          <w:b/>
+          <w:bCs/>
+          <w:sz w:val="28"/>
+          <w:szCs w:val="28"/>
+        </w:rPr>
+        <w:t>💡</w:t>
+      </w:r>
+      <w:r>
+        <w:rPr>
+          <w:b/>
+          <w:bCs/>
+          <w:sz w:val="28"/>
+          <w:szCs w:val="28"/>
+        </w:rPr>
+        <w:t xml:space="preserve"> Quick Summary Table for Notes:</w:t>
+      </w:r>
+    </w:p>
+    <w:tbl>
+      <w:tblPr>
+        <w:tblW w:w="0" w:type="auto"/>
+        <w:tblCellSpacing w:w="15" w:type="dxa"/>
+        <w:tblCellMar>
+          <w:top w:w="15" w:type="dxa"/>
+          <w:left w:w="15" w:type="dxa"/>
+          <w:bottom w:w="15" w:type="dxa"/>
+          <w:right w:w="15" w:type="dxa"/>
+        </w:tblCellMar>
+        <w:tblLook w:val="04A0" w:firstRow="1" w:lastRow="0" w:firstColumn="1" w:lastColumn="0" w:noHBand="0" w:noVBand="1"/>
+      </w:tblPr>
+      <w:tblGrid>
+        <w:gridCol w:w="2160"/>
+        <w:gridCol w:w="4260"/>
+        <w:gridCol w:w="2590"/>
+      </w:tblGrid>
+      <w:tr>
+        <w:trPr>
+          <w:tblHeader/>
+          <w:tblCellSpacing w:w="15" w:type="dxa"/>
+        </w:trPr>
+        <w:tc>
+          <w:tcPr>
+            <w:tcW w:w="0" w:type="auto"/>
+            <w:tcBorders>
+              <w:top w:val="single" w:sz="6" w:space="0" w:color="C4C7C5"/>
+              <w:left w:val="single" w:sz="6" w:space="0" w:color="C4C7C5"/>
+              <w:bottom w:val="single" w:sz="6" w:space="0" w:color="C4C7C5"/>
+              <w:right w:val="single" w:sz="6" w:space="0" w:color="C4C7C5"/>
+            </w:tcBorders>
+            <w:tcMar>
+              <w:top w:w="120" w:type="dxa"/>
+              <w:left w:w="180" w:type="dxa"/>
+              <w:bottom w:w="120" w:type="dxa"/>
+              <w:right w:w="180" w:type="dxa"/>
+            </w:tcMar>
+            <w:vAlign w:val="center"/>
+            <w:hideMark/>
+          </w:tcPr>
+          <w:p>
+            <w:pPr>
+              <w:rPr>
+                <w:sz w:val="28"/>
+                <w:szCs w:val="28"/>
+              </w:rPr>
+            </w:pPr>
+            <w:r>
+              <w:rPr>
+                <w:b/>
+                <w:bCs/>
+                <w:sz w:val="28"/>
+                <w:szCs w:val="28"/>
+              </w:rPr>
+              <w:t>Concept</w:t>
+            </w:r>
+          </w:p>
+        </w:tc>
+        <w:tc>
+          <w:tcPr>
+            <w:tcW w:w="0" w:type="auto"/>
+            <w:tcBorders>
+              <w:top w:val="single" w:sz="6" w:space="0" w:color="C4C7C5"/>
+              <w:left w:val="single" w:sz="6" w:space="0" w:color="C4C7C5"/>
+              <w:bottom w:val="single" w:sz="6" w:space="0" w:color="C4C7C5"/>
+              <w:right w:val="single" w:sz="6" w:space="0" w:color="C4C7C5"/>
+            </w:tcBorders>
+            <w:tcMar>
+              <w:top w:w="120" w:type="dxa"/>
+              <w:left w:w="180" w:type="dxa"/>
+              <w:bottom w:w="120" w:type="dxa"/>
+              <w:right w:w="180" w:type="dxa"/>
+            </w:tcMar>
+            <w:vAlign w:val="center"/>
+            <w:hideMark/>
+          </w:tcPr>
+          <w:p>
+            <w:pPr>
+              <w:rPr>
+                <w:sz w:val="28"/>
+                <w:szCs w:val="28"/>
+              </w:rPr>
+            </w:pPr>
+            <w:r>
+              <w:rPr>
+                <w:b/>
+                <w:bCs/>
+                <w:sz w:val="28"/>
+                <w:szCs w:val="28"/>
+              </w:rPr>
+              <w:t>Role / Description</w:t>
+            </w:r>
+          </w:p>
+        </w:tc>
+        <w:tc>
+          <w:tcPr>
+            <w:tcW w:w="0" w:type="auto"/>
+            <w:tcBorders>
+              <w:top w:val="single" w:sz="6" w:space="0" w:color="C4C7C5"/>
+              <w:left w:val="single" w:sz="6" w:space="0" w:color="C4C7C5"/>
+              <w:bottom w:val="single" w:sz="6" w:space="0" w:color="C4C7C5"/>
+              <w:right w:val="single" w:sz="6" w:space="0" w:color="C4C7C5"/>
+            </w:tcBorders>
+            <w:tcMar>
+              <w:top w:w="120" w:type="dxa"/>
+              <w:left w:w="180" w:type="dxa"/>
+              <w:bottom w:w="120" w:type="dxa"/>
+              <w:right w:w="180" w:type="dxa"/>
+            </w:tcMar>
+            <w:vAlign w:val="center"/>
+            <w:hideMark/>
+          </w:tcPr>
+          <w:p>
+            <w:pPr>
+              <w:rPr>
+                <w:sz w:val="28"/>
+                <w:szCs w:val="28"/>
+              </w:rPr>
+            </w:pPr>
+            <w:r>
+              <w:rPr>
+                <w:b/>
+                <w:bCs/>
+                <w:sz w:val="28"/>
+                <w:szCs w:val="28"/>
+              </w:rPr>
+              <w:t>Example</w:t>
+            </w:r>
+          </w:p>
+        </w:tc>
+      </w:tr>
+      <w:tr>
+        <w:trPr>
+          <w:tblCellSpacing w:w="15" w:type="dxa"/>
+        </w:trPr>
+        <w:tc>
+          <w:tcPr>
+            <w:tcW w:w="0" w:type="auto"/>
+            <w:tcBorders>
+              <w:top w:val="single" w:sz="6" w:space="0" w:color="C4C7C5"/>
+              <w:left w:val="single" w:sz="6" w:space="0" w:color="C4C7C5"/>
+              <w:bottom w:val="single" w:sz="6" w:space="0" w:color="C4C7C5"/>
+              <w:right w:val="single" w:sz="6" w:space="0" w:color="C4C7C5"/>
+            </w:tcBorders>
+            <w:tcMar>
+              <w:top w:w="120" w:type="dxa"/>
+              <w:left w:w="180" w:type="dxa"/>
+              <w:bottom w:w="120" w:type="dxa"/>
+              <w:right w:w="180" w:type="dxa"/>
+            </w:tcMar>
+            <w:vAlign w:val="center"/>
+            <w:hideMark/>
+          </w:tcPr>
+          <w:p>
+            <w:pPr>
+              <w:rPr>
+                <w:sz w:val="28"/>
+                <w:szCs w:val="28"/>
+              </w:rPr>
+            </w:pPr>
+            <w:r>
+              <w:rPr>
+                <w:b/>
+                <w:bCs/>
+                <w:sz w:val="28"/>
+                <w:szCs w:val="28"/>
+              </w:rPr>
+              <w:t>Outer Loop</w:t>
+            </w:r>
+          </w:p>
+        </w:tc>
+        <w:tc>
+          <w:tcPr>
+            <w:tcW w:w="0" w:type="auto"/>
+            <w:tcBorders>
+              <w:top w:val="single" w:sz="6" w:space="0" w:color="C4C7C5"/>
+              <w:left w:val="single" w:sz="6" w:space="0" w:color="C4C7C5"/>
+              <w:bottom w:val="single" w:sz="6" w:space="0" w:color="C4C7C5"/>
+              <w:right w:val="single" w:sz="6" w:space="0" w:color="C4C7C5"/>
+            </w:tcBorders>
+            <w:tcMar>
+              <w:top w:w="120" w:type="dxa"/>
+              <w:left w:w="180" w:type="dxa"/>
+              <w:bottom w:w="120" w:type="dxa"/>
+              <w:right w:w="180" w:type="dxa"/>
+            </w:tcMar>
+            <w:vAlign w:val="center"/>
+            <w:hideMark/>
+          </w:tcPr>
+          <w:p>
+            <w:pPr>
+              <w:rPr>
+                <w:sz w:val="28"/>
+                <w:szCs w:val="28"/>
+              </w:rPr>
+            </w:pPr>
+            <w:r>
+              <w:rPr>
+                <w:sz w:val="28"/>
+                <w:szCs w:val="28"/>
+              </w:rPr>
+              <w:t xml:space="preserve">Controls </w:t>
+            </w:r>
+            <w:r>
+              <w:rPr>
+                <w:b/>
+                <w:bCs/>
+                <w:sz w:val="28"/>
+                <w:szCs w:val="28"/>
+              </w:rPr>
+              <w:t>Rows</w:t>
+            </w:r>
+            <w:r>
+              <w:rPr>
+                <w:sz w:val="28"/>
+                <w:szCs w:val="28"/>
+              </w:rPr>
+              <w:t xml:space="preserve"> / Outer sequence.</w:t>
+            </w:r>
+          </w:p>
+        </w:tc>
+        <w:tc>
+          <w:tcPr>
+            <w:tcW w:w="0" w:type="auto"/>
+            <w:tcBorders>
+              <w:top w:val="single" w:sz="6" w:space="0" w:color="C4C7C5"/>
+              <w:left w:val="single" w:sz="6" w:space="0" w:color="C4C7C5"/>
+              <w:bottom w:val="single" w:sz="6" w:space="0" w:color="C4C7C5"/>
+              <w:right w:val="single" w:sz="6" w:space="0" w:color="C4C7C5"/>
+            </w:tcBorders>
+            <w:tcMar>
+              <w:top w:w="120" w:type="dxa"/>
+              <w:left w:w="180" w:type="dxa"/>
+              <w:bottom w:w="120" w:type="dxa"/>
+              <w:right w:w="180" w:type="dxa"/>
+            </w:tcMar>
+            <w:vAlign w:val="center"/>
+            <w:hideMark/>
+          </w:tcPr>
+          <w:p>
+            <w:pPr>
+              <w:rPr>
+                <w:sz w:val="28"/>
+                <w:szCs w:val="28"/>
+              </w:rPr>
+            </w:pPr>
+            <w:r>
+              <w:rPr>
+                <w:sz w:val="28"/>
+                <w:szCs w:val="28"/>
+              </w:rPr>
+              <w:t xml:space="preserve">for </w:t>
+            </w:r>
+            <w:proofErr w:type="spellStart"/>
+            <w:r>
+              <w:rPr>
+                <w:sz w:val="28"/>
+                <w:szCs w:val="28"/>
+              </w:rPr>
+              <w:t>i</w:t>
+            </w:r>
+            <w:proofErr w:type="spellEnd"/>
+            <w:r>
+              <w:rPr>
+                <w:sz w:val="28"/>
+                <w:szCs w:val="28"/>
+              </w:rPr>
+              <w:t xml:space="preserve"> in </w:t>
+            </w:r>
+            <w:proofErr w:type="gramStart"/>
+            <w:r>
+              <w:rPr>
+                <w:sz w:val="28"/>
+                <w:szCs w:val="28"/>
+              </w:rPr>
+              <w:t>range(</w:t>
+            </w:r>
+            <w:proofErr w:type="gramEnd"/>
+            <w:r>
+              <w:rPr>
+                <w:sz w:val="28"/>
+                <w:szCs w:val="28"/>
+              </w:rPr>
+              <w:t>1, 4):</w:t>
+            </w:r>
+          </w:p>
+        </w:tc>
+      </w:tr>
+      <w:tr>
+        <w:trPr>
+          <w:tblCellSpacing w:w="15" w:type="dxa"/>
+        </w:trPr>
+        <w:tc>
+          <w:tcPr>
+            <w:tcW w:w="0" w:type="auto"/>
+            <w:tcBorders>
+              <w:top w:val="single" w:sz="6" w:space="0" w:color="C4C7C5"/>
+              <w:left w:val="single" w:sz="6" w:space="0" w:color="C4C7C5"/>
+              <w:bottom w:val="single" w:sz="6" w:space="0" w:color="C4C7C5"/>
+              <w:right w:val="single" w:sz="6" w:space="0" w:color="C4C7C5"/>
+            </w:tcBorders>
+            <w:tcMar>
+              <w:top w:w="120" w:type="dxa"/>
+              <w:left w:w="180" w:type="dxa"/>
+              <w:bottom w:w="120" w:type="dxa"/>
+              <w:right w:w="180" w:type="dxa"/>
+            </w:tcMar>
+            <w:vAlign w:val="center"/>
+            <w:hideMark/>
+          </w:tcPr>
+          <w:p>
+            <w:pPr>
+              <w:rPr>
+                <w:sz w:val="28"/>
+                <w:szCs w:val="28"/>
+              </w:rPr>
+            </w:pPr>
+            <w:r>
+              <w:rPr>
+                <w:b/>
+                <w:bCs/>
+                <w:sz w:val="28"/>
+                <w:szCs w:val="28"/>
+              </w:rPr>
+              <w:t>Inner Loop</w:t>
+            </w:r>
+          </w:p>
+        </w:tc>
+        <w:tc>
+          <w:tcPr>
+            <w:tcW w:w="0" w:type="auto"/>
+            <w:tcBorders>
+              <w:top w:val="single" w:sz="6" w:space="0" w:color="C4C7C5"/>
+              <w:left w:val="single" w:sz="6" w:space="0" w:color="C4C7C5"/>
+              <w:bottom w:val="single" w:sz="6" w:space="0" w:color="C4C7C5"/>
+              <w:right w:val="single" w:sz="6" w:space="0" w:color="C4C7C5"/>
+            </w:tcBorders>
+            <w:tcMar>
+              <w:top w:w="120" w:type="dxa"/>
+              <w:left w:w="180" w:type="dxa"/>
+              <w:bottom w:w="120" w:type="dxa"/>
+              <w:right w:w="180" w:type="dxa"/>
+            </w:tcMar>
+            <w:vAlign w:val="center"/>
+            <w:hideMark/>
+          </w:tcPr>
+          <w:p>
+            <w:pPr>
+              <w:rPr>
+                <w:sz w:val="28"/>
+                <w:szCs w:val="28"/>
+              </w:rPr>
+            </w:pPr>
+            <w:r>
+              <w:rPr>
+                <w:sz w:val="28"/>
+                <w:szCs w:val="28"/>
+              </w:rPr>
+              <w:t xml:space="preserve">Controls </w:t>
+            </w:r>
+            <w:r>
+              <w:rPr>
+                <w:b/>
+                <w:bCs/>
+                <w:sz w:val="28"/>
+                <w:szCs w:val="28"/>
+              </w:rPr>
+              <w:t>Columns</w:t>
+            </w:r>
+            <w:r>
+              <w:rPr>
+                <w:sz w:val="28"/>
+                <w:szCs w:val="28"/>
+              </w:rPr>
+              <w:t xml:space="preserve"> / Actions inside each row.</w:t>
+            </w:r>
+          </w:p>
+        </w:tc>
+        <w:tc>
+          <w:tcPr>
+            <w:tcW w:w="0" w:type="auto"/>
+            <w:tcBorders>
+              <w:top w:val="single" w:sz="6" w:space="0" w:color="C4C7C5"/>
+              <w:left w:val="single" w:sz="6" w:space="0" w:color="C4C7C5"/>
+              <w:bottom w:val="single" w:sz="6" w:space="0" w:color="C4C7C5"/>
+              <w:right w:val="single" w:sz="6" w:space="0" w:color="C4C7C5"/>
+            </w:tcBorders>
+            <w:tcMar>
+              <w:top w:w="120" w:type="dxa"/>
+              <w:left w:w="180" w:type="dxa"/>
+              <w:bottom w:w="120" w:type="dxa"/>
+              <w:right w:w="180" w:type="dxa"/>
+            </w:tcMar>
+            <w:vAlign w:val="center"/>
+            <w:hideMark/>
+          </w:tcPr>
+          <w:p>
+            <w:pPr>
+              <w:rPr>
+                <w:sz w:val="28"/>
+                <w:szCs w:val="28"/>
+              </w:rPr>
+            </w:pPr>
+            <w:r>
+              <w:rPr>
+                <w:sz w:val="28"/>
+                <w:szCs w:val="28"/>
+              </w:rPr>
+              <w:t xml:space="preserve">for j in </w:t>
+            </w:r>
+            <w:proofErr w:type="gramStart"/>
+            <w:r>
+              <w:rPr>
+                <w:sz w:val="28"/>
+                <w:szCs w:val="28"/>
+              </w:rPr>
+              <w:t>range(</w:t>
+            </w:r>
+            <w:proofErr w:type="gramEnd"/>
+            <w:r>
+              <w:rPr>
+                <w:sz w:val="28"/>
+                <w:szCs w:val="28"/>
+              </w:rPr>
+              <w:t xml:space="preserve">0, </w:t>
+            </w:r>
+            <w:proofErr w:type="spellStart"/>
+            <w:r>
+              <w:rPr>
+                <w:sz w:val="28"/>
+                <w:szCs w:val="28"/>
+              </w:rPr>
+              <w:t>i</w:t>
+            </w:r>
+            <w:proofErr w:type="spellEnd"/>
+            <w:r>
+              <w:rPr>
+                <w:sz w:val="28"/>
+                <w:szCs w:val="28"/>
+              </w:rPr>
+              <w:t>):</w:t>
+            </w:r>
+          </w:p>
+        </w:tc>
+      </w:tr>
+      <w:tr>
+        <w:trPr>
+          <w:tblCellSpacing w:w="15" w:type="dxa"/>
+        </w:trPr>
+        <w:tc>
+          <w:tcPr>
+            <w:tcW w:w="0" w:type="auto"/>
+            <w:tcBorders>
+              <w:top w:val="single" w:sz="6" w:space="0" w:color="C4C7C5"/>
+              <w:left w:val="single" w:sz="6" w:space="0" w:color="C4C7C5"/>
+              <w:bottom w:val="single" w:sz="6" w:space="0" w:color="C4C7C5"/>
+              <w:right w:val="single" w:sz="6" w:space="0" w:color="C4C7C5"/>
+            </w:tcBorders>
+            <w:tcMar>
+              <w:top w:w="120" w:type="dxa"/>
+              <w:left w:w="180" w:type="dxa"/>
+              <w:bottom w:w="120" w:type="dxa"/>
+              <w:right w:w="180" w:type="dxa"/>
+            </w:tcMar>
+            <w:vAlign w:val="center"/>
+            <w:hideMark/>
+          </w:tcPr>
+          <w:p>
+            <w:pPr>
+              <w:rPr>
+                <w:sz w:val="28"/>
+                <w:szCs w:val="28"/>
+              </w:rPr>
+            </w:pPr>
+            <w:r>
+              <w:rPr>
+                <w:b/>
+                <w:bCs/>
+                <w:sz w:val="28"/>
+                <w:szCs w:val="28"/>
+              </w:rPr>
+              <w:t>end=" "</w:t>
+            </w:r>
+          </w:p>
+        </w:tc>
+        <w:tc>
+          <w:tcPr>
+            <w:tcW w:w="0" w:type="auto"/>
+            <w:tcBorders>
+              <w:top w:val="single" w:sz="6" w:space="0" w:color="C4C7C5"/>
+              <w:left w:val="single" w:sz="6" w:space="0" w:color="C4C7C5"/>
+              <w:bottom w:val="single" w:sz="6" w:space="0" w:color="C4C7C5"/>
+              <w:right w:val="single" w:sz="6" w:space="0" w:color="C4C7C5"/>
+            </w:tcBorders>
+            <w:tcMar>
+              <w:top w:w="120" w:type="dxa"/>
+              <w:left w:w="180" w:type="dxa"/>
+              <w:bottom w:w="120" w:type="dxa"/>
+              <w:right w:w="180" w:type="dxa"/>
+            </w:tcMar>
+            <w:vAlign w:val="center"/>
+            <w:hideMark/>
+          </w:tcPr>
+          <w:p>
+            <w:pPr>
+              <w:rPr>
+                <w:sz w:val="28"/>
+                <w:szCs w:val="28"/>
+              </w:rPr>
+            </w:pPr>
+            <w:r>
+              <w:rPr>
+                <w:sz w:val="28"/>
+                <w:szCs w:val="28"/>
+              </w:rPr>
+              <w:t xml:space="preserve">Keeps output on the </w:t>
+            </w:r>
+            <w:r>
+              <w:rPr>
+                <w:b/>
+                <w:bCs/>
+                <w:sz w:val="28"/>
+                <w:szCs w:val="28"/>
+              </w:rPr>
+              <w:t>same line</w:t>
+            </w:r>
+            <w:r>
+              <w:rPr>
+                <w:sz w:val="28"/>
+                <w:szCs w:val="28"/>
+              </w:rPr>
+              <w:t>.</w:t>
+            </w:r>
+          </w:p>
+        </w:tc>
+        <w:tc>
+          <w:tcPr>
+            <w:tcW w:w="0" w:type="auto"/>
+            <w:tcBorders>
+              <w:top w:val="single" w:sz="6" w:space="0" w:color="C4C7C5"/>
+              <w:left w:val="single" w:sz="6" w:space="0" w:color="C4C7C5"/>
+              <w:bottom w:val="single" w:sz="6" w:space="0" w:color="C4C7C5"/>
+              <w:right w:val="single" w:sz="6" w:space="0" w:color="C4C7C5"/>
+            </w:tcBorders>
+            <w:tcMar>
+              <w:top w:w="120" w:type="dxa"/>
+              <w:left w:w="180" w:type="dxa"/>
+              <w:bottom w:w="120" w:type="dxa"/>
+              <w:right w:w="180" w:type="dxa"/>
+            </w:tcMar>
+            <w:vAlign w:val="center"/>
+            <w:hideMark/>
+          </w:tcPr>
+          <w:p>
+            <w:pPr>
+              <w:rPr>
+                <w:sz w:val="28"/>
+                <w:szCs w:val="28"/>
+              </w:rPr>
+            </w:pPr>
+            <w:proofErr w:type="gramStart"/>
+            <w:r>
+              <w:rPr>
+                <w:sz w:val="28"/>
+                <w:szCs w:val="28"/>
+              </w:rPr>
+              <w:t>print(</w:t>
+            </w:r>
+            <w:proofErr w:type="gramEnd"/>
+            <w:r>
+              <w:rPr>
+                <w:sz w:val="28"/>
+                <w:szCs w:val="28"/>
+              </w:rPr>
+              <w:t>"*", end=" ")</w:t>
+            </w:r>
+          </w:p>
+        </w:tc>
+      </w:tr>
+      <w:tr>
+        <w:trPr>
+          <w:tblCellSpacing w:w="15" w:type="dxa"/>
+        </w:trPr>
+        <w:tc>
+          <w:tcPr>
+            <w:tcW w:w="0" w:type="auto"/>
+            <w:tcBorders>
+              <w:top w:val="single" w:sz="6" w:space="0" w:color="C4C7C5"/>
+              <w:left w:val="single" w:sz="6" w:space="0" w:color="C4C7C5"/>
+              <w:bottom w:val="single" w:sz="6" w:space="0" w:color="C4C7C5"/>
+              <w:right w:val="single" w:sz="6" w:space="0" w:color="C4C7C5"/>
+            </w:tcBorders>
+            <w:tcMar>
+              <w:top w:w="120" w:type="dxa"/>
+              <w:left w:w="180" w:type="dxa"/>
+              <w:bottom w:w="120" w:type="dxa"/>
+              <w:right w:w="180" w:type="dxa"/>
+            </w:tcMar>
+            <w:vAlign w:val="center"/>
+            <w:hideMark/>
+          </w:tcPr>
+          <w:p>
+            <w:pPr>
+              <w:rPr>
+                <w:sz w:val="28"/>
+                <w:szCs w:val="28"/>
+              </w:rPr>
+            </w:pPr>
+            <w:proofErr w:type="gramStart"/>
+            <w:r>
+              <w:rPr>
+                <w:b/>
+                <w:bCs/>
+                <w:sz w:val="28"/>
+                <w:szCs w:val="28"/>
+              </w:rPr>
+              <w:t>print(</w:t>
+            </w:r>
+            <w:proofErr w:type="gramEnd"/>
+            <w:r>
+              <w:rPr>
+                <w:b/>
+                <w:bCs/>
+                <w:sz w:val="28"/>
+                <w:szCs w:val="28"/>
+              </w:rPr>
+              <w:t>)</w:t>
+            </w:r>
+          </w:p>
+        </w:tc>
+        <w:tc>
+          <w:tcPr>
+            <w:tcW w:w="0" w:type="auto"/>
+            <w:tcBorders>
+              <w:top w:val="single" w:sz="6" w:space="0" w:color="C4C7C5"/>
+              <w:left w:val="single" w:sz="6" w:space="0" w:color="C4C7C5"/>
+              <w:bottom w:val="single" w:sz="6" w:space="0" w:color="C4C7C5"/>
+              <w:right w:val="single" w:sz="6" w:space="0" w:color="C4C7C5"/>
+            </w:tcBorders>
+            <w:tcMar>
+              <w:top w:w="120" w:type="dxa"/>
+              <w:left w:w="180" w:type="dxa"/>
+              <w:bottom w:w="120" w:type="dxa"/>
+              <w:right w:w="180" w:type="dxa"/>
+            </w:tcMar>
+            <w:vAlign w:val="center"/>
+            <w:hideMark/>
+          </w:tcPr>
+          <w:p>
+            <w:pPr>
+              <w:rPr>
+                <w:sz w:val="28"/>
+                <w:szCs w:val="28"/>
+              </w:rPr>
+            </w:pPr>
+            <w:r>
+              <w:rPr>
+                <w:sz w:val="28"/>
+                <w:szCs w:val="28"/>
+              </w:rPr>
+              <w:t xml:space="preserve">Empty print moves execution to the </w:t>
+            </w:r>
+            <w:r>
+              <w:rPr>
+                <w:b/>
+                <w:bCs/>
+                <w:sz w:val="28"/>
+                <w:szCs w:val="28"/>
+              </w:rPr>
+              <w:t>next line</w:t>
+            </w:r>
+            <w:r>
+              <w:rPr>
+                <w:sz w:val="28"/>
+                <w:szCs w:val="28"/>
+              </w:rPr>
+              <w:t>.</w:t>
+            </w:r>
+          </w:p>
+        </w:tc>
+        <w:tc>
+          <w:tcPr>
+            <w:tcW w:w="0" w:type="auto"/>
+            <w:tcBorders>
+              <w:top w:val="single" w:sz="6" w:space="0" w:color="C4C7C5"/>
+              <w:left w:val="single" w:sz="6" w:space="0" w:color="C4C7C5"/>
+              <w:bottom w:val="single" w:sz="6" w:space="0" w:color="C4C7C5"/>
+              <w:right w:val="single" w:sz="6" w:space="0" w:color="C4C7C5"/>
+            </w:tcBorders>
+            <w:tcMar>
+              <w:top w:w="120" w:type="dxa"/>
+              <w:left w:w="180" w:type="dxa"/>
+              <w:bottom w:w="120" w:type="dxa"/>
+              <w:right w:w="180" w:type="dxa"/>
+            </w:tcMar>
+            <w:vAlign w:val="center"/>
+            <w:hideMark/>
+          </w:tcPr>
+          <w:p>
+            <w:pPr>
+              <w:rPr>
+                <w:sz w:val="28"/>
+                <w:szCs w:val="28"/>
+              </w:rPr>
+            </w:pPr>
+            <w:r>
+              <w:rPr>
+                <w:sz w:val="28"/>
+                <w:szCs w:val="28"/>
+              </w:rPr>
+              <w:t>Place outside inner loop</w:t>
+            </w:r>
+          </w:p>
+        </w:tc>
+      </w:tr>
+      <w:tr>
+        <w:trPr>
+          <w:tblCellSpacing w:w="15" w:type="dxa"/>
+        </w:trPr>
+        <w:tc>
+          <w:tcPr>
+            <w:tcW w:w="0" w:type="auto"/>
+            <w:tcBorders>
+              <w:top w:val="single" w:sz="6" w:space="0" w:color="C4C7C5"/>
+              <w:left w:val="single" w:sz="6" w:space="0" w:color="C4C7C5"/>
+              <w:bottom w:val="single" w:sz="6" w:space="0" w:color="C4C7C5"/>
+              <w:right w:val="single" w:sz="6" w:space="0" w:color="C4C7C5"/>
+            </w:tcBorders>
+            <w:tcMar>
+              <w:top w:w="120" w:type="dxa"/>
+              <w:left w:w="180" w:type="dxa"/>
+              <w:bottom w:w="120" w:type="dxa"/>
+              <w:right w:w="180" w:type="dxa"/>
+            </w:tcMar>
+            <w:vAlign w:val="center"/>
+            <w:hideMark/>
+          </w:tcPr>
+          <w:p>
+            <w:pPr>
+              <w:rPr>
+                <w:sz w:val="28"/>
+                <w:szCs w:val="28"/>
+              </w:rPr>
+            </w:pPr>
+            <w:r>
+              <w:rPr>
+                <w:b/>
+                <w:bCs/>
+                <w:sz w:val="28"/>
+                <w:szCs w:val="28"/>
+              </w:rPr>
+              <w:t>Time Complexity</w:t>
+            </w:r>
+          </w:p>
+        </w:tc>
+        <w:tc>
+          <w:tcPr>
+            <w:tcW w:w="0" w:type="auto"/>
+            <w:tcBorders>
+              <w:top w:val="single" w:sz="6" w:space="0" w:color="C4C7C5"/>
+              <w:left w:val="single" w:sz="6" w:space="0" w:color="C4C7C5"/>
+              <w:bottom w:val="single" w:sz="6" w:space="0" w:color="C4C7C5"/>
+              <w:right w:val="single" w:sz="6" w:space="0" w:color="C4C7C5"/>
+            </w:tcBorders>
+            <w:tcMar>
+              <w:top w:w="120" w:type="dxa"/>
+              <w:left w:w="180" w:type="dxa"/>
+              <w:bottom w:w="120" w:type="dxa"/>
+              <w:right w:w="180" w:type="dxa"/>
+            </w:tcMar>
+            <w:vAlign w:val="center"/>
+            <w:hideMark/>
+          </w:tcPr>
+          <w:p>
+            <w:pPr>
+              <w:rPr>
+                <w:sz w:val="28"/>
+                <w:szCs w:val="28"/>
+              </w:rPr>
+            </w:pPr>
+            <w:r>
+              <w:rPr>
+                <w:sz w:val="28"/>
+                <w:szCs w:val="28"/>
+              </w:rPr>
+              <w:t xml:space="preserve">Total Operations = </w:t>
+            </w:r>
+            <m:oMath>
+              <m:r>
+                <w:rPr>
+                  <w:rFonts w:ascii="Cambria Math" w:hAnsi="Cambria Math"/>
+                  <w:sz w:val="28"/>
+                  <w:szCs w:val="28"/>
+                </w:rPr>
+                <m:t>N×M</m:t>
+              </m:r>
+            </m:oMath>
+          </w:p>
+        </w:tc>
+        <w:tc>
+          <w:tcPr>
+            <w:tcW w:w="0" w:type="auto"/>
+            <w:tcBorders>
+              <w:top w:val="single" w:sz="6" w:space="0" w:color="C4C7C5"/>
+              <w:left w:val="single" w:sz="6" w:space="0" w:color="C4C7C5"/>
+              <w:bottom w:val="single" w:sz="6" w:space="0" w:color="C4C7C5"/>
+              <w:right w:val="single" w:sz="6" w:space="0" w:color="C4C7C5"/>
+            </w:tcBorders>
+            <w:tcMar>
+              <w:top w:w="120" w:type="dxa"/>
+              <w:left w:w="180" w:type="dxa"/>
+              <w:bottom w:w="120" w:type="dxa"/>
+              <w:right w:w="180" w:type="dxa"/>
+            </w:tcMar>
+            <w:vAlign w:val="center"/>
+            <w:hideMark/>
+          </w:tcPr>
+          <w:p>
+            <w:pPr>
+              <w:rPr>
+                <w:sz w:val="28"/>
+                <w:szCs w:val="28"/>
+              </w:rPr>
+            </w:pPr>
+            <w:r>
+              <w:rPr>
+                <w:sz w:val="28"/>
+                <w:szCs w:val="28"/>
+              </w:rPr>
+              <w:t xml:space="preserve">Double loop = </w:t>
+            </w:r>
+            <m:oMath>
+              <m:r>
+                <w:rPr>
+                  <w:rFonts w:ascii="Cambria Math" w:hAnsi="Cambria Math"/>
+                  <w:sz w:val="28"/>
+                  <w:szCs w:val="28"/>
+                </w:rPr>
+                <m:t>O</m:t>
+              </m:r>
+              <m:d>
+                <m:dPr>
+                  <m:ctrlPr>
+                    <w:rPr>
+                      <w:rFonts w:ascii="Cambria Math" w:hAnsi="Cambria Math"/>
+                      <w:sz w:val="28"/>
+                      <w:szCs w:val="28"/>
+                    </w:rPr>
+                  </m:ctrlPr>
+                </m:dPr>
+                <m:e>
+                  <m:sSup>
+                    <m:sSupPr>
+                      <m:ctrlPr>
+                        <w:rPr>
+                          <w:rFonts w:ascii="Cambria Math" w:hAnsi="Cambria Math"/>
+                          <w:sz w:val="28"/>
+                          <w:szCs w:val="28"/>
+                        </w:rPr>
+                      </m:ctrlPr>
+                    </m:sSupPr>
+                    <m:e>
+                      <m:r>
+                        <w:rPr>
+                          <w:rFonts w:ascii="Cambria Math" w:hAnsi="Cambria Math"/>
+                          <w:sz w:val="28"/>
+                          <w:szCs w:val="28"/>
+                        </w:rPr>
+                        <m:t>N</m:t>
+                      </m:r>
+                    </m:e>
+                    <m:sup>
+                      <m:r>
+                        <w:rPr>
+                          <w:rFonts w:ascii="Cambria Math" w:hAnsi="Cambria Math"/>
+                          <w:sz w:val="28"/>
+                          <w:szCs w:val="28"/>
+                        </w:rPr>
+                        <m:t>2</m:t>
+                      </m:r>
+                    </m:sup>
+                  </m:sSup>
+                </m:e>
+              </m:d>
+            </m:oMath>
+          </w:p>
+        </w:tc>
+      </w:tr>
+    </w:tbl>
+    <w:p>
+      <w:pPr>
+        <w:rPr>
+          <w:sz w:val="28"/>
+          <w:szCs w:val="28"/>
+        </w:rPr>
+      </w:pPr>
+    </w:p>
     <w:sectPr>
       <w:pgSz w:w="11906" w:h="16838"/>
       <w:pgMar w:top="851" w:right="1440" w:bottom="993" w:left="1440" w:header="708" w:footer="708" w:gutter="0"/>
@@ -39600,6 +42990,123 @@
     </w:lvl>
   </w:abstractNum>
   <w:abstractNum w:abstractNumId="7" w15:restartNumberingAfterBreak="0">
+    <w:nsid w:val="13F433B8"/>
+    <w:multiLevelType w:val="multilevel"/>
+    <w:tmpl w:val="89423E2A"/>
+    <w:lvl w:ilvl="0">
+      <w:start w:val="1"/>
+      <w:numFmt w:val="decimal"/>
+      <w:lvlText w:val="%1."/>
+      <w:lvlJc w:val="left"/>
+      <w:pPr>
+        <w:tabs>
+          <w:tab w:val="num" w:pos="720"/>
+        </w:tabs>
+        <w:ind w:left="720" w:hanging="360"/>
+      </w:pPr>
+    </w:lvl>
+    <w:lvl w:ilvl="1">
+      <w:start w:val="1"/>
+      <w:numFmt w:val="bullet"/>
+      <w:lvlText w:val="o"/>
+      <w:lvlJc w:val="left"/>
+      <w:pPr>
+        <w:tabs>
+          <w:tab w:val="num" w:pos="1440"/>
+        </w:tabs>
+        <w:ind w:left="1440" w:hanging="360"/>
+      </w:pPr>
+      <w:rPr>
+        <w:rFonts w:ascii="Courier New" w:hAnsi="Courier New" w:hint="default"/>
+        <w:sz w:val="20"/>
+      </w:rPr>
+    </w:lvl>
+    <w:lvl w:ilvl="2" w:tentative="1">
+      <w:start w:val="1"/>
+      <w:numFmt w:val="decimal"/>
+      <w:lvlText w:val="%3."/>
+      <w:lvlJc w:val="left"/>
+      <w:pPr>
+        <w:tabs>
+          <w:tab w:val="num" w:pos="2160"/>
+        </w:tabs>
+        <w:ind w:left="2160" w:hanging="360"/>
+      </w:pPr>
+    </w:lvl>
+    <w:lvl w:ilvl="3" w:tentative="1">
+      <w:start w:val="1"/>
+      <w:numFmt w:val="decimal"/>
+      <w:lvlText w:val="%4."/>
+      <w:lvlJc w:val="left"/>
+      <w:pPr>
+        <w:tabs>
+          <w:tab w:val="num" w:pos="2880"/>
+        </w:tabs>
+        <w:ind w:left="2880" w:hanging="360"/>
+      </w:pPr>
+    </w:lvl>
+    <w:lvl w:ilvl="4" w:tentative="1">
+      <w:start w:val="1"/>
+      <w:numFmt w:val="decimal"/>
+      <w:lvlText w:val="%5."/>
+      <w:lvlJc w:val="left"/>
+      <w:pPr>
+        <w:tabs>
+          <w:tab w:val="num" w:pos="3600"/>
+        </w:tabs>
+        <w:ind w:left="3600" w:hanging="360"/>
+      </w:pPr>
+    </w:lvl>
+    <w:lvl w:ilvl="5" w:tentative="1">
+      <w:start w:val="1"/>
+      <w:numFmt w:val="decimal"/>
+      <w:lvlText w:val="%6."/>
+      <w:lvlJc w:val="left"/>
+      <w:pPr>
+        <w:tabs>
+          <w:tab w:val="num" w:pos="4320"/>
+        </w:tabs>
+        <w:ind w:left="4320" w:hanging="360"/>
+      </w:pPr>
+    </w:lvl>
+    <w:lvl w:ilvl="6" w:tentative="1">
+      <w:start w:val="1"/>
+      <w:numFmt w:val="decimal"/>
+      <w:lvlText w:val="%7."/>
+      <w:lvlJc w:val="left"/>
+      <w:pPr>
+        <w:tabs>
+          <w:tab w:val="num" w:pos="5040"/>
+        </w:tabs>
+        <w:ind w:left="5040" w:hanging="360"/>
+      </w:pPr>
+    </w:lvl>
+    <w:lvl w:ilvl="7" w:tentative="1">
+      <w:start w:val="1"/>
+      <w:numFmt w:val="decimal"/>
+      <w:lvlText w:val="%8."/>
+      <w:lvlJc w:val="left"/>
+      <w:pPr>
+        <w:tabs>
+          <w:tab w:val="num" w:pos="5760"/>
+        </w:tabs>
+        <w:ind w:left="5760" w:hanging="360"/>
+      </w:pPr>
+    </w:lvl>
+    <w:lvl w:ilvl="8" w:tentative="1">
+      <w:start w:val="1"/>
+      <w:numFmt w:val="decimal"/>
+      <w:lvlText w:val="%9."/>
+      <w:lvlJc w:val="left"/>
+      <w:pPr>
+        <w:tabs>
+          <w:tab w:val="num" w:pos="6480"/>
+        </w:tabs>
+        <w:ind w:left="6480" w:hanging="360"/>
+      </w:pPr>
+    </w:lvl>
+  </w:abstractNum>
+  <w:abstractNum w:abstractNumId="8" w15:restartNumberingAfterBreak="0">
     <w:nsid w:val="146C25E1"/>
     <w:multiLevelType w:val="multilevel"/>
     <w:tmpl w:val="B662541E"/>
@@ -39748,7 +43255,7 @@
       </w:rPr>
     </w:lvl>
   </w:abstractNum>
-  <w:abstractNum w:abstractNumId="8" w15:restartNumberingAfterBreak="0">
+  <w:abstractNum w:abstractNumId="9" w15:restartNumberingAfterBreak="0">
     <w:nsid w:val="15D006BD"/>
     <w:multiLevelType w:val="multilevel"/>
     <w:tmpl w:val="63C019FA"/>
@@ -39897,7 +43404,7 @@
       </w:rPr>
     </w:lvl>
   </w:abstractNum>
-  <w:abstractNum w:abstractNumId="9" w15:restartNumberingAfterBreak="0">
+  <w:abstractNum w:abstractNumId="10" w15:restartNumberingAfterBreak="0">
     <w:nsid w:val="1615571F"/>
     <w:multiLevelType w:val="multilevel"/>
     <w:tmpl w:val="100C22E6"/>
@@ -40046,7 +43553,7 @@
       </w:rPr>
     </w:lvl>
   </w:abstractNum>
-  <w:abstractNum w:abstractNumId="10" w15:restartNumberingAfterBreak="0">
+  <w:abstractNum w:abstractNumId="11" w15:restartNumberingAfterBreak="0">
     <w:nsid w:val="16DC20BC"/>
     <w:multiLevelType w:val="multilevel"/>
     <w:tmpl w:val="F962B1E2"/>
@@ -40195,7 +43702,7 @@
       </w:rPr>
     </w:lvl>
   </w:abstractNum>
-  <w:abstractNum w:abstractNumId="11" w15:restartNumberingAfterBreak="0">
+  <w:abstractNum w:abstractNumId="12" w15:restartNumberingAfterBreak="0">
     <w:nsid w:val="18E84481"/>
     <w:multiLevelType w:val="multilevel"/>
     <w:tmpl w:val="A232C1AC"/>
@@ -40340,7 +43847,156 @@
       </w:rPr>
     </w:lvl>
   </w:abstractNum>
-  <w:abstractNum w:abstractNumId="12" w15:restartNumberingAfterBreak="0">
+  <w:abstractNum w:abstractNumId="13" w15:restartNumberingAfterBreak="0">
+    <w:nsid w:val="1A3C344F"/>
+    <w:multiLevelType w:val="multilevel"/>
+    <w:tmpl w:val="0BC27FD2"/>
+    <w:lvl w:ilvl="0">
+      <w:start w:val="1"/>
+      <w:numFmt w:val="bullet"/>
+      <w:lvlText w:val=""/>
+      <w:lvlJc w:val="left"/>
+      <w:pPr>
+        <w:tabs>
+          <w:tab w:val="num" w:pos="720"/>
+        </w:tabs>
+        <w:ind w:left="720" w:hanging="360"/>
+      </w:pPr>
+      <w:rPr>
+        <w:rFonts w:ascii="Symbol" w:hAnsi="Symbol" w:hint="default"/>
+        <w:sz w:val="20"/>
+      </w:rPr>
+    </w:lvl>
+    <w:lvl w:ilvl="1" w:tentative="1">
+      <w:start w:val="1"/>
+      <w:numFmt w:val="bullet"/>
+      <w:lvlText w:val="o"/>
+      <w:lvlJc w:val="left"/>
+      <w:pPr>
+        <w:tabs>
+          <w:tab w:val="num" w:pos="1440"/>
+        </w:tabs>
+        <w:ind w:left="1440" w:hanging="360"/>
+      </w:pPr>
+      <w:rPr>
+        <w:rFonts w:ascii="Courier New" w:hAnsi="Courier New" w:hint="default"/>
+        <w:sz w:val="20"/>
+      </w:rPr>
+    </w:lvl>
+    <w:lvl w:ilvl="2" w:tentative="1">
+      <w:start w:val="1"/>
+      <w:numFmt w:val="bullet"/>
+      <w:lvlText w:val=""/>
+      <w:lvlJc w:val="left"/>
+      <w:pPr>
+        <w:tabs>
+          <w:tab w:val="num" w:pos="2160"/>
+        </w:tabs>
+        <w:ind w:left="2160" w:hanging="360"/>
+      </w:pPr>
+      <w:rPr>
+        <w:rFonts w:ascii="Wingdings" w:hAnsi="Wingdings" w:hint="default"/>
+        <w:sz w:val="20"/>
+      </w:rPr>
+    </w:lvl>
+    <w:lvl w:ilvl="3" w:tentative="1">
+      <w:start w:val="1"/>
+      <w:numFmt w:val="bullet"/>
+      <w:lvlText w:val=""/>
+      <w:lvlJc w:val="left"/>
+      <w:pPr>
+        <w:tabs>
+          <w:tab w:val="num" w:pos="2880"/>
+        </w:tabs>
+        <w:ind w:left="2880" w:hanging="360"/>
+      </w:pPr>
+      <w:rPr>
+        <w:rFonts w:ascii="Wingdings" w:hAnsi="Wingdings" w:hint="default"/>
+        <w:sz w:val="20"/>
+      </w:rPr>
+    </w:lvl>
+    <w:lvl w:ilvl="4" w:tentative="1">
+      <w:start w:val="1"/>
+      <w:numFmt w:val="bullet"/>
+      <w:lvlText w:val=""/>
+      <w:lvlJc w:val="left"/>
+      <w:pPr>
+        <w:tabs>
+          <w:tab w:val="num" w:pos="3600"/>
+        </w:tabs>
+        <w:ind w:left="3600" w:hanging="360"/>
+      </w:pPr>
+      <w:rPr>
+        <w:rFonts w:ascii="Wingdings" w:hAnsi="Wingdings" w:hint="default"/>
+        <w:sz w:val="20"/>
+      </w:rPr>
+    </w:lvl>
+    <w:lvl w:ilvl="5" w:tentative="1">
+      <w:start w:val="1"/>
+      <w:numFmt w:val="bullet"/>
+      <w:lvlText w:val=""/>
+      <w:lvlJc w:val="left"/>
+      <w:pPr>
+        <w:tabs>
+          <w:tab w:val="num" w:pos="4320"/>
+        </w:tabs>
+        <w:ind w:left="4320" w:hanging="360"/>
+      </w:pPr>
+      <w:rPr>
+        <w:rFonts w:ascii="Wingdings" w:hAnsi="Wingdings" w:hint="default"/>
+        <w:sz w:val="20"/>
+      </w:rPr>
+    </w:lvl>
+    <w:lvl w:ilvl="6" w:tentative="1">
+      <w:start w:val="1"/>
+      <w:numFmt w:val="bullet"/>
+      <w:lvlText w:val=""/>
+      <w:lvlJc w:val="left"/>
+      <w:pPr>
+        <w:tabs>
+          <w:tab w:val="num" w:pos="5040"/>
+        </w:tabs>
+        <w:ind w:left="5040" w:hanging="360"/>
+      </w:pPr>
+      <w:rPr>
+        <w:rFonts w:ascii="Wingdings" w:hAnsi="Wingdings" w:hint="default"/>
+        <w:sz w:val="20"/>
+      </w:rPr>
+    </w:lvl>
+    <w:lvl w:ilvl="7" w:tentative="1">
+      <w:start w:val="1"/>
+      <w:numFmt w:val="bullet"/>
+      <w:lvlText w:val=""/>
+      <w:lvlJc w:val="left"/>
+      <w:pPr>
+        <w:tabs>
+          <w:tab w:val="num" w:pos="5760"/>
+        </w:tabs>
+        <w:ind w:left="5760" w:hanging="360"/>
+      </w:pPr>
+      <w:rPr>
+        <w:rFonts w:ascii="Wingdings" w:hAnsi="Wingdings" w:hint="default"/>
+        <w:sz w:val="20"/>
+      </w:rPr>
+    </w:lvl>
+    <w:lvl w:ilvl="8" w:tentative="1">
+      <w:start w:val="1"/>
+      <w:numFmt w:val="bullet"/>
+      <w:lvlText w:val=""/>
+      <w:lvlJc w:val="left"/>
+      <w:pPr>
+        <w:tabs>
+          <w:tab w:val="num" w:pos="6480"/>
+        </w:tabs>
+        <w:ind w:left="6480" w:hanging="360"/>
+      </w:pPr>
+      <w:rPr>
+        <w:rFonts w:ascii="Wingdings" w:hAnsi="Wingdings" w:hint="default"/>
+        <w:sz w:val="20"/>
+      </w:rPr>
+    </w:lvl>
+  </w:abstractNum>
+  <w:abstractNum w:abstractNumId="14" w15:restartNumberingAfterBreak="0">
     <w:nsid w:val="1B14732E"/>
     <w:multiLevelType w:val="multilevel"/>
     <w:tmpl w:val="1D94FED2"/>
@@ -40489,7 +44145,7 @@
       </w:rPr>
     </w:lvl>
   </w:abstractNum>
-  <w:abstractNum w:abstractNumId="13" w15:restartNumberingAfterBreak="0">
+  <w:abstractNum w:abstractNumId="15" w15:restartNumberingAfterBreak="0">
     <w:nsid w:val="1CFB7503"/>
     <w:multiLevelType w:val="multilevel"/>
     <w:tmpl w:val="9F44A194"/>
@@ -40638,7 +44294,7 @@
       </w:rPr>
     </w:lvl>
   </w:abstractNum>
-  <w:abstractNum w:abstractNumId="14" w15:restartNumberingAfterBreak="0">
+  <w:abstractNum w:abstractNumId="16" w15:restartNumberingAfterBreak="0">
     <w:nsid w:val="1D120478"/>
     <w:multiLevelType w:val="multilevel"/>
     <w:tmpl w:val="60B46D92"/>
@@ -40787,7 +44443,7 @@
       </w:rPr>
     </w:lvl>
   </w:abstractNum>
-  <w:abstractNum w:abstractNumId="15" w15:restartNumberingAfterBreak="0">
+  <w:abstractNum w:abstractNumId="17" w15:restartNumberingAfterBreak="0">
     <w:nsid w:val="1E142B31"/>
     <w:multiLevelType w:val="multilevel"/>
     <w:tmpl w:val="717E6EC6"/>
@@ -40936,7 +44592,7 @@
       </w:rPr>
     </w:lvl>
   </w:abstractNum>
-  <w:abstractNum w:abstractNumId="16" w15:restartNumberingAfterBreak="0">
+  <w:abstractNum w:abstractNumId="18" w15:restartNumberingAfterBreak="0">
     <w:nsid w:val="212F49C3"/>
     <w:multiLevelType w:val="multilevel"/>
     <w:tmpl w:val="0942A7FA"/>
@@ -41085,7 +44741,7 @@
       </w:rPr>
     </w:lvl>
   </w:abstractNum>
-  <w:abstractNum w:abstractNumId="17" w15:restartNumberingAfterBreak="0">
+  <w:abstractNum w:abstractNumId="19" w15:restartNumberingAfterBreak="0">
     <w:nsid w:val="21846D4F"/>
     <w:multiLevelType w:val="multilevel"/>
     <w:tmpl w:val="786AEBE0"/>
@@ -41234,7 +44890,7 @@
       </w:rPr>
     </w:lvl>
   </w:abstractNum>
-  <w:abstractNum w:abstractNumId="18" w15:restartNumberingAfterBreak="0">
+  <w:abstractNum w:abstractNumId="20" w15:restartNumberingAfterBreak="0">
     <w:nsid w:val="218A732D"/>
     <w:multiLevelType w:val="multilevel"/>
     <w:tmpl w:val="AB128116"/>
@@ -41351,7 +45007,7 @@
       </w:pPr>
     </w:lvl>
   </w:abstractNum>
-  <w:abstractNum w:abstractNumId="19" w15:restartNumberingAfterBreak="0">
+  <w:abstractNum w:abstractNumId="21" w15:restartNumberingAfterBreak="0">
     <w:nsid w:val="21D4003B"/>
     <w:multiLevelType w:val="multilevel"/>
     <w:tmpl w:val="E5FA420E"/>
@@ -41464,7 +45120,7 @@
       </w:pPr>
     </w:lvl>
   </w:abstractNum>
-  <w:abstractNum w:abstractNumId="20" w15:restartNumberingAfterBreak="0">
+  <w:abstractNum w:abstractNumId="22" w15:restartNumberingAfterBreak="0">
     <w:nsid w:val="22A5576E"/>
     <w:multiLevelType w:val="multilevel"/>
     <w:tmpl w:val="D5D28640"/>
@@ -41577,7 +45233,7 @@
       </w:pPr>
     </w:lvl>
   </w:abstractNum>
-  <w:abstractNum w:abstractNumId="21" w15:restartNumberingAfterBreak="0">
+  <w:abstractNum w:abstractNumId="23" w15:restartNumberingAfterBreak="0">
     <w:nsid w:val="24795C0A"/>
     <w:multiLevelType w:val="multilevel"/>
     <w:tmpl w:val="7260633C"/>
@@ -41726,7 +45382,7 @@
       </w:rPr>
     </w:lvl>
   </w:abstractNum>
-  <w:abstractNum w:abstractNumId="22" w15:restartNumberingAfterBreak="0">
+  <w:abstractNum w:abstractNumId="24" w15:restartNumberingAfterBreak="0">
     <w:nsid w:val="25F022F0"/>
     <w:multiLevelType w:val="multilevel"/>
     <w:tmpl w:val="30BA9CBA"/>
@@ -41839,7 +45495,7 @@
       </w:pPr>
     </w:lvl>
   </w:abstractNum>
-  <w:abstractNum w:abstractNumId="23" w15:restartNumberingAfterBreak="0">
+  <w:abstractNum w:abstractNumId="25" w15:restartNumberingAfterBreak="0">
     <w:nsid w:val="26B47991"/>
     <w:multiLevelType w:val="multilevel"/>
     <w:tmpl w:val="21DC7C7E"/>
@@ -41988,7 +45644,7 @@
       </w:rPr>
     </w:lvl>
   </w:abstractNum>
-  <w:abstractNum w:abstractNumId="24" w15:restartNumberingAfterBreak="0">
+  <w:abstractNum w:abstractNumId="26" w15:restartNumberingAfterBreak="0">
     <w:nsid w:val="27907D69"/>
     <w:multiLevelType w:val="multilevel"/>
     <w:tmpl w:val="D7B498A4"/>
@@ -42137,7 +45793,7 @@
       </w:rPr>
     </w:lvl>
   </w:abstractNum>
-  <w:abstractNum w:abstractNumId="25" w15:restartNumberingAfterBreak="0">
+  <w:abstractNum w:abstractNumId="27" w15:restartNumberingAfterBreak="0">
     <w:nsid w:val="27CB4BAF"/>
     <w:multiLevelType w:val="multilevel"/>
     <w:tmpl w:val="55EA595E"/>
@@ -42286,7 +45942,7 @@
       </w:rPr>
     </w:lvl>
   </w:abstractNum>
-  <w:abstractNum w:abstractNumId="26" w15:restartNumberingAfterBreak="0">
+  <w:abstractNum w:abstractNumId="28" w15:restartNumberingAfterBreak="0">
     <w:nsid w:val="2B37063C"/>
     <w:multiLevelType w:val="multilevel"/>
     <w:tmpl w:val="B66CBB28"/>
@@ -42399,7 +46055,7 @@
       </w:pPr>
     </w:lvl>
   </w:abstractNum>
-  <w:abstractNum w:abstractNumId="27" w15:restartNumberingAfterBreak="0">
+  <w:abstractNum w:abstractNumId="29" w15:restartNumberingAfterBreak="0">
     <w:nsid w:val="2C23639E"/>
     <w:multiLevelType w:val="multilevel"/>
     <w:tmpl w:val="EAFEAC3C"/>
@@ -42548,7 +46204,7 @@
       </w:rPr>
     </w:lvl>
   </w:abstractNum>
-  <w:abstractNum w:abstractNumId="28" w15:restartNumberingAfterBreak="0">
+  <w:abstractNum w:abstractNumId="30" w15:restartNumberingAfterBreak="0">
     <w:nsid w:val="2F825D01"/>
     <w:multiLevelType w:val="multilevel"/>
     <w:tmpl w:val="893C44CA"/>
@@ -42697,7 +46353,7 @@
       </w:rPr>
     </w:lvl>
   </w:abstractNum>
-  <w:abstractNum w:abstractNumId="29" w15:restartNumberingAfterBreak="0">
+  <w:abstractNum w:abstractNumId="31" w15:restartNumberingAfterBreak="0">
     <w:nsid w:val="303D4EDB"/>
     <w:multiLevelType w:val="multilevel"/>
     <w:tmpl w:val="DA4894EE"/>
@@ -42846,7 +46502,7 @@
       </w:rPr>
     </w:lvl>
   </w:abstractNum>
-  <w:abstractNum w:abstractNumId="30" w15:restartNumberingAfterBreak="0">
+  <w:abstractNum w:abstractNumId="32" w15:restartNumberingAfterBreak="0">
     <w:nsid w:val="37CE2A71"/>
     <w:multiLevelType w:val="multilevel"/>
     <w:tmpl w:val="B1BAB0C0"/>
@@ -42995,7 +46651,7 @@
       </w:rPr>
     </w:lvl>
   </w:abstractNum>
-  <w:abstractNum w:abstractNumId="31" w15:restartNumberingAfterBreak="0">
+  <w:abstractNum w:abstractNumId="33" w15:restartNumberingAfterBreak="0">
     <w:nsid w:val="37D80B7A"/>
     <w:multiLevelType w:val="multilevel"/>
     <w:tmpl w:val="F4368136"/>
@@ -43144,7 +46800,7 @@
       </w:rPr>
     </w:lvl>
   </w:abstractNum>
-  <w:abstractNum w:abstractNumId="32" w15:restartNumberingAfterBreak="0">
+  <w:abstractNum w:abstractNumId="34" w15:restartNumberingAfterBreak="0">
     <w:nsid w:val="396F2468"/>
     <w:multiLevelType w:val="multilevel"/>
     <w:tmpl w:val="C896CD88"/>
@@ -43293,7 +46949,7 @@
       </w:rPr>
     </w:lvl>
   </w:abstractNum>
-  <w:abstractNum w:abstractNumId="33" w15:restartNumberingAfterBreak="0">
+  <w:abstractNum w:abstractNumId="35" w15:restartNumberingAfterBreak="0">
     <w:nsid w:val="39A77089"/>
     <w:multiLevelType w:val="multilevel"/>
     <w:tmpl w:val="269A6D1A"/>
@@ -43442,7 +47098,7 @@
       </w:rPr>
     </w:lvl>
   </w:abstractNum>
-  <w:abstractNum w:abstractNumId="34" w15:restartNumberingAfterBreak="0">
+  <w:abstractNum w:abstractNumId="36" w15:restartNumberingAfterBreak="0">
     <w:nsid w:val="3BF73F9B"/>
     <w:multiLevelType w:val="multilevel"/>
     <w:tmpl w:val="9718044A"/>
@@ -43591,7 +47247,7 @@
       </w:rPr>
     </w:lvl>
   </w:abstractNum>
-  <w:abstractNum w:abstractNumId="35" w15:restartNumberingAfterBreak="0">
+  <w:abstractNum w:abstractNumId="37" w15:restartNumberingAfterBreak="0">
     <w:nsid w:val="3D98313B"/>
     <w:multiLevelType w:val="multilevel"/>
     <w:tmpl w:val="E08029F8"/>
@@ -43740,7 +47396,7 @@
       </w:rPr>
     </w:lvl>
   </w:abstractNum>
-  <w:abstractNum w:abstractNumId="36" w15:restartNumberingAfterBreak="0">
+  <w:abstractNum w:abstractNumId="38" w15:restartNumberingAfterBreak="0">
     <w:nsid w:val="3DA070F4"/>
     <w:multiLevelType w:val="multilevel"/>
     <w:tmpl w:val="3D6A98A6"/>
@@ -43889,7 +47545,156 @@
       </w:rPr>
     </w:lvl>
   </w:abstractNum>
-  <w:abstractNum w:abstractNumId="37" w15:restartNumberingAfterBreak="0">
+  <w:abstractNum w:abstractNumId="39" w15:restartNumberingAfterBreak="0">
+    <w:nsid w:val="3DC442D3"/>
+    <w:multiLevelType w:val="multilevel"/>
+    <w:tmpl w:val="B93A552A"/>
+    <w:lvl w:ilvl="0">
+      <w:start w:val="1"/>
+      <w:numFmt w:val="bullet"/>
+      <w:lvlText w:val=""/>
+      <w:lvlJc w:val="left"/>
+      <w:pPr>
+        <w:tabs>
+          <w:tab w:val="num" w:pos="720"/>
+        </w:tabs>
+        <w:ind w:left="720" w:hanging="360"/>
+      </w:pPr>
+      <w:rPr>
+        <w:rFonts w:ascii="Symbol" w:hAnsi="Symbol" w:hint="default"/>
+        <w:sz w:val="20"/>
+      </w:rPr>
+    </w:lvl>
+    <w:lvl w:ilvl="1" w:tentative="1">
+      <w:start w:val="1"/>
+      <w:numFmt w:val="bullet"/>
+      <w:lvlText w:val="o"/>
+      <w:lvlJc w:val="left"/>
+      <w:pPr>
+        <w:tabs>
+          <w:tab w:val="num" w:pos="1440"/>
+        </w:tabs>
+        <w:ind w:left="1440" w:hanging="360"/>
+      </w:pPr>
+      <w:rPr>
+        <w:rFonts w:ascii="Courier New" w:hAnsi="Courier New" w:hint="default"/>
+        <w:sz w:val="20"/>
+      </w:rPr>
+    </w:lvl>
+    <w:lvl w:ilvl="2" w:tentative="1">
+      <w:start w:val="1"/>
+      <w:numFmt w:val="bullet"/>
+      <w:lvlText w:val=""/>
+      <w:lvlJc w:val="left"/>
+      <w:pPr>
+        <w:tabs>
+          <w:tab w:val="num" w:pos="2160"/>
+        </w:tabs>
+        <w:ind w:left="2160" w:hanging="360"/>
+      </w:pPr>
+      <w:rPr>
+        <w:rFonts w:ascii="Wingdings" w:hAnsi="Wingdings" w:hint="default"/>
+        <w:sz w:val="20"/>
+      </w:rPr>
+    </w:lvl>
+    <w:lvl w:ilvl="3" w:tentative="1">
+      <w:start w:val="1"/>
+      <w:numFmt w:val="bullet"/>
+      <w:lvlText w:val=""/>
+      <w:lvlJc w:val="left"/>
+      <w:pPr>
+        <w:tabs>
+          <w:tab w:val="num" w:pos="2880"/>
+        </w:tabs>
+        <w:ind w:left="2880" w:hanging="360"/>
+      </w:pPr>
+      <w:rPr>
+        <w:rFonts w:ascii="Wingdings" w:hAnsi="Wingdings" w:hint="default"/>
+        <w:sz w:val="20"/>
+      </w:rPr>
+    </w:lvl>
+    <w:lvl w:ilvl="4" w:tentative="1">
+      <w:start w:val="1"/>
+      <w:numFmt w:val="bullet"/>
+      <w:lvlText w:val=""/>
+      <w:lvlJc w:val="left"/>
+      <w:pPr>
+        <w:tabs>
+          <w:tab w:val="num" w:pos="3600"/>
+        </w:tabs>
+        <w:ind w:left="3600" w:hanging="360"/>
+      </w:pPr>
+      <w:rPr>
+        <w:rFonts w:ascii="Wingdings" w:hAnsi="Wingdings" w:hint="default"/>
+        <w:sz w:val="20"/>
+      </w:rPr>
+    </w:lvl>
+    <w:lvl w:ilvl="5" w:tentative="1">
+      <w:start w:val="1"/>
+      <w:numFmt w:val="bullet"/>
+      <w:lvlText w:val=""/>
+      <w:lvlJc w:val="left"/>
+      <w:pPr>
+        <w:tabs>
+          <w:tab w:val="num" w:pos="4320"/>
+        </w:tabs>
+        <w:ind w:left="4320" w:hanging="360"/>
+      </w:pPr>
+      <w:rPr>
+        <w:rFonts w:ascii="Wingdings" w:hAnsi="Wingdings" w:hint="default"/>
+        <w:sz w:val="20"/>
+      </w:rPr>
+    </w:lvl>
+    <w:lvl w:ilvl="6" w:tentative="1">
+      <w:start w:val="1"/>
+      <w:numFmt w:val="bullet"/>
+      <w:lvlText w:val=""/>
+      <w:lvlJc w:val="left"/>
+      <w:pPr>
+        <w:tabs>
+          <w:tab w:val="num" w:pos="5040"/>
+        </w:tabs>
+        <w:ind w:left="5040" w:hanging="360"/>
+      </w:pPr>
+      <w:rPr>
+        <w:rFonts w:ascii="Wingdings" w:hAnsi="Wingdings" w:hint="default"/>
+        <w:sz w:val="20"/>
+      </w:rPr>
+    </w:lvl>
+    <w:lvl w:ilvl="7" w:tentative="1">
+      <w:start w:val="1"/>
+      <w:numFmt w:val="bullet"/>
+      <w:lvlText w:val=""/>
+      <w:lvlJc w:val="left"/>
+      <w:pPr>
+        <w:tabs>
+          <w:tab w:val="num" w:pos="5760"/>
+        </w:tabs>
+        <w:ind w:left="5760" w:hanging="360"/>
+      </w:pPr>
+      <w:rPr>
+        <w:rFonts w:ascii="Wingdings" w:hAnsi="Wingdings" w:hint="default"/>
+        <w:sz w:val="20"/>
+      </w:rPr>
+    </w:lvl>
+    <w:lvl w:ilvl="8" w:tentative="1">
+      <w:start w:val="1"/>
+      <w:numFmt w:val="bullet"/>
+      <w:lvlText w:val=""/>
+      <w:lvlJc w:val="left"/>
+      <w:pPr>
+        <w:tabs>
+          <w:tab w:val="num" w:pos="6480"/>
+        </w:tabs>
+        <w:ind w:left="6480" w:hanging="360"/>
+      </w:pPr>
+      <w:rPr>
+        <w:rFonts w:ascii="Wingdings" w:hAnsi="Wingdings" w:hint="default"/>
+        <w:sz w:val="20"/>
+      </w:rPr>
+    </w:lvl>
+  </w:abstractNum>
+  <w:abstractNum w:abstractNumId="40" w15:restartNumberingAfterBreak="0">
     <w:nsid w:val="3DF469E3"/>
     <w:multiLevelType w:val="multilevel"/>
     <w:tmpl w:val="E7FEB5C8"/>
@@ -44038,7 +47843,7 @@
       </w:rPr>
     </w:lvl>
   </w:abstractNum>
-  <w:abstractNum w:abstractNumId="38" w15:restartNumberingAfterBreak="0">
+  <w:abstractNum w:abstractNumId="41" w15:restartNumberingAfterBreak="0">
     <w:nsid w:val="3E952C6B"/>
     <w:multiLevelType w:val="multilevel"/>
     <w:tmpl w:val="6BA291E2"/>
@@ -44151,7 +47956,7 @@
       </w:pPr>
     </w:lvl>
   </w:abstractNum>
-  <w:abstractNum w:abstractNumId="39" w15:restartNumberingAfterBreak="0">
+  <w:abstractNum w:abstractNumId="42" w15:restartNumberingAfterBreak="0">
     <w:nsid w:val="3FAA26B3"/>
     <w:multiLevelType w:val="multilevel"/>
     <w:tmpl w:val="A0206428"/>
@@ -44264,7 +48069,7 @@
       </w:pPr>
     </w:lvl>
   </w:abstractNum>
-  <w:abstractNum w:abstractNumId="40" w15:restartNumberingAfterBreak="0">
+  <w:abstractNum w:abstractNumId="43" w15:restartNumberingAfterBreak="0">
     <w:nsid w:val="405006D8"/>
     <w:multiLevelType w:val="multilevel"/>
     <w:tmpl w:val="57222A90"/>
@@ -44413,7 +48218,7 @@
       </w:rPr>
     </w:lvl>
   </w:abstractNum>
-  <w:abstractNum w:abstractNumId="41" w15:restartNumberingAfterBreak="0">
+  <w:abstractNum w:abstractNumId="44" w15:restartNumberingAfterBreak="0">
     <w:nsid w:val="407037C0"/>
     <w:multiLevelType w:val="multilevel"/>
     <w:tmpl w:val="14D8E17C"/>
@@ -44562,7 +48367,156 @@
       </w:rPr>
     </w:lvl>
   </w:abstractNum>
-  <w:abstractNum w:abstractNumId="42" w15:restartNumberingAfterBreak="0">
+  <w:abstractNum w:abstractNumId="45" w15:restartNumberingAfterBreak="0">
+    <w:nsid w:val="415C2D90"/>
+    <w:multiLevelType w:val="multilevel"/>
+    <w:tmpl w:val="3CEED776"/>
+    <w:lvl w:ilvl="0">
+      <w:start w:val="1"/>
+      <w:numFmt w:val="bullet"/>
+      <w:lvlText w:val=""/>
+      <w:lvlJc w:val="left"/>
+      <w:pPr>
+        <w:tabs>
+          <w:tab w:val="num" w:pos="720"/>
+        </w:tabs>
+        <w:ind w:left="720" w:hanging="360"/>
+      </w:pPr>
+      <w:rPr>
+        <w:rFonts w:ascii="Symbol" w:hAnsi="Symbol" w:hint="default"/>
+        <w:sz w:val="20"/>
+      </w:rPr>
+    </w:lvl>
+    <w:lvl w:ilvl="1">
+      <w:start w:val="1"/>
+      <w:numFmt w:val="bullet"/>
+      <w:lvlText w:val="o"/>
+      <w:lvlJc w:val="left"/>
+      <w:pPr>
+        <w:tabs>
+          <w:tab w:val="num" w:pos="1440"/>
+        </w:tabs>
+        <w:ind w:left="1440" w:hanging="360"/>
+      </w:pPr>
+      <w:rPr>
+        <w:rFonts w:ascii="Courier New" w:hAnsi="Courier New" w:hint="default"/>
+        <w:sz w:val="20"/>
+      </w:rPr>
+    </w:lvl>
+    <w:lvl w:ilvl="2" w:tentative="1">
+      <w:start w:val="1"/>
+      <w:numFmt w:val="bullet"/>
+      <w:lvlText w:val=""/>
+      <w:lvlJc w:val="left"/>
+      <w:pPr>
+        <w:tabs>
+          <w:tab w:val="num" w:pos="2160"/>
+        </w:tabs>
+        <w:ind w:left="2160" w:hanging="360"/>
+      </w:pPr>
+      <w:rPr>
+        <w:rFonts w:ascii="Wingdings" w:hAnsi="Wingdings" w:hint="default"/>
+        <w:sz w:val="20"/>
+      </w:rPr>
+    </w:lvl>
+    <w:lvl w:ilvl="3" w:tentative="1">
+      <w:start w:val="1"/>
+      <w:numFmt w:val="bullet"/>
+      <w:lvlText w:val=""/>
+      <w:lvlJc w:val="left"/>
+      <w:pPr>
+        <w:tabs>
+          <w:tab w:val="num" w:pos="2880"/>
+        </w:tabs>
+        <w:ind w:left="2880" w:hanging="360"/>
+      </w:pPr>
+      <w:rPr>
+        <w:rFonts w:ascii="Wingdings" w:hAnsi="Wingdings" w:hint="default"/>
+        <w:sz w:val="20"/>
+      </w:rPr>
+    </w:lvl>
+    <w:lvl w:ilvl="4" w:tentative="1">
+      <w:start w:val="1"/>
+      <w:numFmt w:val="bullet"/>
+      <w:lvlText w:val=""/>
+      <w:lvlJc w:val="left"/>
+      <w:pPr>
+        <w:tabs>
+          <w:tab w:val="num" w:pos="3600"/>
+        </w:tabs>
+        <w:ind w:left="3600" w:hanging="360"/>
+      </w:pPr>
+      <w:rPr>
+        <w:rFonts w:ascii="Wingdings" w:hAnsi="Wingdings" w:hint="default"/>
+        <w:sz w:val="20"/>
+      </w:rPr>
+    </w:lvl>
+    <w:lvl w:ilvl="5" w:tentative="1">
+      <w:start w:val="1"/>
+      <w:numFmt w:val="bullet"/>
+      <w:lvlText w:val=""/>
+      <w:lvlJc w:val="left"/>
+      <w:pPr>
+        <w:tabs>
+          <w:tab w:val="num" w:pos="4320"/>
+        </w:tabs>
+        <w:ind w:left="4320" w:hanging="360"/>
+      </w:pPr>
+      <w:rPr>
+        <w:rFonts w:ascii="Wingdings" w:hAnsi="Wingdings" w:hint="default"/>
+        <w:sz w:val="20"/>
+      </w:rPr>
+    </w:lvl>
+    <w:lvl w:ilvl="6" w:tentative="1">
+      <w:start w:val="1"/>
+      <w:numFmt w:val="bullet"/>
+      <w:lvlText w:val=""/>
+      <w:lvlJc w:val="left"/>
+      <w:pPr>
+        <w:tabs>
+          <w:tab w:val="num" w:pos="5040"/>
+        </w:tabs>
+        <w:ind w:left="5040" w:hanging="360"/>
+      </w:pPr>
+      <w:rPr>
+        <w:rFonts w:ascii="Wingdings" w:hAnsi="Wingdings" w:hint="default"/>
+        <w:sz w:val="20"/>
+      </w:rPr>
+    </w:lvl>
+    <w:lvl w:ilvl="7" w:tentative="1">
+      <w:start w:val="1"/>
+      <w:numFmt w:val="bullet"/>
+      <w:lvlText w:val=""/>
+      <w:lvlJc w:val="left"/>
+      <w:pPr>
+        <w:tabs>
+          <w:tab w:val="num" w:pos="5760"/>
+        </w:tabs>
+        <w:ind w:left="5760" w:hanging="360"/>
+      </w:pPr>
+      <w:rPr>
+        <w:rFonts w:ascii="Wingdings" w:hAnsi="Wingdings" w:hint="default"/>
+        <w:sz w:val="20"/>
+      </w:rPr>
+    </w:lvl>
+    <w:lvl w:ilvl="8" w:tentative="1">
+      <w:start w:val="1"/>
+      <w:numFmt w:val="bullet"/>
+      <w:lvlText w:val=""/>
+      <w:lvlJc w:val="left"/>
+      <w:pPr>
+        <w:tabs>
+          <w:tab w:val="num" w:pos="6480"/>
+        </w:tabs>
+        <w:ind w:left="6480" w:hanging="360"/>
+      </w:pPr>
+      <w:rPr>
+        <w:rFonts w:ascii="Wingdings" w:hAnsi="Wingdings" w:hint="default"/>
+        <w:sz w:val="20"/>
+      </w:rPr>
+    </w:lvl>
+  </w:abstractNum>
+  <w:abstractNum w:abstractNumId="46" w15:restartNumberingAfterBreak="0">
     <w:nsid w:val="4652746F"/>
     <w:multiLevelType w:val="multilevel"/>
     <w:tmpl w:val="0F964FAE"/>
@@ -44679,7 +48633,7 @@
       </w:pPr>
     </w:lvl>
   </w:abstractNum>
-  <w:abstractNum w:abstractNumId="43" w15:restartNumberingAfterBreak="0">
+  <w:abstractNum w:abstractNumId="47" w15:restartNumberingAfterBreak="0">
     <w:nsid w:val="46765667"/>
     <w:multiLevelType w:val="multilevel"/>
     <w:tmpl w:val="E0547262"/>
@@ -44828,7 +48782,7 @@
       </w:rPr>
     </w:lvl>
   </w:abstractNum>
-  <w:abstractNum w:abstractNumId="44" w15:restartNumberingAfterBreak="0">
+  <w:abstractNum w:abstractNumId="48" w15:restartNumberingAfterBreak="0">
     <w:nsid w:val="48744AB6"/>
     <w:multiLevelType w:val="multilevel"/>
     <w:tmpl w:val="BBD434E0"/>
@@ -44973,7 +48927,7 @@
       </w:rPr>
     </w:lvl>
   </w:abstractNum>
-  <w:abstractNum w:abstractNumId="45" w15:restartNumberingAfterBreak="0">
+  <w:abstractNum w:abstractNumId="49" w15:restartNumberingAfterBreak="0">
     <w:nsid w:val="4A3E61CF"/>
     <w:multiLevelType w:val="multilevel"/>
     <w:tmpl w:val="26A4D2CA"/>
@@ -45122,7 +49076,7 @@
       </w:rPr>
     </w:lvl>
   </w:abstractNum>
-  <w:abstractNum w:abstractNumId="46" w15:restartNumberingAfterBreak="0">
+  <w:abstractNum w:abstractNumId="50" w15:restartNumberingAfterBreak="0">
     <w:nsid w:val="4C494795"/>
     <w:multiLevelType w:val="multilevel"/>
     <w:tmpl w:val="B31812CE"/>
@@ -45271,7 +49225,7 @@
       </w:rPr>
     </w:lvl>
   </w:abstractNum>
-  <w:abstractNum w:abstractNumId="47" w15:restartNumberingAfterBreak="0">
+  <w:abstractNum w:abstractNumId="51" w15:restartNumberingAfterBreak="0">
     <w:nsid w:val="4D9D3B19"/>
     <w:multiLevelType w:val="multilevel"/>
     <w:tmpl w:val="CFDA7008"/>
@@ -45420,7 +49374,7 @@
       </w:rPr>
     </w:lvl>
   </w:abstractNum>
-  <w:abstractNum w:abstractNumId="48" w15:restartNumberingAfterBreak="0">
+  <w:abstractNum w:abstractNumId="52" w15:restartNumberingAfterBreak="0">
     <w:nsid w:val="4E2F1F30"/>
     <w:multiLevelType w:val="multilevel"/>
     <w:tmpl w:val="431AB6EA"/>
@@ -45569,7 +49523,7 @@
       </w:rPr>
     </w:lvl>
   </w:abstractNum>
-  <w:abstractNum w:abstractNumId="49" w15:restartNumberingAfterBreak="0">
+  <w:abstractNum w:abstractNumId="53" w15:restartNumberingAfterBreak="0">
     <w:nsid w:val="4E705C60"/>
     <w:multiLevelType w:val="multilevel"/>
     <w:tmpl w:val="39A62558"/>
@@ -45682,7 +49636,7 @@
       </w:pPr>
     </w:lvl>
   </w:abstractNum>
-  <w:abstractNum w:abstractNumId="50" w15:restartNumberingAfterBreak="0">
+  <w:abstractNum w:abstractNumId="54" w15:restartNumberingAfterBreak="0">
     <w:nsid w:val="4EF25303"/>
     <w:multiLevelType w:val="multilevel"/>
     <w:tmpl w:val="DB0CE578"/>
@@ -45831,7 +49785,7 @@
       </w:rPr>
     </w:lvl>
   </w:abstractNum>
-  <w:abstractNum w:abstractNumId="51" w15:restartNumberingAfterBreak="0">
+  <w:abstractNum w:abstractNumId="55" w15:restartNumberingAfterBreak="0">
     <w:nsid w:val="4FFC3310"/>
     <w:multiLevelType w:val="multilevel"/>
     <w:tmpl w:val="7400A736"/>
@@ -45980,7 +49934,7 @@
       </w:rPr>
     </w:lvl>
   </w:abstractNum>
-  <w:abstractNum w:abstractNumId="52" w15:restartNumberingAfterBreak="0">
+  <w:abstractNum w:abstractNumId="56" w15:restartNumberingAfterBreak="0">
     <w:nsid w:val="57547AEB"/>
     <w:multiLevelType w:val="multilevel"/>
     <w:tmpl w:val="966086D8"/>
@@ -46129,7 +50083,7 @@
       </w:rPr>
     </w:lvl>
   </w:abstractNum>
-  <w:abstractNum w:abstractNumId="53" w15:restartNumberingAfterBreak="0">
+  <w:abstractNum w:abstractNumId="57" w15:restartNumberingAfterBreak="0">
     <w:nsid w:val="57A52C13"/>
     <w:multiLevelType w:val="multilevel"/>
     <w:tmpl w:val="01AC7BAA"/>
@@ -46278,7 +50232,7 @@
       </w:rPr>
     </w:lvl>
   </w:abstractNum>
-  <w:abstractNum w:abstractNumId="54" w15:restartNumberingAfterBreak="0">
+  <w:abstractNum w:abstractNumId="58" w15:restartNumberingAfterBreak="0">
     <w:nsid w:val="587266C5"/>
     <w:multiLevelType w:val="multilevel"/>
     <w:tmpl w:val="B60C6C60"/>
@@ -46427,7 +50381,7 @@
       </w:rPr>
     </w:lvl>
   </w:abstractNum>
-  <w:abstractNum w:abstractNumId="55" w15:restartNumberingAfterBreak="0">
+  <w:abstractNum w:abstractNumId="59" w15:restartNumberingAfterBreak="0">
     <w:nsid w:val="58B25FDC"/>
     <w:multiLevelType w:val="multilevel"/>
     <w:tmpl w:val="79005472"/>
@@ -46576,7 +50530,7 @@
       </w:rPr>
     </w:lvl>
   </w:abstractNum>
-  <w:abstractNum w:abstractNumId="56" w15:restartNumberingAfterBreak="0">
+  <w:abstractNum w:abstractNumId="60" w15:restartNumberingAfterBreak="0">
     <w:nsid w:val="5AFF2B06"/>
     <w:multiLevelType w:val="multilevel"/>
     <w:tmpl w:val="750EF8FC"/>
@@ -46693,7 +50647,7 @@
       </w:pPr>
     </w:lvl>
   </w:abstractNum>
-  <w:abstractNum w:abstractNumId="57" w15:restartNumberingAfterBreak="0">
+  <w:abstractNum w:abstractNumId="61" w15:restartNumberingAfterBreak="0">
     <w:nsid w:val="5D802EF7"/>
     <w:multiLevelType w:val="multilevel"/>
     <w:tmpl w:val="E684FD56"/>
@@ -46842,7 +50796,7 @@
       </w:rPr>
     </w:lvl>
   </w:abstractNum>
-  <w:abstractNum w:abstractNumId="58" w15:restartNumberingAfterBreak="0">
+  <w:abstractNum w:abstractNumId="62" w15:restartNumberingAfterBreak="0">
     <w:nsid w:val="5DDC1789"/>
     <w:multiLevelType w:val="multilevel"/>
     <w:tmpl w:val="55C4C8AC"/>
@@ -46991,7 +50945,7 @@
       </w:rPr>
     </w:lvl>
   </w:abstractNum>
-  <w:abstractNum w:abstractNumId="59" w15:restartNumberingAfterBreak="0">
+  <w:abstractNum w:abstractNumId="63" w15:restartNumberingAfterBreak="0">
     <w:nsid w:val="5E231CE9"/>
     <w:multiLevelType w:val="multilevel"/>
     <w:tmpl w:val="89FAA90E"/>
@@ -47140,7 +51094,7 @@
       </w:rPr>
     </w:lvl>
   </w:abstractNum>
-  <w:abstractNum w:abstractNumId="60" w15:restartNumberingAfterBreak="0">
+  <w:abstractNum w:abstractNumId="64" w15:restartNumberingAfterBreak="0">
     <w:nsid w:val="65BE70A9"/>
     <w:multiLevelType w:val="multilevel"/>
     <w:tmpl w:val="A874DCA4"/>
@@ -47289,7 +51243,7 @@
       </w:rPr>
     </w:lvl>
   </w:abstractNum>
-  <w:abstractNum w:abstractNumId="61" w15:restartNumberingAfterBreak="0">
+  <w:abstractNum w:abstractNumId="65" w15:restartNumberingAfterBreak="0">
     <w:nsid w:val="6B4E5BD2"/>
     <w:multiLevelType w:val="multilevel"/>
     <w:tmpl w:val="8F86ADAE"/>
@@ -47438,7 +51392,7 @@
       </w:rPr>
     </w:lvl>
   </w:abstractNum>
-  <w:abstractNum w:abstractNumId="62" w15:restartNumberingAfterBreak="0">
+  <w:abstractNum w:abstractNumId="66" w15:restartNumberingAfterBreak="0">
     <w:nsid w:val="6BEE5A84"/>
     <w:multiLevelType w:val="multilevel"/>
     <w:tmpl w:val="781A07A8"/>
@@ -47587,7 +51541,7 @@
       </w:rPr>
     </w:lvl>
   </w:abstractNum>
-  <w:abstractNum w:abstractNumId="63" w15:restartNumberingAfterBreak="0">
+  <w:abstractNum w:abstractNumId="67" w15:restartNumberingAfterBreak="0">
     <w:nsid w:val="6C681470"/>
     <w:multiLevelType w:val="multilevel"/>
     <w:tmpl w:val="85B868AE"/>
@@ -47736,7 +51690,7 @@
       </w:rPr>
     </w:lvl>
   </w:abstractNum>
-  <w:abstractNum w:abstractNumId="64" w15:restartNumberingAfterBreak="0">
+  <w:abstractNum w:abstractNumId="68" w15:restartNumberingAfterBreak="0">
     <w:nsid w:val="6D675446"/>
     <w:multiLevelType w:val="multilevel"/>
     <w:tmpl w:val="834EDBCA"/>
@@ -47885,7 +51839,7 @@
       </w:rPr>
     </w:lvl>
   </w:abstractNum>
-  <w:abstractNum w:abstractNumId="65" w15:restartNumberingAfterBreak="0">
+  <w:abstractNum w:abstractNumId="69" w15:restartNumberingAfterBreak="0">
     <w:nsid w:val="6DA808BA"/>
     <w:multiLevelType w:val="multilevel"/>
     <w:tmpl w:val="EE14F3AE"/>
@@ -48034,7 +51988,7 @@
       </w:rPr>
     </w:lvl>
   </w:abstractNum>
-  <w:abstractNum w:abstractNumId="66" w15:restartNumberingAfterBreak="0">
+  <w:abstractNum w:abstractNumId="70" w15:restartNumberingAfterBreak="0">
     <w:nsid w:val="73EB4722"/>
     <w:multiLevelType w:val="multilevel"/>
     <w:tmpl w:val="5F14FFBE"/>
@@ -48183,7 +52137,7 @@
       </w:rPr>
     </w:lvl>
   </w:abstractNum>
-  <w:abstractNum w:abstractNumId="67" w15:restartNumberingAfterBreak="0">
+  <w:abstractNum w:abstractNumId="71" w15:restartNumberingAfterBreak="0">
     <w:nsid w:val="75383A12"/>
     <w:multiLevelType w:val="multilevel"/>
     <w:tmpl w:val="27C411FE"/>
@@ -48332,7 +52286,7 @@
       </w:rPr>
     </w:lvl>
   </w:abstractNum>
-  <w:abstractNum w:abstractNumId="68" w15:restartNumberingAfterBreak="0">
+  <w:abstractNum w:abstractNumId="72" w15:restartNumberingAfterBreak="0">
     <w:nsid w:val="75ED5CF6"/>
     <w:multiLevelType w:val="multilevel"/>
     <w:tmpl w:val="1172A36C"/>
@@ -48477,7 +52431,7 @@
       </w:rPr>
     </w:lvl>
   </w:abstractNum>
-  <w:abstractNum w:abstractNumId="69" w15:restartNumberingAfterBreak="0">
+  <w:abstractNum w:abstractNumId="73" w15:restartNumberingAfterBreak="0">
     <w:nsid w:val="7918553F"/>
     <w:multiLevelType w:val="multilevel"/>
     <w:tmpl w:val="4E3E1E96"/>
@@ -48594,7 +52548,7 @@
       </w:pPr>
     </w:lvl>
   </w:abstractNum>
-  <w:abstractNum w:abstractNumId="70" w15:restartNumberingAfterBreak="0">
+  <w:abstractNum w:abstractNumId="74" w15:restartNumberingAfterBreak="0">
     <w:nsid w:val="79230768"/>
     <w:multiLevelType w:val="multilevel"/>
     <w:tmpl w:val="9F42533E"/>
@@ -48743,7 +52697,7 @@
       </w:rPr>
     </w:lvl>
   </w:abstractNum>
-  <w:abstractNum w:abstractNumId="71" w15:restartNumberingAfterBreak="0">
+  <w:abstractNum w:abstractNumId="75" w15:restartNumberingAfterBreak="0">
     <w:nsid w:val="7BAB2D58"/>
     <w:multiLevelType w:val="multilevel"/>
     <w:tmpl w:val="8BD4E36A"/>
@@ -48892,7 +52846,7 @@
       </w:rPr>
     </w:lvl>
   </w:abstractNum>
-  <w:abstractNum w:abstractNumId="72" w15:restartNumberingAfterBreak="0">
+  <w:abstractNum w:abstractNumId="76" w15:restartNumberingAfterBreak="0">
     <w:nsid w:val="7E7F1F59"/>
     <w:multiLevelType w:val="multilevel"/>
     <w:tmpl w:val="80B29E38"/>
@@ -49041,7 +52995,7 @@
       </w:rPr>
     </w:lvl>
   </w:abstractNum>
-  <w:abstractNum w:abstractNumId="73" w15:restartNumberingAfterBreak="0">
+  <w:abstractNum w:abstractNumId="77" w15:restartNumberingAfterBreak="0">
     <w:nsid w:val="7F274C0E"/>
     <w:multiLevelType w:val="multilevel"/>
     <w:tmpl w:val="D8665B86"/>
@@ -49190,7 +53144,7 @@
       </w:rPr>
     </w:lvl>
   </w:abstractNum>
-  <w:abstractNum w:abstractNumId="74" w15:restartNumberingAfterBreak="0">
+  <w:abstractNum w:abstractNumId="78" w15:restartNumberingAfterBreak="0">
     <w:nsid w:val="7F8F6D96"/>
     <w:multiLevelType w:val="multilevel"/>
     <w:tmpl w:val="D668F702"/>
@@ -49339,7 +53293,7 @@
       </w:rPr>
     </w:lvl>
   </w:abstractNum>
-  <w:abstractNum w:abstractNumId="75" w15:restartNumberingAfterBreak="0">
+  <w:abstractNum w:abstractNumId="79" w15:restartNumberingAfterBreak="0">
     <w:nsid w:val="7FE65BF5"/>
     <w:multiLevelType w:val="multilevel"/>
     <w:tmpl w:val="2CC88252"/>
@@ -49489,234 +53443,246 @@
     </w:lvl>
   </w:abstractNum>
   <w:num w:numId="1" w16cid:durableId="1790664698">
-    <w:abstractNumId w:val="66"/>
+    <w:abstractNumId w:val="70"/>
   </w:num>
   <w:num w:numId="2" w16cid:durableId="913315237">
-    <w:abstractNumId w:val="31"/>
+    <w:abstractNumId w:val="33"/>
   </w:num>
   <w:num w:numId="3" w16cid:durableId="1592666586">
-    <w:abstractNumId w:val="73"/>
+    <w:abstractNumId w:val="77"/>
   </w:num>
   <w:num w:numId="4" w16cid:durableId="510418239">
-    <w:abstractNumId w:val="45"/>
+    <w:abstractNumId w:val="49"/>
   </w:num>
   <w:num w:numId="5" w16cid:durableId="680550783">
-    <w:abstractNumId w:val="72"/>
+    <w:abstractNumId w:val="76"/>
   </w:num>
   <w:num w:numId="6" w16cid:durableId="285746792">
-    <w:abstractNumId w:val="15"/>
+    <w:abstractNumId w:val="17"/>
   </w:num>
   <w:num w:numId="7" w16cid:durableId="1338732938">
-    <w:abstractNumId w:val="10"/>
+    <w:abstractNumId w:val="11"/>
   </w:num>
   <w:num w:numId="8" w16cid:durableId="162361005">
     <w:abstractNumId w:val="5"/>
   </w:num>
   <w:num w:numId="9" w16cid:durableId="1501001245">
-    <w:abstractNumId w:val="39"/>
+    <w:abstractNumId w:val="42"/>
   </w:num>
   <w:num w:numId="10" w16cid:durableId="1706250928">
-    <w:abstractNumId w:val="44"/>
+    <w:abstractNumId w:val="48"/>
   </w:num>
   <w:num w:numId="11" w16cid:durableId="1292050097">
-    <w:abstractNumId w:val="61"/>
+    <w:abstractNumId w:val="65"/>
   </w:num>
   <w:num w:numId="12" w16cid:durableId="1745948958">
-    <w:abstractNumId w:val="8"/>
+    <w:abstractNumId w:val="9"/>
   </w:num>
   <w:num w:numId="13" w16cid:durableId="679312742">
-    <w:abstractNumId w:val="64"/>
+    <w:abstractNumId w:val="68"/>
   </w:num>
   <w:num w:numId="14" w16cid:durableId="1597860147">
-    <w:abstractNumId w:val="74"/>
+    <w:abstractNumId w:val="78"/>
   </w:num>
   <w:num w:numId="15" w16cid:durableId="2042434571">
-    <w:abstractNumId w:val="33"/>
+    <w:abstractNumId w:val="35"/>
   </w:num>
   <w:num w:numId="16" w16cid:durableId="1867019793">
-    <w:abstractNumId w:val="29"/>
+    <w:abstractNumId w:val="31"/>
   </w:num>
   <w:num w:numId="17" w16cid:durableId="839076169">
-    <w:abstractNumId w:val="40"/>
+    <w:abstractNumId w:val="43"/>
   </w:num>
   <w:num w:numId="18" w16cid:durableId="1218131698">
-    <w:abstractNumId w:val="43"/>
+    <w:abstractNumId w:val="47"/>
   </w:num>
   <w:num w:numId="19" w16cid:durableId="213657393">
     <w:abstractNumId w:val="6"/>
   </w:num>
   <w:num w:numId="20" w16cid:durableId="630095303">
-    <w:abstractNumId w:val="47"/>
+    <w:abstractNumId w:val="51"/>
   </w:num>
   <w:num w:numId="21" w16cid:durableId="1326665292">
-    <w:abstractNumId w:val="52"/>
+    <w:abstractNumId w:val="56"/>
   </w:num>
   <w:num w:numId="22" w16cid:durableId="689767440">
     <w:abstractNumId w:val="2"/>
   </w:num>
   <w:num w:numId="23" w16cid:durableId="794064944">
-    <w:abstractNumId w:val="7"/>
+    <w:abstractNumId w:val="8"/>
   </w:num>
   <w:num w:numId="24" w16cid:durableId="370763591">
-    <w:abstractNumId w:val="27"/>
+    <w:abstractNumId w:val="29"/>
   </w:num>
   <w:num w:numId="25" w16cid:durableId="896086980">
     <w:abstractNumId w:val="4"/>
   </w:num>
   <w:num w:numId="26" w16cid:durableId="1149051840">
-    <w:abstractNumId w:val="23"/>
+    <w:abstractNumId w:val="25"/>
   </w:num>
   <w:num w:numId="27" w16cid:durableId="691490878">
-    <w:abstractNumId w:val="37"/>
+    <w:abstractNumId w:val="40"/>
   </w:num>
   <w:num w:numId="28" w16cid:durableId="1199008562">
-    <w:abstractNumId w:val="21"/>
+    <w:abstractNumId w:val="23"/>
   </w:num>
   <w:num w:numId="29" w16cid:durableId="119080037">
     <w:abstractNumId w:val="3"/>
   </w:num>
   <w:num w:numId="30" w16cid:durableId="1604412925">
-    <w:abstractNumId w:val="50"/>
+    <w:abstractNumId w:val="54"/>
   </w:num>
   <w:num w:numId="31" w16cid:durableId="422654846">
-    <w:abstractNumId w:val="60"/>
+    <w:abstractNumId w:val="64"/>
   </w:num>
   <w:num w:numId="32" w16cid:durableId="2002389794">
-    <w:abstractNumId w:val="25"/>
+    <w:abstractNumId w:val="27"/>
   </w:num>
   <w:num w:numId="33" w16cid:durableId="663556784">
-    <w:abstractNumId w:val="32"/>
+    <w:abstractNumId w:val="34"/>
   </w:num>
   <w:num w:numId="34" w16cid:durableId="1544096020">
-    <w:abstractNumId w:val="16"/>
+    <w:abstractNumId w:val="18"/>
   </w:num>
   <w:num w:numId="35" w16cid:durableId="1452288583">
-    <w:abstractNumId w:val="69"/>
+    <w:abstractNumId w:val="73"/>
   </w:num>
   <w:num w:numId="36" w16cid:durableId="1418789113">
-    <w:abstractNumId w:val="17"/>
+    <w:abstractNumId w:val="19"/>
   </w:num>
   <w:num w:numId="37" w16cid:durableId="453601589">
     <w:abstractNumId w:val="1"/>
   </w:num>
   <w:num w:numId="38" w16cid:durableId="1531524648">
-    <w:abstractNumId w:val="67"/>
+    <w:abstractNumId w:val="71"/>
   </w:num>
   <w:num w:numId="39" w16cid:durableId="1660887162">
-    <w:abstractNumId w:val="53"/>
+    <w:abstractNumId w:val="57"/>
   </w:num>
   <w:num w:numId="40" w16cid:durableId="745810262">
-    <w:abstractNumId w:val="35"/>
+    <w:abstractNumId w:val="37"/>
   </w:num>
   <w:num w:numId="41" w16cid:durableId="614943237">
-    <w:abstractNumId w:val="13"/>
+    <w:abstractNumId w:val="15"/>
   </w:num>
   <w:num w:numId="42" w16cid:durableId="549920154">
-    <w:abstractNumId w:val="54"/>
+    <w:abstractNumId w:val="58"/>
   </w:num>
   <w:num w:numId="43" w16cid:durableId="182861342">
-    <w:abstractNumId w:val="42"/>
+    <w:abstractNumId w:val="46"/>
   </w:num>
   <w:num w:numId="44" w16cid:durableId="1959796069">
-    <w:abstractNumId w:val="70"/>
+    <w:abstractNumId w:val="74"/>
   </w:num>
   <w:num w:numId="45" w16cid:durableId="1814979854">
-    <w:abstractNumId w:val="46"/>
+    <w:abstractNumId w:val="50"/>
   </w:num>
   <w:num w:numId="46" w16cid:durableId="443154987">
-    <w:abstractNumId w:val="22"/>
+    <w:abstractNumId w:val="24"/>
   </w:num>
   <w:num w:numId="47" w16cid:durableId="1897352345">
-    <w:abstractNumId w:val="58"/>
+    <w:abstractNumId w:val="62"/>
   </w:num>
   <w:num w:numId="48" w16cid:durableId="726952408">
-    <w:abstractNumId w:val="57"/>
+    <w:abstractNumId w:val="61"/>
   </w:num>
   <w:num w:numId="49" w16cid:durableId="285426070">
-    <w:abstractNumId w:val="59"/>
+    <w:abstractNumId w:val="63"/>
   </w:num>
   <w:num w:numId="50" w16cid:durableId="981154963">
-    <w:abstractNumId w:val="56"/>
+    <w:abstractNumId w:val="60"/>
   </w:num>
   <w:num w:numId="51" w16cid:durableId="505705173">
-    <w:abstractNumId w:val="9"/>
+    <w:abstractNumId w:val="10"/>
   </w:num>
   <w:num w:numId="52" w16cid:durableId="679311624">
+    <w:abstractNumId w:val="14"/>
+  </w:num>
+  <w:num w:numId="53" w16cid:durableId="854002976">
     <w:abstractNumId w:val="12"/>
   </w:num>
-  <w:num w:numId="53" w16cid:durableId="854002976">
-    <w:abstractNumId w:val="11"/>
-  </w:num>
   <w:num w:numId="54" w16cid:durableId="1207377051">
-    <w:abstractNumId w:val="36"/>
+    <w:abstractNumId w:val="38"/>
   </w:num>
   <w:num w:numId="55" w16cid:durableId="336881422">
     <w:abstractNumId w:val="0"/>
   </w:num>
   <w:num w:numId="56" w16cid:durableId="953630187">
-    <w:abstractNumId w:val="63"/>
+    <w:abstractNumId w:val="67"/>
   </w:num>
   <w:num w:numId="57" w16cid:durableId="501088929">
-    <w:abstractNumId w:val="24"/>
+    <w:abstractNumId w:val="26"/>
   </w:num>
   <w:num w:numId="58" w16cid:durableId="1936791281">
-    <w:abstractNumId w:val="14"/>
+    <w:abstractNumId w:val="16"/>
   </w:num>
   <w:num w:numId="59" w16cid:durableId="815411764">
+    <w:abstractNumId w:val="32"/>
+  </w:num>
+  <w:num w:numId="60" w16cid:durableId="607740991">
     <w:abstractNumId w:val="30"/>
   </w:num>
-  <w:num w:numId="60" w16cid:durableId="607740991">
+  <w:num w:numId="61" w16cid:durableId="204484613">
+    <w:abstractNumId w:val="75"/>
+  </w:num>
+  <w:num w:numId="62" w16cid:durableId="1018699311">
     <w:abstractNumId w:val="28"/>
   </w:num>
-  <w:num w:numId="61" w16cid:durableId="204484613">
-    <w:abstractNumId w:val="71"/>
+  <w:num w:numId="63" w16cid:durableId="359740252">
+    <w:abstractNumId w:val="59"/>
   </w:num>
-  <w:num w:numId="62" w16cid:durableId="1018699311">
-    <w:abstractNumId w:val="26"/>
+  <w:num w:numId="64" w16cid:durableId="61687259">
+    <w:abstractNumId w:val="44"/>
   </w:num>
-  <w:num w:numId="63" w16cid:durableId="359740252">
+  <w:num w:numId="65" w16cid:durableId="162597846">
+    <w:abstractNumId w:val="69"/>
+  </w:num>
+  <w:num w:numId="66" w16cid:durableId="136534882">
+    <w:abstractNumId w:val="53"/>
+  </w:num>
+  <w:num w:numId="67" w16cid:durableId="970674793">
     <w:abstractNumId w:val="55"/>
   </w:num>
-  <w:num w:numId="64" w16cid:durableId="61687259">
+  <w:num w:numId="68" w16cid:durableId="2013725645">
+    <w:abstractNumId w:val="36"/>
+  </w:num>
+  <w:num w:numId="69" w16cid:durableId="2113940141">
+    <w:abstractNumId w:val="72"/>
+  </w:num>
+  <w:num w:numId="70" w16cid:durableId="1495679451">
+    <w:abstractNumId w:val="22"/>
+  </w:num>
+  <w:num w:numId="71" w16cid:durableId="1226837209">
+    <w:abstractNumId w:val="20"/>
+  </w:num>
+  <w:num w:numId="72" w16cid:durableId="153881816">
+    <w:abstractNumId w:val="79"/>
+  </w:num>
+  <w:num w:numId="73" w16cid:durableId="2068524370">
     <w:abstractNumId w:val="41"/>
   </w:num>
-  <w:num w:numId="65" w16cid:durableId="162597846">
-    <w:abstractNumId w:val="65"/>
-  </w:num>
-  <w:num w:numId="66" w16cid:durableId="136534882">
-    <w:abstractNumId w:val="49"/>
-  </w:num>
-  <w:num w:numId="67" w16cid:durableId="970674793">
-    <w:abstractNumId w:val="51"/>
-  </w:num>
-  <w:num w:numId="68" w16cid:durableId="2013725645">
-    <w:abstractNumId w:val="34"/>
-  </w:num>
-  <w:num w:numId="69" w16cid:durableId="2113940141">
-    <w:abstractNumId w:val="68"/>
-  </w:num>
-  <w:num w:numId="70" w16cid:durableId="1495679451">
-    <w:abstractNumId w:val="20"/>
-  </w:num>
-  <w:num w:numId="71" w16cid:durableId="1226837209">
-    <w:abstractNumId w:val="18"/>
-  </w:num>
-  <w:num w:numId="72" w16cid:durableId="153881816">
-    <w:abstractNumId w:val="75"/>
-  </w:num>
-  <w:num w:numId="73" w16cid:durableId="2068524370">
-    <w:abstractNumId w:val="38"/>
-  </w:num>
   <w:num w:numId="74" w16cid:durableId="1377468303">
-    <w:abstractNumId w:val="48"/>
+    <w:abstractNumId w:val="52"/>
   </w:num>
   <w:num w:numId="75" w16cid:durableId="282275987">
-    <w:abstractNumId w:val="62"/>
+    <w:abstractNumId w:val="66"/>
   </w:num>
   <w:num w:numId="76" w16cid:durableId="1229726402">
-    <w:abstractNumId w:val="19"/>
+    <w:abstractNumId w:val="21"/>
   </w:num>
-  <w:numIdMacAtCleanup w:val="76"/>
+  <w:num w:numId="77" w16cid:durableId="242490310">
+    <w:abstractNumId w:val="13"/>
+  </w:num>
+  <w:num w:numId="78" w16cid:durableId="1184632804">
+    <w:abstractNumId w:val="45"/>
+  </w:num>
+  <w:num w:numId="79" w16cid:durableId="650400906">
+    <w:abstractNumId w:val="7"/>
+  </w:num>
+  <w:num w:numId="80" w16cid:durableId="1537347645">
+    <w:abstractNumId w:val="39"/>
+  </w:num>
+  <w:numIdMacAtCleanup w:val="80"/>
 </w:numbering>
 </file>
 

</xml_diff>